<commit_message>
k I KIs und kleine Fehler in concept cartoonLuL
</commit_message>
<xml_diff>
--- a/7_KI-Basismodule/KI-B1/KI-B1.0_Modulbeschreibung.docx
+++ b/7_KI-Basismodule/KI-B1/KI-B1.0_Modulbeschreibung.docx
@@ -1,6 +1,6 @@
 
 <file path=word/document.xml><?xml version="1.0" encoding="utf-8"?>
-<w:document xmlns:wpc="http://schemas.microsoft.com/office/word/2010/wordprocessingCanvas" xmlns:cx="http://schemas.microsoft.com/office/drawing/2014/chartex" xmlns:cx1="http://schemas.microsoft.com/office/drawing/2015/9/8/chartex" xmlns:cx2="http://schemas.microsoft.com/office/drawing/2015/10/21/chartex" xmlns:cx3="http://schemas.microsoft.com/office/drawing/2016/5/9/chartex" xmlns:cx4="http://schemas.microsoft.com/office/drawing/2016/5/10/chartex" xmlns:cx5="http://schemas.microsoft.com/office/drawing/2016/5/11/chartex" xmlns:cx6="http://schemas.microsoft.com/office/drawing/2016/5/12/chartex" xmlns:cx7="http://schemas.microsoft.com/office/drawing/2016/5/13/chartex" xmlns:cx8="http://schemas.microsoft.com/office/drawing/2016/5/14/chartex" xmlns:mc="http://schemas.openxmlformats.org/markup-compatibility/2006" xmlns:aink="http://schemas.microsoft.com/office/drawing/2016/ink" xmlns:am3d="http://schemas.microsoft.com/office/drawing/2017/model3d" xmlns:o="urn:schemas-microsoft-com:office:office" xmlns:oel="http://schemas.microsoft.com/office/2019/extlst" xmlns:r="http://schemas.openxmlformats.org/officeDocument/2006/relationships" xmlns:m="http://schemas.openxmlformats.org/officeDocument/2006/math" xmlns:v="urn:schemas-microsoft-com:vml" xmlns:wp14="http://schemas.microsoft.com/office/word/2010/wordprocessingDrawing" xmlns:wp="http://schemas.openxmlformats.org/drawingml/2006/wordprocessingDrawing" xmlns:w10="urn:schemas-microsoft-com:office:word" xmlns:w="http://schemas.openxmlformats.org/wordprocessingml/2006/main" xmlns:w14="http://schemas.microsoft.com/office/word/2010/wordml" xmlns:w15="http://schemas.microsoft.com/office/word/2012/wordml" xmlns:w16cex="http://schemas.microsoft.com/office/word/2018/wordml/cex" xmlns:w16cid="http://schemas.microsoft.com/office/word/2016/wordml/cid" xmlns:w16="http://schemas.microsoft.com/office/word/2018/wordml" xmlns:w16sdtdh="http://schemas.microsoft.com/office/word/2020/wordml/sdtdatahash" xmlns:w16se="http://schemas.microsoft.com/office/word/2015/wordml/symex" xmlns:wpg="http://schemas.microsoft.com/office/word/2010/wordprocessingGroup" xmlns:wpi="http://schemas.microsoft.com/office/word/2010/wordprocessingInk" xmlns:wne="http://schemas.microsoft.com/office/word/2006/wordml" xmlns:wps="http://schemas.microsoft.com/office/word/2010/wordprocessingShape" mc:Ignorable="w14 w15 w16se w16cid w16 w16cex w16sdtdh wp14">
+<w:document xmlns:wpc="http://schemas.microsoft.com/office/word/2010/wordprocessingCanvas" xmlns:cx="http://schemas.microsoft.com/office/drawing/2014/chartex" xmlns:cx1="http://schemas.microsoft.com/office/drawing/2015/9/8/chartex" xmlns:cx2="http://schemas.microsoft.com/office/drawing/2015/10/21/chartex" xmlns:cx3="http://schemas.microsoft.com/office/drawing/2016/5/9/chartex" xmlns:cx4="http://schemas.microsoft.com/office/drawing/2016/5/10/chartex" xmlns:cx5="http://schemas.microsoft.com/office/drawing/2016/5/11/chartex" xmlns:cx6="http://schemas.microsoft.com/office/drawing/2016/5/12/chartex" xmlns:cx7="http://schemas.microsoft.com/office/drawing/2016/5/13/chartex" xmlns:cx8="http://schemas.microsoft.com/office/drawing/2016/5/14/chartex" xmlns:mc="http://schemas.openxmlformats.org/markup-compatibility/2006" xmlns:aink="http://schemas.microsoft.com/office/drawing/2016/ink" xmlns:am3d="http://schemas.microsoft.com/office/drawing/2017/model3d" xmlns:o="urn:schemas-microsoft-com:office:office" xmlns:oel="http://schemas.microsoft.com/office/2019/extlst" xmlns:r="http://schemas.openxmlformats.org/officeDocument/2006/relationships" xmlns:m="http://schemas.openxmlformats.org/officeDocument/2006/math" xmlns:v="urn:schemas-microsoft-com:vml" xmlns:wp14="http://schemas.microsoft.com/office/word/2010/wordprocessingDrawing" xmlns:wp="http://schemas.openxmlformats.org/drawingml/2006/wordprocessingDrawing" xmlns:w10="urn:schemas-microsoft-com:office:word" xmlns:w="http://schemas.openxmlformats.org/wordprocessingml/2006/main" xmlns:w14="http://schemas.microsoft.com/office/word/2010/wordml" xmlns:w15="http://schemas.microsoft.com/office/word/2012/wordml" xmlns:w16cex="http://schemas.microsoft.com/office/word/2018/wordml/cex" xmlns:w16cid="http://schemas.microsoft.com/office/word/2016/wordml/cid" xmlns:w16="http://schemas.microsoft.com/office/word/2018/wordml" xmlns:w16du="http://schemas.microsoft.com/office/word/2023/wordml/word16du" xmlns:w16sdtdh="http://schemas.microsoft.com/office/word/2020/wordml/sdtdatahash" xmlns:w16se="http://schemas.microsoft.com/office/word/2015/wordml/symex" xmlns:wpg="http://schemas.microsoft.com/office/word/2010/wordprocessingGroup" xmlns:wpi="http://schemas.microsoft.com/office/word/2010/wordprocessingInk" xmlns:wne="http://schemas.microsoft.com/office/word/2006/wordml" xmlns:wps="http://schemas.microsoft.com/office/word/2010/wordprocessingShape" mc:Ignorable="w14 w15 w16se w16cid w16 w16cex w16sdtdh wp14">
   <w:body>
     <w:p>
       <w:pPr>
@@ -135,7 +135,7 @@
                               <w:pPr>
                                 <w:pStyle w:val="Kopfzeile"/>
                                 <w:rPr>
-                                  <w:rFonts w:ascii="Helvetica 55" w:hAnsi="Helvetica 55"/>
+                                  <w:rFonts w:ascii="helvetica 55" w:hAnsi="helvetica 55"/>
                                   <w:b/>
                                   <w:sz w:val="88"/>
                                   <w:szCs w:val="88"/>
@@ -143,7 +143,7 @@
                               </w:pPr>
                               <w:r>
                                 <w:rPr>
-                                  <w:rFonts w:ascii="Helvetica 55" w:hAnsi="Helvetica 55"/>
+                                  <w:rFonts w:ascii="helvetica 55" w:hAnsi="helvetica 55"/>
                                   <w:b/>
                                   <w:sz w:val="88"/>
                                   <w:szCs w:val="88"/>
@@ -2253,7 +2253,34 @@
               <w:cnfStyle w:val="000000000000" w:firstRow="0" w:lastRow="0" w:firstColumn="0" w:lastColumn="0" w:oddVBand="0" w:evenVBand="0" w:oddHBand="0" w:evenHBand="0" w:firstRowFirstColumn="0" w:firstRowLastColumn="0" w:lastRowFirstColumn="0" w:lastRowLastColumn="0"/>
             </w:pPr>
             <w:r>
-              <w:t>lernen, Phänomene aus ihrer Lebenswelt im Zusammenhang mit Künstlichen Intelligenzen zu identifizieren</w:t>
+              <w:t xml:space="preserve">lernen, Phänomene aus ihrer Lebenswelt im Zusammenhang mit </w:t>
+            </w:r>
+            <w:del w:id="1" w:author="Ira Diethelm" w:date="2023-06-06T09:16:00Z">
+              <w:r>
+                <w:delText xml:space="preserve">Künstlichen </w:delText>
+              </w:r>
+            </w:del>
+            <w:ins w:id="2" w:author="Ira Diethelm" w:date="2023-06-06T09:16:00Z">
+              <w:r>
+                <w:t>Künstliche</w:t>
+              </w:r>
+              <w:r>
+                <w:t>r</w:t>
+              </w:r>
+              <w:r>
+                <w:t xml:space="preserve"> </w:t>
+              </w:r>
+            </w:ins>
+            <w:r>
+              <w:t>Intelligenz</w:t>
+            </w:r>
+            <w:del w:id="3" w:author="Ira Diethelm" w:date="2023-06-06T09:16:00Z">
+              <w:r>
+                <w:delText>en</w:delText>
+              </w:r>
+            </w:del>
+            <w:r>
+              <w:t xml:space="preserve"> zu identifizieren</w:t>
             </w:r>
           </w:p>
           <w:p>
@@ -2267,8 +2294,50 @@
               <w:cnfStyle w:val="000000000000" w:firstRow="0" w:lastRow="0" w:firstColumn="0" w:lastColumn="0" w:oddVBand="0" w:evenVBand="0" w:oddHBand="0" w:evenHBand="0" w:firstRowFirstColumn="0" w:firstRowLastColumn="0" w:lastRowFirstColumn="0" w:lastRowLastColumn="0"/>
             </w:pPr>
             <w:r>
-              <w:t>lernen Künstliche Intelligenzen als automatisierte Prozesse, die von Informatiksystemen ausgeführt werden, kennen</w:t>
-            </w:r>
+              <w:t>lernen Künstliche Intelligenz</w:t>
+            </w:r>
+            <w:del w:id="4" w:author="Ira Diethelm" w:date="2023-06-06T09:16:00Z">
+              <w:r>
+                <w:delText>en</w:delText>
+              </w:r>
+            </w:del>
+            <w:r>
+              <w:t xml:space="preserve"> als </w:t>
+            </w:r>
+            <w:ins w:id="5" w:author="Ira Diethelm" w:date="2023-06-06T09:18:00Z">
+              <w:r>
+                <w:t xml:space="preserve">Ergebnis </w:t>
+              </w:r>
+            </w:ins>
+            <w:r>
+              <w:t>automatisierte</w:t>
+            </w:r>
+            <w:ins w:id="6" w:author="Ira Diethelm" w:date="2023-06-06T09:18:00Z">
+              <w:r>
+                <w:t>r</w:t>
+              </w:r>
+            </w:ins>
+            <w:r>
+              <w:t xml:space="preserve"> Prozesse</w:t>
+            </w:r>
+            <w:ins w:id="7" w:author="Ira Diethelm" w:date="2023-06-06T09:18:00Z">
+              <w:r>
+                <w:t xml:space="preserve"> kennen</w:t>
+              </w:r>
+            </w:ins>
+            <w:r>
+              <w:t xml:space="preserve">, die von Informatiksystemen ausgeführt </w:t>
+            </w:r>
+            <w:proofErr w:type="gramStart"/>
+            <w:r>
+              <w:t>werden</w:t>
+            </w:r>
+            <w:proofErr w:type="gramEnd"/>
+            <w:del w:id="8" w:author="Ira Diethelm" w:date="2023-06-06T09:18:00Z">
+              <w:r>
+                <w:delText>, kennen</w:delText>
+              </w:r>
+            </w:del>
           </w:p>
           <w:p>
             <w:pPr>
@@ -2283,6 +2352,11 @@
             <w:r>
               <w:t>unterscheiden starke von schwachen KI</w:t>
             </w:r>
+            <w:ins w:id="9" w:author="Ira Diethelm" w:date="2023-06-06T09:47:00Z">
+              <w:r>
+                <w:t>-Systemen</w:t>
+              </w:r>
+            </w:ins>
           </w:p>
           <w:p>
             <w:pPr>
@@ -2294,8 +2368,52 @@
               <w:spacing w:before="0" w:after="0" w:line="240" w:lineRule="auto"/>
               <w:cnfStyle w:val="000000000000" w:firstRow="0" w:lastRow="0" w:firstColumn="0" w:lastColumn="0" w:oddVBand="0" w:evenVBand="0" w:oddHBand="0" w:evenHBand="0" w:firstRowFirstColumn="0" w:firstRowLastColumn="0" w:lastRowFirstColumn="0" w:lastRowLastColumn="0"/>
             </w:pPr>
-            <w:r>
-              <w:t xml:space="preserve">begreifen, dass Künstliche Intelligenzen zur Entscheidungsfindung auf Daten über ihre Umwelt zurückgreifen, die über Sensoren wahrgenommen </w:t>
+            <w:del w:id="10" w:author="Ira Diethelm" w:date="2023-06-06T09:54:00Z">
+              <w:r>
+                <w:delText>begreifen</w:delText>
+              </w:r>
+            </w:del>
+            <w:ins w:id="11" w:author="Ira Diethelm" w:date="2023-06-06T09:54:00Z">
+              <w:r>
+                <w:t>erläutern</w:t>
+              </w:r>
+            </w:ins>
+            <w:r>
+              <w:t xml:space="preserve">, dass </w:t>
+            </w:r>
+            <w:ins w:id="12" w:author="Ira Diethelm" w:date="2023-06-06T09:18:00Z">
+              <w:r>
+                <w:t>S</w:t>
+              </w:r>
+            </w:ins>
+            <w:ins w:id="13" w:author="Ira Diethelm" w:date="2023-06-06T09:19:00Z">
+              <w:r>
+                <w:t xml:space="preserve">ysteme mit </w:t>
+              </w:r>
+            </w:ins>
+            <w:del w:id="14" w:author="Ira Diethelm" w:date="2023-06-06T09:47:00Z">
+              <w:r>
+                <w:delText xml:space="preserve">Künstliche </w:delText>
+              </w:r>
+            </w:del>
+            <w:ins w:id="15" w:author="Ira Diethelm" w:date="2023-06-06T09:47:00Z">
+              <w:r>
+                <w:t>k</w:t>
+              </w:r>
+              <w:r>
+                <w:t xml:space="preserve">ünstlicher </w:t>
+              </w:r>
+            </w:ins>
+            <w:r>
+              <w:t>Intelligenz</w:t>
+            </w:r>
+            <w:del w:id="16" w:author="Ira Diethelm" w:date="2023-06-06T09:18:00Z">
+              <w:r>
+                <w:delText>en</w:delText>
+              </w:r>
+            </w:del>
+            <w:r>
+              <w:t xml:space="preserve"> zur Entscheidungsfindung auf Daten über ihre Umwelt zurückgreifen, die über Sensoren wahrgenommen </w:t>
             </w:r>
             <w:proofErr w:type="gramStart"/>
             <w:r>
@@ -2341,7 +2459,23 @@
               <w:cnfStyle w:val="000000000000" w:firstRow="0" w:lastRow="0" w:firstColumn="0" w:lastColumn="0" w:oddVBand="0" w:evenVBand="0" w:oddHBand="0" w:evenHBand="0" w:firstRowFirstColumn="0" w:firstRowLastColumn="0" w:lastRowFirstColumn="0" w:lastRowLastColumn="0"/>
             </w:pPr>
             <w:r>
-              <w:t>Kenntnisse des Grundprinzips der Digitalisierbarkeit (Basismodul B1 IT2School)</w:t>
+              <w:t xml:space="preserve">Kenntnisse des Grundprinzips der </w:t>
+            </w:r>
+            <w:del w:id="17" w:author="Ira Diethelm" w:date="2023-06-06T09:16:00Z">
+              <w:r>
+                <w:delText xml:space="preserve">Digitalisierbarkeit </w:delText>
+              </w:r>
+            </w:del>
+            <w:ins w:id="18" w:author="Ira Diethelm" w:date="2023-06-06T09:16:00Z">
+              <w:r>
+                <w:t>Digitalisierung</w:t>
+              </w:r>
+              <w:r>
+                <w:t xml:space="preserve"> </w:t>
+              </w:r>
+            </w:ins>
+            <w:r>
+              <w:t>(Basismodul B1 IT2School)</w:t>
             </w:r>
           </w:p>
         </w:tc>
@@ -2477,7 +2611,7 @@
       <w:pPr>
         <w:pStyle w:val="berschrift1"/>
       </w:pPr>
-      <w:bookmarkStart w:id="1" w:name="_Toc88152144"/>
+      <w:bookmarkStart w:id="19" w:name="_Toc88152144"/>
       <w:r>
         <w:rPr>
           <w:rFonts w:asciiTheme="minorHAnsi" w:eastAsiaTheme="minorEastAsia" w:hAnsiTheme="minorHAnsi" w:cstheme="minorBidi"/>
@@ -2485,14 +2619,134 @@
         <w:lastRenderedPageBreak/>
         <w:t>Warum gibt es das Modul?</w:t>
       </w:r>
-      <w:bookmarkEnd w:id="1"/>
+      <w:bookmarkEnd w:id="19"/>
     </w:p>
     <w:p>
       <w:r>
         <w:rPr>
           <w:rFonts w:asciiTheme="minorHAnsi" w:eastAsiaTheme="minorEastAsia" w:hAnsiTheme="minorHAnsi" w:cstheme="minorBidi"/>
         </w:rPr>
-        <w:t>Ob bei Suchanfragen im Internet, dem Schießen von spaßigen Selfies für Mitschülerinnen und Mitschüler oder bei der Interaktion mit Sprachassistenten: Künstliche Intelligenz (KI) ist allgegenwärtig und auch aus der Lebenswelt von Schülerinnen und Schülern nicht mehr wegzudenken. Oftmals arbeitet KI jedoch im Verborgenen oder hinter der Oberfläche der Informatiksysteme, die häufig im Alltäglichen selbstverständlich genutzt werden. Ein mündiger Umgang erfordert jedoch ein grundlegendes Verständnis darüber, wo KI auftreten kann und welche Eigenschaften KI haben kann.</w:t>
+        <w:t xml:space="preserve">Ob bei Suchanfragen im Internet, dem Schießen von spaßigen Selfies für Mitschülerinnen und Mitschüler oder bei der Interaktion mit Sprachassistenten: Künstliche Intelligenz (KI) ist allgegenwärtig und auch aus der Lebenswelt von Schülerinnen und Schülern nicht mehr wegzudenken. Oftmals </w:t>
+      </w:r>
+      <w:del w:id="20" w:author="Ira Diethelm" w:date="2023-06-06T09:48:00Z">
+        <w:r>
+          <w:rPr>
+            <w:rFonts w:asciiTheme="minorHAnsi" w:eastAsiaTheme="minorEastAsia" w:hAnsiTheme="minorHAnsi" w:cstheme="minorBidi"/>
+          </w:rPr>
+          <w:delText xml:space="preserve">arbeitet </w:delText>
+        </w:r>
+      </w:del>
+      <w:ins w:id="21" w:author="Ira Diethelm" w:date="2023-06-06T09:48:00Z">
+        <w:r>
+          <w:rPr>
+            <w:rFonts w:asciiTheme="minorHAnsi" w:eastAsiaTheme="minorEastAsia" w:hAnsiTheme="minorHAnsi" w:cstheme="minorBidi"/>
+          </w:rPr>
+          <w:t>arbeite</w:t>
+        </w:r>
+        <w:r>
+          <w:rPr>
+            <w:rFonts w:asciiTheme="minorHAnsi" w:eastAsiaTheme="minorEastAsia" w:hAnsiTheme="minorHAnsi" w:cstheme="minorBidi"/>
+          </w:rPr>
+          <w:t>n</w:t>
+        </w:r>
+        <w:r>
+          <w:rPr>
+            <w:rFonts w:asciiTheme="minorHAnsi" w:eastAsiaTheme="minorEastAsia" w:hAnsiTheme="minorHAnsi" w:cstheme="minorBidi"/>
+          </w:rPr>
+          <w:t xml:space="preserve"> </w:t>
+        </w:r>
+      </w:ins>
+      <w:r>
+        <w:rPr>
+          <w:rFonts w:asciiTheme="minorHAnsi" w:eastAsiaTheme="minorEastAsia" w:hAnsiTheme="minorHAnsi" w:cstheme="minorBidi"/>
+        </w:rPr>
+        <w:t>KI</w:t>
+      </w:r>
+      <w:ins w:id="22" w:author="Ira Diethelm" w:date="2023-06-06T09:48:00Z">
+        <w:r>
+          <w:rPr>
+            <w:rFonts w:asciiTheme="minorHAnsi" w:eastAsiaTheme="minorEastAsia" w:hAnsiTheme="minorHAnsi" w:cstheme="minorBidi"/>
+          </w:rPr>
+          <w:t>-Systeme</w:t>
+        </w:r>
+      </w:ins>
+      <w:r>
+        <w:rPr>
+          <w:rFonts w:asciiTheme="minorHAnsi" w:eastAsiaTheme="minorEastAsia" w:hAnsiTheme="minorHAnsi" w:cstheme="minorBidi"/>
+        </w:rPr>
+        <w:t xml:space="preserve"> jedoch im Verborgenen oder hinter der Oberfläche </w:t>
+      </w:r>
+      <w:del w:id="23" w:author="Ira Diethelm" w:date="2023-06-06T09:48:00Z">
+        <w:r>
+          <w:rPr>
+            <w:rFonts w:asciiTheme="minorHAnsi" w:eastAsiaTheme="minorEastAsia" w:hAnsiTheme="minorHAnsi" w:cstheme="minorBidi"/>
+          </w:rPr>
+          <w:delText>der Informatiksysteme, die häufig</w:delText>
+        </w:r>
+      </w:del>
+      <w:ins w:id="24" w:author="Ira Diethelm" w:date="2023-06-06T09:48:00Z">
+        <w:r>
+          <w:rPr>
+            <w:rFonts w:asciiTheme="minorHAnsi" w:eastAsiaTheme="minorEastAsia" w:hAnsiTheme="minorHAnsi" w:cstheme="minorBidi"/>
+          </w:rPr>
+          <w:t>von Systemen, die</w:t>
+        </w:r>
+      </w:ins>
+      <w:r>
+        <w:rPr>
+          <w:rFonts w:asciiTheme="minorHAnsi" w:eastAsiaTheme="minorEastAsia" w:hAnsiTheme="minorHAnsi" w:cstheme="minorBidi"/>
+        </w:rPr>
+        <w:t xml:space="preserve"> </w:t>
+      </w:r>
+      <w:del w:id="25" w:author="Ira Diethelm" w:date="2023-06-06T09:48:00Z">
+        <w:r>
+          <w:rPr>
+            <w:rFonts w:asciiTheme="minorHAnsi" w:eastAsiaTheme="minorEastAsia" w:hAnsiTheme="minorHAnsi" w:cstheme="minorBidi"/>
+          </w:rPr>
+          <w:delText>im A</w:delText>
+        </w:r>
+      </w:del>
+      <w:ins w:id="26" w:author="Ira Diethelm" w:date="2023-06-06T09:48:00Z">
+        <w:r>
+          <w:rPr>
+            <w:rFonts w:asciiTheme="minorHAnsi" w:eastAsiaTheme="minorEastAsia" w:hAnsiTheme="minorHAnsi" w:cstheme="minorBidi"/>
+          </w:rPr>
+          <w:t>a</w:t>
+        </w:r>
+      </w:ins>
+      <w:r>
+        <w:rPr>
+          <w:rFonts w:asciiTheme="minorHAnsi" w:eastAsiaTheme="minorEastAsia" w:hAnsiTheme="minorHAnsi" w:cstheme="minorBidi"/>
+        </w:rPr>
+        <w:t>lltäglich</w:t>
+      </w:r>
+      <w:del w:id="27" w:author="Ira Diethelm" w:date="2023-06-06T09:48:00Z">
+        <w:r>
+          <w:rPr>
+            <w:rFonts w:asciiTheme="minorHAnsi" w:eastAsiaTheme="minorEastAsia" w:hAnsiTheme="minorHAnsi" w:cstheme="minorBidi"/>
+          </w:rPr>
+          <w:delText>en</w:delText>
+        </w:r>
+      </w:del>
+      <w:r>
+        <w:rPr>
+          <w:rFonts w:asciiTheme="minorHAnsi" w:eastAsiaTheme="minorEastAsia" w:hAnsiTheme="minorHAnsi" w:cstheme="minorBidi"/>
+        </w:rPr>
+        <w:t xml:space="preserve"> selbstverständlich genutzt werden. Ein mündiger Umgang erfordert jedoch ein grundlegendes Verständnis darüber, wo KI auftreten kann und welche Eigenschaften KI</w:t>
+      </w:r>
+      <w:ins w:id="28" w:author="Ira Diethelm" w:date="2023-06-06T09:49:00Z">
+        <w:r>
+          <w:rPr>
+            <w:rFonts w:asciiTheme="minorHAnsi" w:eastAsiaTheme="minorEastAsia" w:hAnsiTheme="minorHAnsi" w:cstheme="minorBidi"/>
+          </w:rPr>
+          <w:t>-Systeme</w:t>
+        </w:r>
+      </w:ins>
+      <w:r>
+        <w:rPr>
+          <w:rFonts w:asciiTheme="minorHAnsi" w:eastAsiaTheme="minorEastAsia" w:hAnsiTheme="minorHAnsi" w:cstheme="minorBidi"/>
+        </w:rPr>
+        <w:t xml:space="preserve"> haben kann.</w:t>
       </w:r>
     </w:p>
     <w:p>
@@ -2500,7 +2754,21 @@
         <w:rPr>
           <w:rFonts w:asciiTheme="minorHAnsi" w:eastAsiaTheme="minorEastAsia" w:hAnsiTheme="minorHAnsi" w:cstheme="minorBidi"/>
         </w:rPr>
-        <w:t xml:space="preserve">In diesem Modul werden die Schülerinnen und Schüler dazu befähigt, KI als solche wahrzunehmen und zu erkennen, sowie typische Eigenschaften von KI zu charakterisieren. </w:t>
+        <w:t>In diesem Modul werden die Schülerinnen und Schüler dazu befähigt, KI als solche wahrzunehmen und zu erkennen, sowie typische Eigenschaften von KI</w:t>
+      </w:r>
+      <w:ins w:id="29" w:author="Ira Diethelm" w:date="2023-06-06T09:49:00Z">
+        <w:r>
+          <w:rPr>
+            <w:rFonts w:asciiTheme="minorHAnsi" w:eastAsiaTheme="minorEastAsia" w:hAnsiTheme="minorHAnsi" w:cstheme="minorBidi"/>
+          </w:rPr>
+          <w:t>-Systemen</w:t>
+        </w:r>
+      </w:ins>
+      <w:r>
+        <w:rPr>
+          <w:rFonts w:asciiTheme="minorHAnsi" w:eastAsiaTheme="minorEastAsia" w:hAnsiTheme="minorHAnsi" w:cstheme="minorBidi"/>
+        </w:rPr>
+        <w:t xml:space="preserve"> zu charakterisieren. </w:t>
       </w:r>
     </w:p>
     <w:p>
@@ -2515,14 +2783,14 @@
       <w:pPr>
         <w:pStyle w:val="berschrift1"/>
       </w:pPr>
-      <w:bookmarkStart w:id="2" w:name="_Toc88152145"/>
+      <w:bookmarkStart w:id="30" w:name="_Toc88152145"/>
       <w:r>
         <w:rPr>
           <w:rFonts w:asciiTheme="minorHAnsi" w:eastAsiaTheme="minorEastAsia" w:hAnsiTheme="minorHAnsi" w:cstheme="minorBidi"/>
         </w:rPr>
         <w:t>Ziele des Moduls</w:t>
       </w:r>
-      <w:bookmarkEnd w:id="2"/>
+      <w:bookmarkEnd w:id="30"/>
       <w:r>
         <w:rPr>
           <w:rFonts w:asciiTheme="minorHAnsi" w:eastAsiaTheme="minorEastAsia" w:hAnsiTheme="minorHAnsi" w:cstheme="minorBidi"/>
@@ -2535,7 +2803,35 @@
         <w:rPr>
           <w:rFonts w:asciiTheme="minorHAnsi" w:eastAsiaTheme="minorEastAsia" w:hAnsiTheme="minorHAnsi" w:cstheme="minorBidi"/>
         </w:rPr>
-        <w:t xml:space="preserve">In der fachdidaktischen Diskussion sind zuletzt zahlreiche Beiträge zu Lernzielen und Kompetenzen, die Schülerinnen und Schüler im Zusammenhang mit Künstlicher Intelligenz erwerben sollen, publiziert worden. Einer der in diesem Zusammenhang oft zitierten Beiträge stammt von </w:t>
+        <w:t xml:space="preserve">In der fachdidaktischen Diskussion sind zuletzt zahlreiche Beiträge zu Lernzielen und Kompetenzen, die Schülerinnen und Schüler im Zusammenhang mit </w:t>
+      </w:r>
+      <w:del w:id="31" w:author="Ira Diethelm" w:date="2023-06-06T09:49:00Z">
+        <w:r>
+          <w:rPr>
+            <w:rFonts w:asciiTheme="minorHAnsi" w:eastAsiaTheme="minorEastAsia" w:hAnsiTheme="minorHAnsi" w:cstheme="minorBidi"/>
+          </w:rPr>
+          <w:delText xml:space="preserve">Künstlicher </w:delText>
+        </w:r>
+      </w:del>
+      <w:ins w:id="32" w:author="Ira Diethelm" w:date="2023-06-06T09:49:00Z">
+        <w:r>
+          <w:rPr>
+            <w:rFonts w:asciiTheme="minorHAnsi" w:eastAsiaTheme="minorEastAsia" w:hAnsiTheme="minorHAnsi" w:cstheme="minorBidi"/>
+          </w:rPr>
+          <w:t>k</w:t>
+        </w:r>
+        <w:r>
+          <w:rPr>
+            <w:rFonts w:asciiTheme="minorHAnsi" w:eastAsiaTheme="minorEastAsia" w:hAnsiTheme="minorHAnsi" w:cstheme="minorBidi"/>
+          </w:rPr>
+          <w:t xml:space="preserve">ünstlicher </w:t>
+        </w:r>
+      </w:ins>
+      <w:r>
+        <w:rPr>
+          <w:rFonts w:asciiTheme="minorHAnsi" w:eastAsiaTheme="minorEastAsia" w:hAnsiTheme="minorHAnsi" w:cstheme="minorBidi"/>
+        </w:rPr>
+        <w:t xml:space="preserve">Intelligenz erwerben sollen, publiziert worden. Einer der in diesem Zusammenhang oft zitierten Beiträge stammt von </w:t>
       </w:r>
       <w:proofErr w:type="spellStart"/>
       <w:r>
@@ -2563,7 +2859,35 @@
         <w:rPr>
           <w:rFonts w:asciiTheme="minorHAnsi" w:eastAsiaTheme="minorEastAsia" w:hAnsiTheme="minorHAnsi" w:cstheme="minorBidi"/>
         </w:rPr>
-        <w:t>“ Künstlicher Intelligenz diskutieren. Der Großteil der identifizierten Ideen zielt dabei auf ein Verständnis der Prozesse in den Informatiksystemen ab, die KI nutzen (bspw. die Wahrnehmung der Umwelt durch Sensoren oder das Auswerten von Daten). In diesem Einstiegsmodul wird sich dem Gebiet der KI über ein Verständnis der Informatiksysteme genähert, die KI nutzen.</w:t>
+        <w:t xml:space="preserve">“ </w:t>
+      </w:r>
+      <w:del w:id="33" w:author="Ira Diethelm" w:date="2023-06-06T09:49:00Z">
+        <w:r>
+          <w:rPr>
+            <w:rFonts w:asciiTheme="minorHAnsi" w:eastAsiaTheme="minorEastAsia" w:hAnsiTheme="minorHAnsi" w:cstheme="minorBidi"/>
+          </w:rPr>
+          <w:delText xml:space="preserve">Künstlicher </w:delText>
+        </w:r>
+      </w:del>
+      <w:ins w:id="34" w:author="Ira Diethelm" w:date="2023-06-06T09:49:00Z">
+        <w:r>
+          <w:rPr>
+            <w:rFonts w:asciiTheme="minorHAnsi" w:eastAsiaTheme="minorEastAsia" w:hAnsiTheme="minorHAnsi" w:cstheme="minorBidi"/>
+          </w:rPr>
+          <w:t>k</w:t>
+        </w:r>
+        <w:r>
+          <w:rPr>
+            <w:rFonts w:asciiTheme="minorHAnsi" w:eastAsiaTheme="minorEastAsia" w:hAnsiTheme="minorHAnsi" w:cstheme="minorBidi"/>
+          </w:rPr>
+          <w:t xml:space="preserve">ünstlicher </w:t>
+        </w:r>
+      </w:ins>
+      <w:r>
+        <w:rPr>
+          <w:rFonts w:asciiTheme="minorHAnsi" w:eastAsiaTheme="minorEastAsia" w:hAnsiTheme="minorHAnsi" w:cstheme="minorBidi"/>
+        </w:rPr>
+        <w:t>Intelligenz diskutieren. Der Großteil der identifizierten Ideen zielt dabei auf ein Verständnis der Prozesse in den Informatiksystemen ab, die KI nutzen (bspw. die Wahrnehmung der Umwelt durch Sensoren oder das Auswerten von Daten). In diesem Einstiegsmodul wird sich dem Gebiet der KI über ein Verständnis der Informatiksysteme genähert, die KI nutzen.</w:t>
       </w:r>
     </w:p>
     <w:p>
@@ -2711,7 +3035,43 @@
         <w:rPr>
           <w:rFonts w:asciiTheme="minorHAnsi" w:eastAsiaTheme="minorEastAsia" w:hAnsiTheme="minorHAnsi" w:cstheme="minorBidi"/>
         </w:rPr>
-        <w:t>Phänomene aus ihrer Lebenswelt im Zusammenhang mit Künstlichen Intelligenzen zu identifizieren,</w:t>
+        <w:t>Phänomene aus ihrer Lebenswelt im Zusammenhang mit Künstliche</w:t>
+      </w:r>
+      <w:del w:id="35" w:author="Ira Diethelm" w:date="2023-06-06T09:33:00Z">
+        <w:r>
+          <w:rPr>
+            <w:rFonts w:asciiTheme="minorHAnsi" w:eastAsiaTheme="minorEastAsia" w:hAnsiTheme="minorHAnsi" w:cstheme="minorBidi"/>
+          </w:rPr>
+          <w:delText>n</w:delText>
+        </w:r>
+      </w:del>
+      <w:ins w:id="36" w:author="Ira Diethelm" w:date="2023-06-06T09:33:00Z">
+        <w:r>
+          <w:rPr>
+            <w:rFonts w:asciiTheme="minorHAnsi" w:eastAsiaTheme="minorEastAsia" w:hAnsiTheme="minorHAnsi" w:cstheme="minorBidi"/>
+          </w:rPr>
+          <w:t>r</w:t>
+        </w:r>
+      </w:ins>
+      <w:r>
+        <w:rPr>
+          <w:rFonts w:asciiTheme="minorHAnsi" w:eastAsiaTheme="minorEastAsia" w:hAnsiTheme="minorHAnsi" w:cstheme="minorBidi"/>
+        </w:rPr>
+        <w:t xml:space="preserve"> Intelligenz</w:t>
+      </w:r>
+      <w:del w:id="37" w:author="Ira Diethelm" w:date="2023-06-06T09:33:00Z">
+        <w:r>
+          <w:rPr>
+            <w:rFonts w:asciiTheme="minorHAnsi" w:eastAsiaTheme="minorEastAsia" w:hAnsiTheme="minorHAnsi" w:cstheme="minorBidi"/>
+          </w:rPr>
+          <w:delText>en</w:delText>
+        </w:r>
+      </w:del>
+      <w:r>
+        <w:rPr>
+          <w:rFonts w:asciiTheme="minorHAnsi" w:eastAsiaTheme="minorEastAsia" w:hAnsiTheme="minorHAnsi" w:cstheme="minorBidi"/>
+        </w:rPr>
+        <w:t xml:space="preserve"> zu identifizieren,</w:t>
       </w:r>
     </w:p>
     <w:p>
@@ -2743,7 +3103,49 @@
         <w:rPr>
           <w:rFonts w:asciiTheme="minorHAnsi" w:eastAsiaTheme="minorEastAsia" w:hAnsiTheme="minorHAnsi" w:cstheme="minorBidi"/>
         </w:rPr>
-        <w:t>Künstliche Intelligenzen als automatisierte Prozesse, die von Informatiksystemen ausgeführt werden, kennen und,</w:t>
+        <w:t>Künstliche Intelligenz</w:t>
+      </w:r>
+      <w:del w:id="38" w:author="Ira Diethelm" w:date="2023-06-06T09:33:00Z">
+        <w:r>
+          <w:rPr>
+            <w:rFonts w:asciiTheme="minorHAnsi" w:eastAsiaTheme="minorEastAsia" w:hAnsiTheme="minorHAnsi" w:cstheme="minorBidi"/>
+          </w:rPr>
+          <w:delText>en</w:delText>
+        </w:r>
+      </w:del>
+      <w:r>
+        <w:rPr>
+          <w:rFonts w:asciiTheme="minorHAnsi" w:eastAsiaTheme="minorEastAsia" w:hAnsiTheme="minorHAnsi" w:cstheme="minorBidi"/>
+        </w:rPr>
+        <w:t xml:space="preserve"> als automatisierte Prozesse</w:t>
+      </w:r>
+      <w:ins w:id="39" w:author="Ira Diethelm" w:date="2023-06-06T09:34:00Z">
+        <w:r>
+          <w:rPr>
+            <w:rFonts w:asciiTheme="minorHAnsi" w:eastAsiaTheme="minorEastAsia" w:hAnsiTheme="minorHAnsi" w:cstheme="minorBidi"/>
+          </w:rPr>
+          <w:t xml:space="preserve"> zu beschreiben</w:t>
+        </w:r>
+      </w:ins>
+      <w:r>
+        <w:rPr>
+          <w:rFonts w:asciiTheme="minorHAnsi" w:eastAsiaTheme="minorEastAsia" w:hAnsiTheme="minorHAnsi" w:cstheme="minorBidi"/>
+        </w:rPr>
+        <w:t xml:space="preserve">, die von Informatiksystemen ausgeführt werden, </w:t>
+      </w:r>
+      <w:del w:id="40" w:author="Ira Diethelm" w:date="2023-06-06T09:34:00Z">
+        <w:r>
+          <w:rPr>
+            <w:rFonts w:asciiTheme="minorHAnsi" w:eastAsiaTheme="minorEastAsia" w:hAnsiTheme="minorHAnsi" w:cstheme="minorBidi"/>
+          </w:rPr>
+          <w:delText xml:space="preserve">kennen </w:delText>
+        </w:r>
+      </w:del>
+      <w:r>
+        <w:rPr>
+          <w:rFonts w:asciiTheme="minorHAnsi" w:eastAsiaTheme="minorEastAsia" w:hAnsiTheme="minorHAnsi" w:cstheme="minorBidi"/>
+        </w:rPr>
+        <w:t>und,</w:t>
       </w:r>
     </w:p>
     <w:p>
@@ -2759,21 +3161,71 @@
         <w:rPr>
           <w:rFonts w:asciiTheme="minorHAnsi" w:eastAsiaTheme="minorEastAsia" w:hAnsiTheme="minorHAnsi" w:cstheme="minorBidi"/>
         </w:rPr>
-        <w:t>dass Künstliche Intelligenzen zur Entscheidungsfindung auf Daten zurückgreifen, die über Sensoren wahrgenommen werden und die Realität unvollständig repräsentieren.</w:t>
+        <w:t xml:space="preserve">dass </w:t>
+      </w:r>
+      <w:ins w:id="41" w:author="Ira Diethelm" w:date="2023-06-06T09:34:00Z">
+        <w:r>
+          <w:rPr>
+            <w:rFonts w:asciiTheme="minorHAnsi" w:eastAsiaTheme="minorEastAsia" w:hAnsiTheme="minorHAnsi" w:cstheme="minorBidi"/>
+          </w:rPr>
+          <w:t>Systeme mit k</w:t>
+        </w:r>
+      </w:ins>
+      <w:del w:id="42" w:author="Ira Diethelm" w:date="2023-06-06T09:34:00Z">
+        <w:r>
+          <w:rPr>
+            <w:rFonts w:asciiTheme="minorHAnsi" w:eastAsiaTheme="minorEastAsia" w:hAnsiTheme="minorHAnsi" w:cstheme="minorBidi"/>
+          </w:rPr>
+          <w:delText>K</w:delText>
+        </w:r>
+      </w:del>
+      <w:r>
+        <w:rPr>
+          <w:rFonts w:asciiTheme="minorHAnsi" w:eastAsiaTheme="minorEastAsia" w:hAnsiTheme="minorHAnsi" w:cstheme="minorBidi"/>
+        </w:rPr>
+        <w:t>ünstliche</w:t>
+      </w:r>
+      <w:ins w:id="43" w:author="Ira Diethelm" w:date="2023-06-06T09:34:00Z">
+        <w:r>
+          <w:rPr>
+            <w:rFonts w:asciiTheme="minorHAnsi" w:eastAsiaTheme="minorEastAsia" w:hAnsiTheme="minorHAnsi" w:cstheme="minorBidi"/>
+          </w:rPr>
+          <w:t>r</w:t>
+        </w:r>
+      </w:ins>
+      <w:r>
+        <w:rPr>
+          <w:rFonts w:asciiTheme="minorHAnsi" w:eastAsiaTheme="minorEastAsia" w:hAnsiTheme="minorHAnsi" w:cstheme="minorBidi"/>
+        </w:rPr>
+        <w:t xml:space="preserve"> Intelligenz</w:t>
+      </w:r>
+      <w:del w:id="44" w:author="Ira Diethelm" w:date="2023-06-06T09:34:00Z">
+        <w:r>
+          <w:rPr>
+            <w:rFonts w:asciiTheme="minorHAnsi" w:eastAsiaTheme="minorEastAsia" w:hAnsiTheme="minorHAnsi" w:cstheme="minorBidi"/>
+          </w:rPr>
+          <w:delText>en</w:delText>
+        </w:r>
+      </w:del>
+      <w:r>
+        <w:rPr>
+          <w:rFonts w:asciiTheme="minorHAnsi" w:eastAsiaTheme="minorEastAsia" w:hAnsiTheme="minorHAnsi" w:cstheme="minorBidi"/>
+        </w:rPr>
+        <w:t xml:space="preserve"> zur Entscheidungsfindung auf Daten zurückgreifen, die über Sensoren wahrgenommen werden und die Realität unvollständig repräsentieren.</w:t>
       </w:r>
     </w:p>
     <w:p>
       <w:pPr>
         <w:pStyle w:val="berschrift1"/>
       </w:pPr>
-      <w:bookmarkStart w:id="3" w:name="_Toc88152146"/>
+      <w:bookmarkStart w:id="45" w:name="_Toc88152146"/>
       <w:r>
         <w:rPr>
           <w:rFonts w:asciiTheme="minorHAnsi" w:eastAsiaTheme="minorEastAsia" w:hAnsiTheme="minorHAnsi" w:cstheme="minorBidi"/>
         </w:rPr>
         <w:t>Die Rolle der Unternehmensvertreterin/des Unternehmensvertreters</w:t>
       </w:r>
-      <w:bookmarkEnd w:id="3"/>
+      <w:bookmarkEnd w:id="45"/>
     </w:p>
     <w:p>
       <w:pPr>
@@ -2802,7 +3254,29 @@
         <w:rPr>
           <w:rFonts w:asciiTheme="minorHAnsi" w:eastAsiaTheme="minorEastAsia" w:hAnsiTheme="minorHAnsi" w:cstheme="minorBidi"/>
         </w:rPr>
-        <w:t>Sie oder er kann als Special-Guest eingeladen werden, um über die Bedeutung von Künstlicher Intelligenz in der Wirtschaft und insbesondere im eigenen Unternehmen zu berichten.</w:t>
+        <w:t xml:space="preserve">Sie oder er kann als Special-Guest eingeladen werden, um über die Bedeutung von </w:t>
+      </w:r>
+      <w:ins w:id="46" w:author="Ira Diethelm" w:date="2023-06-06T09:55:00Z">
+        <w:r>
+          <w:rPr>
+            <w:rFonts w:asciiTheme="minorHAnsi" w:eastAsiaTheme="minorEastAsia" w:hAnsiTheme="minorHAnsi" w:cstheme="minorBidi"/>
+          </w:rPr>
+          <w:t>k</w:t>
+        </w:r>
+      </w:ins>
+      <w:del w:id="47" w:author="Ira Diethelm" w:date="2023-06-06T09:55:00Z">
+        <w:r>
+          <w:rPr>
+            <w:rFonts w:asciiTheme="minorHAnsi" w:eastAsiaTheme="minorEastAsia" w:hAnsiTheme="minorHAnsi" w:cstheme="minorBidi"/>
+          </w:rPr>
+          <w:delText>K</w:delText>
+        </w:r>
+      </w:del>
+      <w:r>
+        <w:rPr>
+          <w:rFonts w:asciiTheme="minorHAnsi" w:eastAsiaTheme="minorEastAsia" w:hAnsiTheme="minorHAnsi" w:cstheme="minorBidi"/>
+        </w:rPr>
+        <w:t>ünstlicher Intelligenz in der Wirtschaft und insbesondere im eigenen Unternehmen zu berichten.</w:t>
       </w:r>
     </w:p>
     <w:p>
@@ -2817,7 +3291,29 @@
         <w:rPr>
           <w:rFonts w:asciiTheme="minorHAnsi" w:eastAsiaTheme="minorEastAsia" w:hAnsiTheme="minorHAnsi" w:cstheme="minorBidi"/>
         </w:rPr>
-        <w:t>Sie oder er kann den Schülerinnen und Schülern eine Exkursion in das eigene Unternehmen ermöglichen und zeigen, wo Künstliche Intelligenz zum Einsatz kommt.</w:t>
+        <w:t xml:space="preserve">Sie oder er kann den Schülerinnen und Schülern eine Exkursion in das eigene Unternehmen ermöglichen und zeigen, wo </w:t>
+      </w:r>
+      <w:ins w:id="48" w:author="Ira Diethelm" w:date="2023-06-06T09:55:00Z">
+        <w:r>
+          <w:rPr>
+            <w:rFonts w:asciiTheme="minorHAnsi" w:eastAsiaTheme="minorEastAsia" w:hAnsiTheme="minorHAnsi" w:cstheme="minorBidi"/>
+          </w:rPr>
+          <w:t>k</w:t>
+        </w:r>
+      </w:ins>
+      <w:del w:id="49" w:author="Ira Diethelm" w:date="2023-06-06T09:55:00Z">
+        <w:r>
+          <w:rPr>
+            <w:rFonts w:asciiTheme="minorHAnsi" w:eastAsiaTheme="minorEastAsia" w:hAnsiTheme="minorHAnsi" w:cstheme="minorBidi"/>
+          </w:rPr>
+          <w:delText>K</w:delText>
+        </w:r>
+      </w:del>
+      <w:r>
+        <w:rPr>
+          <w:rFonts w:asciiTheme="minorHAnsi" w:eastAsiaTheme="minorEastAsia" w:hAnsiTheme="minorHAnsi" w:cstheme="minorBidi"/>
+        </w:rPr>
+        <w:t>ünstliche Intelligenz zum Einsatz kommt.</w:t>
       </w:r>
     </w:p>
     <w:p>
@@ -2832,7 +3328,21 @@
         <w:rPr>
           <w:rFonts w:asciiTheme="minorHAnsi" w:eastAsiaTheme="minorEastAsia" w:hAnsiTheme="minorHAnsi" w:cstheme="minorBidi"/>
         </w:rPr>
-        <w:t xml:space="preserve">Ergänzend kann eine Charakterisierung dieser KI von den Schülerinnen und Schülern nach dem Muster in Arbeitsmaterial KI-B1.2 vorgenommen werden. </w:t>
+        <w:t>Ergänzend kann eine Charakterisierung dieser KI</w:t>
+      </w:r>
+      <w:ins w:id="50" w:author="Ira Diethelm" w:date="2023-06-06T09:35:00Z">
+        <w:r>
+          <w:rPr>
+            <w:rFonts w:asciiTheme="minorHAnsi" w:eastAsiaTheme="minorEastAsia" w:hAnsiTheme="minorHAnsi" w:cstheme="minorBidi"/>
+          </w:rPr>
+          <w:t>-Systeme</w:t>
+        </w:r>
+      </w:ins>
+      <w:r>
+        <w:rPr>
+          <w:rFonts w:asciiTheme="minorHAnsi" w:eastAsiaTheme="minorEastAsia" w:hAnsiTheme="minorHAnsi" w:cstheme="minorBidi"/>
+        </w:rPr>
+        <w:t xml:space="preserve"> von den Schülerinnen und Schülern nach dem Muster in Arbeitsmaterial KI-B1.2 vorgenommen werden. </w:t>
       </w:r>
     </w:p>
     <w:p>
@@ -2850,7 +3360,7 @@
       <w:pPr>
         <w:pStyle w:val="berschrift1"/>
       </w:pPr>
-      <w:bookmarkStart w:id="4" w:name="_Toc88152147"/>
+      <w:bookmarkStart w:id="51" w:name="_Toc88152147"/>
       <w:r>
         <w:rPr>
           <w:rFonts w:asciiTheme="minorHAnsi" w:eastAsiaTheme="minorEastAsia" w:hAnsiTheme="minorHAnsi" w:cstheme="minorBidi"/>
@@ -2858,7 +3368,7 @@
         <w:lastRenderedPageBreak/>
         <w:t>Inhalte des Moduls</w:t>
       </w:r>
-      <w:bookmarkEnd w:id="4"/>
+      <w:bookmarkEnd w:id="51"/>
     </w:p>
     <w:p>
       <w:r>
@@ -2879,7 +3389,35 @@
         <w:rPr>
           <w:rFonts w:asciiTheme="minorHAnsi" w:eastAsiaTheme="minorEastAsia" w:hAnsiTheme="minorHAnsi" w:cstheme="minorBidi"/>
         </w:rPr>
-        <w:t xml:space="preserve"> weil – der Begriff „Künstliche Intelligenz“ (KI, engl. </w:t>
+        <w:t xml:space="preserve"> weil – der Begriff „</w:t>
+      </w:r>
+      <w:del w:id="52" w:author="Ira Diethelm" w:date="2023-06-06T09:46:00Z">
+        <w:r>
+          <w:rPr>
+            <w:rFonts w:asciiTheme="minorHAnsi" w:eastAsiaTheme="minorEastAsia" w:hAnsiTheme="minorHAnsi" w:cstheme="minorBidi"/>
+          </w:rPr>
+          <w:delText xml:space="preserve">Künstliche </w:delText>
+        </w:r>
+      </w:del>
+      <w:ins w:id="53" w:author="Ira Diethelm" w:date="2023-06-06T09:46:00Z">
+        <w:r>
+          <w:rPr>
+            <w:rFonts w:asciiTheme="minorHAnsi" w:eastAsiaTheme="minorEastAsia" w:hAnsiTheme="minorHAnsi" w:cstheme="minorBidi"/>
+          </w:rPr>
+          <w:t>k</w:t>
+        </w:r>
+        <w:r>
+          <w:rPr>
+            <w:rFonts w:asciiTheme="minorHAnsi" w:eastAsiaTheme="minorEastAsia" w:hAnsiTheme="minorHAnsi" w:cstheme="minorBidi"/>
+          </w:rPr>
+          <w:t xml:space="preserve">ünstliche </w:t>
+        </w:r>
+      </w:ins>
+      <w:r>
+        <w:rPr>
+          <w:rFonts w:asciiTheme="minorHAnsi" w:eastAsiaTheme="minorEastAsia" w:hAnsiTheme="minorHAnsi" w:cstheme="minorBidi"/>
+        </w:rPr>
+        <w:t xml:space="preserve">Intelligenz“ (KI, engl. </w:t>
       </w:r>
       <w:proofErr w:type="spellStart"/>
       <w:r>
@@ -2917,7 +3455,51 @@
         <w:rPr>
           <w:rFonts w:asciiTheme="minorHAnsi" w:eastAsiaTheme="minorEastAsia" w:hAnsiTheme="minorHAnsi" w:cstheme="minorBidi"/>
         </w:rPr>
-        <w:t>) bereits seit mehreren Jahrzehnten stetig an Popularität gewinnt, existiert keine allgemein akzeptierte Definition dessen, was eine KI auszeichnet oder was eine KI leistet. Grundsätzlich eint die vielen Definitionen verschiedener Autorinnen und Autoren die Verwendung als „Kofferwort“</w:t>
+        <w:t>) bereits seit mehreren Jahrzehnten stetig an Popularität gewinnt, existiert keine allgemein akzeptierte Definition dessen, was ein</w:t>
+      </w:r>
+      <w:ins w:id="54" w:author="Ira Diethelm" w:date="2023-06-06T09:37:00Z">
+        <w:r>
+          <w:rPr>
+            <w:rFonts w:asciiTheme="minorHAnsi" w:eastAsiaTheme="minorEastAsia" w:hAnsiTheme="minorHAnsi" w:cstheme="minorBidi"/>
+          </w:rPr>
+          <w:t xml:space="preserve"> System mit</w:t>
+        </w:r>
+      </w:ins>
+      <w:del w:id="55" w:author="Ira Diethelm" w:date="2023-06-06T09:37:00Z">
+        <w:r>
+          <w:rPr>
+            <w:rFonts w:asciiTheme="minorHAnsi" w:eastAsiaTheme="minorEastAsia" w:hAnsiTheme="minorHAnsi" w:cstheme="minorBidi"/>
+          </w:rPr>
+          <w:delText>e</w:delText>
+        </w:r>
+      </w:del>
+      <w:r>
+        <w:rPr>
+          <w:rFonts w:asciiTheme="minorHAnsi" w:eastAsiaTheme="minorEastAsia" w:hAnsiTheme="minorHAnsi" w:cstheme="minorBidi"/>
+        </w:rPr>
+        <w:t xml:space="preserve"> KI auszeichnet oder was </w:t>
+      </w:r>
+      <w:ins w:id="56" w:author="Ira Diethelm" w:date="2023-06-06T09:37:00Z">
+        <w:r>
+          <w:rPr>
+            <w:rFonts w:asciiTheme="minorHAnsi" w:eastAsiaTheme="minorEastAsia" w:hAnsiTheme="minorHAnsi" w:cstheme="minorBidi"/>
+          </w:rPr>
+          <w:t xml:space="preserve">es </w:t>
+        </w:r>
+      </w:ins>
+      <w:del w:id="57" w:author="Ira Diethelm" w:date="2023-06-06T09:37:00Z">
+        <w:r>
+          <w:rPr>
+            <w:rFonts w:asciiTheme="minorHAnsi" w:eastAsiaTheme="minorEastAsia" w:hAnsiTheme="minorHAnsi" w:cstheme="minorBidi"/>
+          </w:rPr>
+          <w:delText xml:space="preserve">eine KI </w:delText>
+        </w:r>
+      </w:del>
+      <w:r>
+        <w:rPr>
+          <w:rFonts w:asciiTheme="minorHAnsi" w:eastAsiaTheme="minorEastAsia" w:hAnsiTheme="minorHAnsi" w:cstheme="minorBidi"/>
+        </w:rPr>
+        <w:t>leistet. Grundsätzlich eint die vielen Definitionen verschiedener Autorinnen und Autoren die Verwendung als „Kofferwort“</w:t>
       </w:r>
       <w:r>
         <w:rPr>
@@ -2974,6 +3556,94 @@
         </w:rPr>
         <w:t xml:space="preserve"> erfordern.</w:t>
       </w:r>
+      <w:ins w:id="58" w:author="Ira Diethelm" w:date="2023-06-06T09:38:00Z">
+        <w:r>
+          <w:rPr>
+            <w:rFonts w:asciiTheme="minorHAnsi" w:eastAsiaTheme="minorEastAsia" w:hAnsiTheme="minorHAnsi" w:cstheme="minorBidi"/>
+          </w:rPr>
+          <w:t xml:space="preserve"> </w:t>
+        </w:r>
+      </w:ins>
+      <w:ins w:id="59" w:author="Ira Diethelm" w:date="2023-06-06T09:40:00Z">
+        <w:r>
+          <w:rPr>
+            <w:rFonts w:asciiTheme="minorHAnsi" w:eastAsiaTheme="minorEastAsia" w:hAnsiTheme="minorHAnsi" w:cstheme="minorBidi"/>
+          </w:rPr>
+          <w:t>Spricht man von „</w:t>
+        </w:r>
+      </w:ins>
+      <w:ins w:id="60" w:author="Ira Diethelm" w:date="2023-06-06T09:38:00Z">
+        <w:r>
+          <w:rPr>
+            <w:rFonts w:asciiTheme="minorHAnsi" w:eastAsiaTheme="minorEastAsia" w:hAnsiTheme="minorHAnsi" w:cstheme="minorBidi"/>
+          </w:rPr>
+          <w:t>einer KI</w:t>
+        </w:r>
+      </w:ins>
+      <w:ins w:id="61" w:author="Ira Diethelm" w:date="2023-06-06T09:40:00Z">
+        <w:r>
+          <w:rPr>
+            <w:rFonts w:asciiTheme="minorHAnsi" w:eastAsiaTheme="minorEastAsia" w:hAnsiTheme="minorHAnsi" w:cstheme="minorBidi"/>
+          </w:rPr>
+          <w:t>“</w:t>
+        </w:r>
+      </w:ins>
+      <w:ins w:id="62" w:author="Ira Diethelm" w:date="2023-06-06T09:38:00Z">
+        <w:r>
+          <w:rPr>
+            <w:rFonts w:asciiTheme="minorHAnsi" w:eastAsiaTheme="minorEastAsia" w:hAnsiTheme="minorHAnsi" w:cstheme="minorBidi"/>
+          </w:rPr>
+          <w:t xml:space="preserve"> wird </w:t>
+        </w:r>
+      </w:ins>
+      <w:ins w:id="63" w:author="Ira Diethelm" w:date="2023-06-06T09:40:00Z">
+        <w:r>
+          <w:rPr>
+            <w:rFonts w:asciiTheme="minorHAnsi" w:eastAsiaTheme="minorEastAsia" w:hAnsiTheme="minorHAnsi" w:cstheme="minorBidi"/>
+          </w:rPr>
+          <w:t>darunter meist</w:t>
+        </w:r>
+      </w:ins>
+      <w:ins w:id="64" w:author="Ira Diethelm" w:date="2023-06-06T09:38:00Z">
+        <w:r>
+          <w:rPr>
+            <w:rFonts w:asciiTheme="minorHAnsi" w:eastAsiaTheme="minorEastAsia" w:hAnsiTheme="minorHAnsi" w:cstheme="minorBidi"/>
+          </w:rPr>
+          <w:t xml:space="preserve"> ein System mit künstlicher Intelligenz </w:t>
+        </w:r>
+      </w:ins>
+      <w:ins w:id="65" w:author="Ira Diethelm" w:date="2023-06-06T09:40:00Z">
+        <w:r>
+          <w:rPr>
+            <w:rFonts w:asciiTheme="minorHAnsi" w:eastAsiaTheme="minorEastAsia" w:hAnsiTheme="minorHAnsi" w:cstheme="minorBidi"/>
+          </w:rPr>
+          <w:t>verstanden.</w:t>
+        </w:r>
+      </w:ins>
+      <w:ins w:id="66" w:author="Ira Diethelm" w:date="2023-06-06T09:39:00Z">
+        <w:r>
+          <w:rPr>
+            <w:rFonts w:asciiTheme="minorHAnsi" w:eastAsiaTheme="minorEastAsia" w:hAnsiTheme="minorHAnsi" w:cstheme="minorBidi"/>
+          </w:rPr>
+          <w:t xml:space="preserve"> Die Mehrzahl ist eher un</w:t>
+        </w:r>
+      </w:ins>
+      <w:ins w:id="67" w:author="Ira Diethelm" w:date="2023-06-06T09:40:00Z">
+        <w:r>
+          <w:rPr>
+            <w:rFonts w:asciiTheme="minorHAnsi" w:eastAsiaTheme="minorEastAsia" w:hAnsiTheme="minorHAnsi" w:cstheme="minorBidi"/>
+          </w:rPr>
+          <w:t>gebräuchlich</w:t>
+        </w:r>
+      </w:ins>
+      <w:ins w:id="68" w:author="Ira Diethelm" w:date="2023-06-06T09:39:00Z">
+        <w:r>
+          <w:rPr>
+            <w:rFonts w:asciiTheme="minorHAnsi" w:eastAsiaTheme="minorEastAsia" w:hAnsiTheme="minorHAnsi" w:cstheme="minorBidi"/>
+          </w:rPr>
+          <w:t>.</w:t>
+        </w:r>
+      </w:ins>
     </w:p>
     <w:p>
       <w:r>
@@ -3479,7 +4149,23 @@
           <w:szCs w:val="21"/>
         </w:rPr>
         <w:br/>
-        <w:t>als KI.</w:t>
+        <w:t>als KI</w:t>
+      </w:r>
+      <w:ins w:id="69" w:author="Ira Diethelm" w:date="2023-06-06T09:39:00Z">
+        <w:r>
+          <w:rPr>
+            <w:rFonts w:asciiTheme="minorHAnsi" w:eastAsiaTheme="minorEastAsia" w:hAnsiTheme="minorHAnsi" w:cstheme="minorBidi"/>
+            <w:szCs w:val="21"/>
+          </w:rPr>
+          <w:t>-Systeme</w:t>
+        </w:r>
+      </w:ins>
+      <w:r>
+        <w:rPr>
+          <w:rFonts w:asciiTheme="minorHAnsi" w:eastAsiaTheme="minorEastAsia" w:hAnsiTheme="minorHAnsi" w:cstheme="minorBidi"/>
+          <w:szCs w:val="21"/>
+        </w:rPr>
+        <w:t>.</w:t>
       </w:r>
     </w:p>
     <w:p>
@@ -3925,17 +4611,17 @@
       <w:pPr>
         <w:pStyle w:val="berschrift1"/>
       </w:pPr>
-      <w:bookmarkStart w:id="5" w:name="_Toc88152148"/>
+      <w:bookmarkStart w:id="70" w:name="_Toc88152148"/>
       <w:r>
         <w:rPr>
           <w:rFonts w:asciiTheme="minorHAnsi" w:eastAsiaTheme="minorEastAsia" w:hAnsiTheme="minorHAnsi" w:cstheme="minorBidi"/>
         </w:rPr>
         <w:t>Unterrichtliche Umsetzung</w:t>
       </w:r>
-      <w:bookmarkEnd w:id="5"/>
+      <w:bookmarkEnd w:id="70"/>
     </w:p>
     <w:p>
-      <w:bookmarkStart w:id="6" w:name="_Toc433280363"/>
+      <w:bookmarkStart w:id="71" w:name="_Toc433280363"/>
       <w:r>
         <w:rPr>
           <w:rFonts w:asciiTheme="minorHAnsi" w:eastAsiaTheme="minorEastAsia" w:hAnsiTheme="minorHAnsi" w:cstheme="minorBidi"/>
@@ -4092,8 +4778,8 @@
         <w:ind w:left="8" w:hanging="8"/>
         <w:jc w:val="both"/>
       </w:pPr>
-      <w:bookmarkStart w:id="7" w:name="_Toc88152149"/>
-      <w:bookmarkEnd w:id="6"/>
+      <w:bookmarkStart w:id="72" w:name="_Toc88152149"/>
+      <w:bookmarkEnd w:id="71"/>
       <w:r>
         <w:rPr>
           <w:rFonts w:asciiTheme="minorHAnsi" w:eastAsiaTheme="minorEastAsia" w:hAnsiTheme="minorHAnsi" w:cstheme="minorBidi"/>
@@ -4101,7 +4787,7 @@
         <w:lastRenderedPageBreak/>
         <w:t>Variante 1 (ca. 3 bis 4 Unterrichtsstunden á 45 Min.): mit Technik</w:t>
       </w:r>
-      <w:bookmarkEnd w:id="7"/>
+      <w:bookmarkEnd w:id="72"/>
     </w:p>
     <w:p>
       <w:r>
@@ -4369,7 +5055,7 @@
         <w:ind w:left="8" w:hanging="8"/>
         <w:jc w:val="both"/>
       </w:pPr>
-      <w:bookmarkStart w:id="8" w:name="_Toc88152150"/>
+      <w:bookmarkStart w:id="73" w:name="_Toc88152150"/>
       <w:r>
         <w:rPr>
           <w:rFonts w:asciiTheme="minorHAnsi" w:eastAsiaTheme="minorEastAsia" w:hAnsiTheme="minorHAnsi" w:cstheme="minorBidi"/>
@@ -4377,7 +5063,7 @@
         <w:lastRenderedPageBreak/>
         <w:t>Variante 2 (ca. 3 bis 4 Unterrichtsstunden á 45 Min.): ohne Technik</w:t>
       </w:r>
-      <w:bookmarkEnd w:id="8"/>
+      <w:bookmarkEnd w:id="73"/>
     </w:p>
     <w:p>
       <w:pPr>
@@ -4655,7 +5341,7 @@
       <w:pPr>
         <w:pStyle w:val="berschrift2"/>
       </w:pPr>
-      <w:bookmarkStart w:id="13" w:name="_Toc88152151"/>
+      <w:bookmarkStart w:id="78" w:name="_Toc88152151"/>
       <w:r>
         <w:rPr>
           <w:rFonts w:asciiTheme="minorHAnsi" w:eastAsiaTheme="minorEastAsia" w:hAnsiTheme="minorHAnsi" w:cstheme="minorBidi"/>
@@ -4663,7 +5349,7 @@
         <w:lastRenderedPageBreak/>
         <w:t>Stundenverlaufsskizzen</w:t>
       </w:r>
-      <w:bookmarkEnd w:id="13"/>
+      <w:bookmarkEnd w:id="78"/>
     </w:p>
     <w:p>
       <w:pPr>
@@ -4701,14 +5387,14 @@
         <w:spacing w:before="200" w:after="0"/>
         <w:jc w:val="both"/>
       </w:pPr>
-      <w:bookmarkStart w:id="14" w:name="_Toc88152152"/>
+      <w:bookmarkStart w:id="79" w:name="_Toc88152152"/>
       <w:r>
         <w:rPr>
           <w:rFonts w:asciiTheme="minorHAnsi" w:eastAsiaTheme="minorEastAsia" w:hAnsiTheme="minorHAnsi" w:cstheme="minorBidi"/>
         </w:rPr>
         <w:t>Variante 1: mit Technik</w:t>
       </w:r>
-      <w:bookmarkEnd w:id="14"/>
+      <w:bookmarkEnd w:id="79"/>
     </w:p>
     <w:tbl>
       <w:tblPr>
@@ -5865,10 +6551,10 @@
       </w:tr>
     </w:tbl>
     <w:p>
-      <w:bookmarkStart w:id="15" w:name="_Toc170047126"/>
-      <w:bookmarkStart w:id="16" w:name="_Toc433103686"/>
-      <w:bookmarkEnd w:id="15"/>
-      <w:bookmarkEnd w:id="16"/>
+      <w:bookmarkStart w:id="80" w:name="_Toc170047126"/>
+      <w:bookmarkStart w:id="81" w:name="_Toc433103686"/>
+      <w:bookmarkEnd w:id="80"/>
+      <w:bookmarkEnd w:id="81"/>
     </w:p>
     <w:p>
       <w:pPr>
@@ -5887,7 +6573,7 @@
         <w:spacing w:before="200" w:after="0"/>
         <w:jc w:val="both"/>
       </w:pPr>
-      <w:bookmarkStart w:id="17" w:name="_Toc88152153"/>
+      <w:bookmarkStart w:id="82" w:name="_Toc88152153"/>
       <w:r>
         <w:rPr>
           <w:rFonts w:asciiTheme="minorHAnsi" w:eastAsiaTheme="minorEastAsia" w:hAnsiTheme="minorHAnsi" w:cstheme="minorBidi"/>
@@ -5895,7 +6581,7 @@
         <w:lastRenderedPageBreak/>
         <w:t>Variante 2: ohne Technik</w:t>
       </w:r>
-      <w:bookmarkEnd w:id="17"/>
+      <w:bookmarkEnd w:id="82"/>
     </w:p>
     <w:tbl>
       <w:tblPr>
@@ -6984,7 +7670,7 @@
       <w:pPr>
         <w:pStyle w:val="berschrift1"/>
       </w:pPr>
-      <w:bookmarkStart w:id="18" w:name="_Toc88152154"/>
+      <w:bookmarkStart w:id="83" w:name="_Toc88152154"/>
       <w:r>
         <w:rPr>
           <w:rFonts w:asciiTheme="minorHAnsi" w:eastAsiaTheme="minorEastAsia" w:hAnsiTheme="minorHAnsi" w:cstheme="minorBidi"/>
@@ -6992,7 +7678,7 @@
         <w:lastRenderedPageBreak/>
         <w:t>Einbettung in verschiedene Fächer und Themen</w:t>
       </w:r>
-      <w:bookmarkEnd w:id="18"/>
+      <w:bookmarkEnd w:id="83"/>
     </w:p>
     <w:p>
       <w:pPr>
@@ -7545,7 +8231,7 @@
       <w:pPr>
         <w:pStyle w:val="berschrift1"/>
       </w:pPr>
-      <w:bookmarkStart w:id="19" w:name="_Toc88152155"/>
+      <w:bookmarkStart w:id="84" w:name="_Toc88152155"/>
       <w:r>
         <w:rPr>
           <w:rFonts w:asciiTheme="minorHAnsi" w:eastAsiaTheme="minorEastAsia" w:hAnsiTheme="minorHAnsi" w:cstheme="minorHAnsi"/>
@@ -7553,7 +8239,7 @@
         <w:lastRenderedPageBreak/>
         <w:t>Anschlussthemen</w:t>
       </w:r>
-      <w:bookmarkEnd w:id="19"/>
+      <w:bookmarkEnd w:id="84"/>
     </w:p>
     <w:p>
       <w:pPr>
@@ -7568,25 +8254,7 @@
           <w:bCs w:val="0"/>
           <w:color w:val="000000" w:themeColor="text1"/>
         </w:rPr>
-        <w:t xml:space="preserve">Dieses Modul KI-B1 - Finde die KI stellt eine gute Basis dar, um in die Grundlagen der </w:t>
-      </w:r>
-      <w:proofErr w:type="gramStart"/>
-      <w:r>
-        <w:rPr>
-          <w:rFonts w:asciiTheme="minorHAnsi" w:eastAsiaTheme="minorEastAsia" w:hAnsiTheme="minorHAnsi" w:cstheme="minorHAnsi"/>
-          <w:bCs w:val="0"/>
-          <w:color w:val="000000" w:themeColor="text1"/>
-        </w:rPr>
-        <w:t>KI  sowie</w:t>
-      </w:r>
-      <w:proofErr w:type="gramEnd"/>
-      <w:r>
-        <w:rPr>
-          <w:rFonts w:asciiTheme="minorHAnsi" w:eastAsiaTheme="minorEastAsia" w:hAnsiTheme="minorHAnsi" w:cstheme="minorHAnsi"/>
-          <w:bCs w:val="0"/>
-          <w:color w:val="000000" w:themeColor="text1"/>
-        </w:rPr>
-        <w:t xml:space="preserve"> in die weiteren IT2School KI-Module einzusteigen. Dabei gibt es verschiedene Möglichkeiten und Varianten:</w:t>
+        <w:t>Dieses Modul KI-B1 - Finde die KI stellt eine gute Basis dar, um in die Grundlagen der KI  sowie in die weiteren IT2School KI-Module einzusteigen. Dabei gibt es verschiedene Möglichkeiten und Varianten:</w:t>
       </w:r>
     </w:p>
     <w:p>
@@ -8228,14 +8896,14 @@
       <w:pPr>
         <w:pStyle w:val="berschrift1"/>
       </w:pPr>
-      <w:bookmarkStart w:id="20" w:name="_Toc88152156"/>
+      <w:bookmarkStart w:id="85" w:name="_Toc88152156"/>
       <w:r>
         <w:rPr>
           <w:rFonts w:asciiTheme="minorHAnsi" w:eastAsiaTheme="minorEastAsia" w:hAnsiTheme="minorHAnsi" w:cstheme="minorHAnsi"/>
         </w:rPr>
         <w:t>Literatur und Links</w:t>
       </w:r>
-      <w:bookmarkEnd w:id="20"/>
+      <w:bookmarkEnd w:id="85"/>
     </w:p>
     <w:p>
       <w:pPr>
@@ -8424,7 +9092,7 @@
       <w:pPr>
         <w:pStyle w:val="berschrift1"/>
       </w:pPr>
-      <w:bookmarkStart w:id="21" w:name="_Toc88152157"/>
+      <w:bookmarkStart w:id="86" w:name="_Toc88152157"/>
       <w:r>
         <w:rPr>
           <w:rFonts w:asciiTheme="minorHAnsi" w:eastAsiaTheme="minorEastAsia" w:hAnsiTheme="minorHAnsi" w:cstheme="minorHAnsi"/>
@@ -8432,7 +9100,7 @@
         <w:lastRenderedPageBreak/>
         <w:t>Arbeitsmaterialien</w:t>
       </w:r>
-      <w:bookmarkEnd w:id="21"/>
+      <w:bookmarkEnd w:id="86"/>
     </w:p>
     <w:tbl>
       <w:tblPr>
@@ -9266,7 +9934,7 @@
       <w:pPr>
         <w:spacing w:after="0" w:line="240" w:lineRule="auto"/>
       </w:pPr>
-      <w:bookmarkStart w:id="22" w:name="_Toc435548213"/>
+      <w:bookmarkStart w:id="87" w:name="_Toc435548213"/>
       <w:r>
         <w:rPr>
           <w:rFonts w:asciiTheme="minorHAnsi" w:eastAsiaTheme="minorEastAsia" w:hAnsiTheme="minorHAnsi" w:cstheme="minorHAnsi"/>
@@ -9321,7 +9989,7 @@
       <w:pPr>
         <w:spacing w:line="259" w:lineRule="auto"/>
         <w:rPr>
-          <w:rFonts w:ascii="Helvetica 65" w:hAnsi="Helvetica 65"/>
+          <w:rFonts w:ascii="helvetica 65" w:hAnsi="helvetica 65"/>
           <w:bCs w:val="0"/>
           <w:color w:val="000000"/>
           <w:sz w:val="28"/>
@@ -9341,7 +10009,7 @@
       <w:pPr>
         <w:pStyle w:val="berschrift1"/>
       </w:pPr>
-      <w:bookmarkStart w:id="23" w:name="_Toc88152158"/>
+      <w:bookmarkStart w:id="88" w:name="_Toc88152158"/>
       <w:r>
         <w:rPr>
           <w:rFonts w:asciiTheme="minorHAnsi" w:eastAsiaTheme="minorEastAsia" w:hAnsiTheme="minorHAnsi" w:cstheme="minorHAnsi"/>
@@ -9349,8 +10017,8 @@
         <w:lastRenderedPageBreak/>
         <w:t>Glossar</w:t>
       </w:r>
-      <w:bookmarkEnd w:id="22"/>
-      <w:bookmarkEnd w:id="23"/>
+      <w:bookmarkEnd w:id="87"/>
+      <w:bookmarkEnd w:id="88"/>
     </w:p>
     <w:tbl>
       <w:tblPr>
@@ -9676,17 +10344,17 @@
       <w:pPr>
         <w:pStyle w:val="berschrift1"/>
       </w:pPr>
-      <w:bookmarkStart w:id="24" w:name="_Toc24112811"/>
-      <w:bookmarkStart w:id="25" w:name="_Toc88152159"/>
+      <w:bookmarkStart w:id="89" w:name="_Toc24112811"/>
+      <w:bookmarkStart w:id="90" w:name="_Toc88152159"/>
       <w:r>
         <w:lastRenderedPageBreak/>
         <w:t>F</w:t>
       </w:r>
-      <w:bookmarkEnd w:id="24"/>
+      <w:bookmarkEnd w:id="89"/>
       <w:r>
         <w:t>ragen, Feedback, Anregungen</w:t>
       </w:r>
-      <w:bookmarkEnd w:id="25"/>
+      <w:bookmarkEnd w:id="90"/>
     </w:p>
     <w:p>
       <w:pPr>
@@ -9851,7 +10519,7 @@
 </file>
 
 <file path=word/endnotes.xml><?xml version="1.0" encoding="utf-8"?>
-<w:endnotes xmlns:wpc="http://schemas.microsoft.com/office/word/2010/wordprocessingCanvas" xmlns:cx="http://schemas.microsoft.com/office/drawing/2014/chartex" xmlns:cx1="http://schemas.microsoft.com/office/drawing/2015/9/8/chartex" xmlns:cx2="http://schemas.microsoft.com/office/drawing/2015/10/21/chartex" xmlns:cx3="http://schemas.microsoft.com/office/drawing/2016/5/9/chartex" xmlns:cx4="http://schemas.microsoft.com/office/drawing/2016/5/10/chartex" xmlns:cx5="http://schemas.microsoft.com/office/drawing/2016/5/11/chartex" xmlns:cx6="http://schemas.microsoft.com/office/drawing/2016/5/12/chartex" xmlns:cx7="http://schemas.microsoft.com/office/drawing/2016/5/13/chartex" xmlns:cx8="http://schemas.microsoft.com/office/drawing/2016/5/14/chartex" xmlns:mc="http://schemas.openxmlformats.org/markup-compatibility/2006" xmlns:aink="http://schemas.microsoft.com/office/drawing/2016/ink" xmlns:am3d="http://schemas.microsoft.com/office/drawing/2017/model3d" xmlns:o="urn:schemas-microsoft-com:office:office" xmlns:oel="http://schemas.microsoft.com/office/2019/extlst" xmlns:r="http://schemas.openxmlformats.org/officeDocument/2006/relationships" xmlns:m="http://schemas.openxmlformats.org/officeDocument/2006/math" xmlns:v="urn:schemas-microsoft-com:vml" xmlns:wp14="http://schemas.microsoft.com/office/word/2010/wordprocessingDrawing" xmlns:wp="http://schemas.openxmlformats.org/drawingml/2006/wordprocessingDrawing" xmlns:w10="urn:schemas-microsoft-com:office:word" xmlns:w="http://schemas.openxmlformats.org/wordprocessingml/2006/main" xmlns:w14="http://schemas.microsoft.com/office/word/2010/wordml" xmlns:w15="http://schemas.microsoft.com/office/word/2012/wordml" xmlns:w16cex="http://schemas.microsoft.com/office/word/2018/wordml/cex" xmlns:w16cid="http://schemas.microsoft.com/office/word/2016/wordml/cid" xmlns:w16="http://schemas.microsoft.com/office/word/2018/wordml" xmlns:w16sdtdh="http://schemas.microsoft.com/office/word/2020/wordml/sdtdatahash" xmlns:w16se="http://schemas.microsoft.com/office/word/2015/wordml/symex" xmlns:wpg="http://schemas.microsoft.com/office/word/2010/wordprocessingGroup" xmlns:wpi="http://schemas.microsoft.com/office/word/2010/wordprocessingInk" xmlns:wne="http://schemas.microsoft.com/office/word/2006/wordml" xmlns:wps="http://schemas.microsoft.com/office/word/2010/wordprocessingShape" mc:Ignorable="w14 w15 w16se w16cid w16 w16cex w16sdtdh wp14">
+<w:endnotes xmlns:wpc="http://schemas.microsoft.com/office/word/2010/wordprocessingCanvas" xmlns:cx="http://schemas.microsoft.com/office/drawing/2014/chartex" xmlns:cx1="http://schemas.microsoft.com/office/drawing/2015/9/8/chartex" xmlns:cx2="http://schemas.microsoft.com/office/drawing/2015/10/21/chartex" xmlns:cx3="http://schemas.microsoft.com/office/drawing/2016/5/9/chartex" xmlns:cx4="http://schemas.microsoft.com/office/drawing/2016/5/10/chartex" xmlns:cx5="http://schemas.microsoft.com/office/drawing/2016/5/11/chartex" xmlns:cx6="http://schemas.microsoft.com/office/drawing/2016/5/12/chartex" xmlns:cx7="http://schemas.microsoft.com/office/drawing/2016/5/13/chartex" xmlns:cx8="http://schemas.microsoft.com/office/drawing/2016/5/14/chartex" xmlns:mc="http://schemas.openxmlformats.org/markup-compatibility/2006" xmlns:aink="http://schemas.microsoft.com/office/drawing/2016/ink" xmlns:am3d="http://schemas.microsoft.com/office/drawing/2017/model3d" xmlns:o="urn:schemas-microsoft-com:office:office" xmlns:oel="http://schemas.microsoft.com/office/2019/extlst" xmlns:r="http://schemas.openxmlformats.org/officeDocument/2006/relationships" xmlns:m="http://schemas.openxmlformats.org/officeDocument/2006/math" xmlns:v="urn:schemas-microsoft-com:vml" xmlns:wp14="http://schemas.microsoft.com/office/word/2010/wordprocessingDrawing" xmlns:wp="http://schemas.openxmlformats.org/drawingml/2006/wordprocessingDrawing" xmlns:w10="urn:schemas-microsoft-com:office:word" xmlns:w="http://schemas.openxmlformats.org/wordprocessingml/2006/main" xmlns:w14="http://schemas.microsoft.com/office/word/2010/wordml" xmlns:w15="http://schemas.microsoft.com/office/word/2012/wordml" xmlns:w16cex="http://schemas.microsoft.com/office/word/2018/wordml/cex" xmlns:w16cid="http://schemas.microsoft.com/office/word/2016/wordml/cid" xmlns:w16="http://schemas.microsoft.com/office/word/2018/wordml" xmlns:w16du="http://schemas.microsoft.com/office/word/2023/wordml/word16du" xmlns:w16sdtdh="http://schemas.microsoft.com/office/word/2020/wordml/sdtdatahash" xmlns:w16se="http://schemas.microsoft.com/office/word/2015/wordml/symex" xmlns:wpg="http://schemas.microsoft.com/office/word/2010/wordprocessingGroup" xmlns:wpi="http://schemas.microsoft.com/office/word/2010/wordprocessingInk" xmlns:wne="http://schemas.microsoft.com/office/word/2006/wordml" xmlns:wps="http://schemas.microsoft.com/office/word/2010/wordprocessingShape" mc:Ignorable="w14 w15 w16se w16cid w16 w16cex w16sdtdh wp14">
   <w:endnote w:type="separator" w:id="-1">
     <w:p>
       <w:r>
@@ -9870,7 +10538,7 @@
 </file>
 
 <file path=word/footer1.xml><?xml version="1.0" encoding="utf-8"?>
-<w:ftr xmlns:wpc="http://schemas.microsoft.com/office/word/2010/wordprocessingCanvas" xmlns:cx="http://schemas.microsoft.com/office/drawing/2014/chartex" xmlns:cx1="http://schemas.microsoft.com/office/drawing/2015/9/8/chartex" xmlns:cx2="http://schemas.microsoft.com/office/drawing/2015/10/21/chartex" xmlns:cx3="http://schemas.microsoft.com/office/drawing/2016/5/9/chartex" xmlns:cx4="http://schemas.microsoft.com/office/drawing/2016/5/10/chartex" xmlns:cx5="http://schemas.microsoft.com/office/drawing/2016/5/11/chartex" xmlns:cx6="http://schemas.microsoft.com/office/drawing/2016/5/12/chartex" xmlns:cx7="http://schemas.microsoft.com/office/drawing/2016/5/13/chartex" xmlns:cx8="http://schemas.microsoft.com/office/drawing/2016/5/14/chartex" xmlns:mc="http://schemas.openxmlformats.org/markup-compatibility/2006" xmlns:aink="http://schemas.microsoft.com/office/drawing/2016/ink" xmlns:am3d="http://schemas.microsoft.com/office/drawing/2017/model3d" xmlns:o="urn:schemas-microsoft-com:office:office" xmlns:oel="http://schemas.microsoft.com/office/2019/extlst" xmlns:r="http://schemas.openxmlformats.org/officeDocument/2006/relationships" xmlns:m="http://schemas.openxmlformats.org/officeDocument/2006/math" xmlns:v="urn:schemas-microsoft-com:vml" xmlns:wp14="http://schemas.microsoft.com/office/word/2010/wordprocessingDrawing" xmlns:wp="http://schemas.openxmlformats.org/drawingml/2006/wordprocessingDrawing" xmlns:w10="urn:schemas-microsoft-com:office:word" xmlns:w="http://schemas.openxmlformats.org/wordprocessingml/2006/main" xmlns:w14="http://schemas.microsoft.com/office/word/2010/wordml" xmlns:w15="http://schemas.microsoft.com/office/word/2012/wordml" xmlns:w16cex="http://schemas.microsoft.com/office/word/2018/wordml/cex" xmlns:w16cid="http://schemas.microsoft.com/office/word/2016/wordml/cid" xmlns:w16="http://schemas.microsoft.com/office/word/2018/wordml" xmlns:w16sdtdh="http://schemas.microsoft.com/office/word/2020/wordml/sdtdatahash" xmlns:w16se="http://schemas.microsoft.com/office/word/2015/wordml/symex" xmlns:wpg="http://schemas.microsoft.com/office/word/2010/wordprocessingGroup" xmlns:wpi="http://schemas.microsoft.com/office/word/2010/wordprocessingInk" xmlns:wne="http://schemas.microsoft.com/office/word/2006/wordml" xmlns:wps="http://schemas.microsoft.com/office/word/2010/wordprocessingShape" mc:Ignorable="w14 w15 w16se w16cid w16 w16cex w16sdtdh wp14">
+<w:ftr xmlns:wpc="http://schemas.microsoft.com/office/word/2010/wordprocessingCanvas" xmlns:cx="http://schemas.microsoft.com/office/drawing/2014/chartex" xmlns:cx1="http://schemas.microsoft.com/office/drawing/2015/9/8/chartex" xmlns:cx2="http://schemas.microsoft.com/office/drawing/2015/10/21/chartex" xmlns:cx3="http://schemas.microsoft.com/office/drawing/2016/5/9/chartex" xmlns:cx4="http://schemas.microsoft.com/office/drawing/2016/5/10/chartex" xmlns:cx5="http://schemas.microsoft.com/office/drawing/2016/5/11/chartex" xmlns:cx6="http://schemas.microsoft.com/office/drawing/2016/5/12/chartex" xmlns:cx7="http://schemas.microsoft.com/office/drawing/2016/5/13/chartex" xmlns:cx8="http://schemas.microsoft.com/office/drawing/2016/5/14/chartex" xmlns:mc="http://schemas.openxmlformats.org/markup-compatibility/2006" xmlns:aink="http://schemas.microsoft.com/office/drawing/2016/ink" xmlns:am3d="http://schemas.microsoft.com/office/drawing/2017/model3d" xmlns:o="urn:schemas-microsoft-com:office:office" xmlns:oel="http://schemas.microsoft.com/office/2019/extlst" xmlns:r="http://schemas.openxmlformats.org/officeDocument/2006/relationships" xmlns:m="http://schemas.openxmlformats.org/officeDocument/2006/math" xmlns:v="urn:schemas-microsoft-com:vml" xmlns:wp14="http://schemas.microsoft.com/office/word/2010/wordprocessingDrawing" xmlns:wp="http://schemas.openxmlformats.org/drawingml/2006/wordprocessingDrawing" xmlns:w10="urn:schemas-microsoft-com:office:word" xmlns:w="http://schemas.openxmlformats.org/wordprocessingml/2006/main" xmlns:w14="http://schemas.microsoft.com/office/word/2010/wordml" xmlns:w15="http://schemas.microsoft.com/office/word/2012/wordml" xmlns:w16cex="http://schemas.microsoft.com/office/word/2018/wordml/cex" xmlns:w16cid="http://schemas.microsoft.com/office/word/2016/wordml/cid" xmlns:w16="http://schemas.microsoft.com/office/word/2018/wordml" xmlns:w16du="http://schemas.microsoft.com/office/word/2023/wordml/word16du" xmlns:w16sdtdh="http://schemas.microsoft.com/office/word/2020/wordml/sdtdatahash" xmlns:w16se="http://schemas.microsoft.com/office/word/2015/wordml/symex" xmlns:wpg="http://schemas.microsoft.com/office/word/2010/wordprocessingGroup" xmlns:wpi="http://schemas.microsoft.com/office/word/2010/wordprocessingInk" xmlns:wne="http://schemas.microsoft.com/office/word/2006/wordml" xmlns:wps="http://schemas.microsoft.com/office/word/2010/wordprocessingShape" mc:Ignorable="w14 w15 w16se w16cid w16 w16cex w16sdtdh wp14">
   <w:p>
     <w:pPr>
       <w:pStyle w:val="Kopfzeile"/>
@@ -10028,7 +10696,7 @@
                             </w:pPr>
                             <w:r>
                               <w:rPr>
-                                <w:rFonts w:ascii="Helvetica 55" w:hAnsi="Helvetica 55"/>
+                                <w:rFonts w:ascii="helvetica 55" w:hAnsi="helvetica 55"/>
                                 <w:color w:val="A6A6A6" w:themeColor="background1" w:themeShade="A6"/>
                                 <w:sz w:val="14"/>
                                 <w:szCs w:val="14"/>
@@ -10267,7 +10935,7 @@
 </file>
 
 <file path=word/footer2.xml><?xml version="1.0" encoding="utf-8"?>
-<w:ftr xmlns:wpc="http://schemas.microsoft.com/office/word/2010/wordprocessingCanvas" xmlns:cx="http://schemas.microsoft.com/office/drawing/2014/chartex" xmlns:cx1="http://schemas.microsoft.com/office/drawing/2015/9/8/chartex" xmlns:cx2="http://schemas.microsoft.com/office/drawing/2015/10/21/chartex" xmlns:cx3="http://schemas.microsoft.com/office/drawing/2016/5/9/chartex" xmlns:cx4="http://schemas.microsoft.com/office/drawing/2016/5/10/chartex" xmlns:cx5="http://schemas.microsoft.com/office/drawing/2016/5/11/chartex" xmlns:cx6="http://schemas.microsoft.com/office/drawing/2016/5/12/chartex" xmlns:cx7="http://schemas.microsoft.com/office/drawing/2016/5/13/chartex" xmlns:cx8="http://schemas.microsoft.com/office/drawing/2016/5/14/chartex" xmlns:mc="http://schemas.openxmlformats.org/markup-compatibility/2006" xmlns:aink="http://schemas.microsoft.com/office/drawing/2016/ink" xmlns:am3d="http://schemas.microsoft.com/office/drawing/2017/model3d" xmlns:o="urn:schemas-microsoft-com:office:office" xmlns:oel="http://schemas.microsoft.com/office/2019/extlst" xmlns:r="http://schemas.openxmlformats.org/officeDocument/2006/relationships" xmlns:m="http://schemas.openxmlformats.org/officeDocument/2006/math" xmlns:v="urn:schemas-microsoft-com:vml" xmlns:wp14="http://schemas.microsoft.com/office/word/2010/wordprocessingDrawing" xmlns:wp="http://schemas.openxmlformats.org/drawingml/2006/wordprocessingDrawing" xmlns:w10="urn:schemas-microsoft-com:office:word" xmlns:w="http://schemas.openxmlformats.org/wordprocessingml/2006/main" xmlns:w14="http://schemas.microsoft.com/office/word/2010/wordml" xmlns:w15="http://schemas.microsoft.com/office/word/2012/wordml" xmlns:w16cex="http://schemas.microsoft.com/office/word/2018/wordml/cex" xmlns:w16cid="http://schemas.microsoft.com/office/word/2016/wordml/cid" xmlns:w16="http://schemas.microsoft.com/office/word/2018/wordml" xmlns:w16sdtdh="http://schemas.microsoft.com/office/word/2020/wordml/sdtdatahash" xmlns:w16se="http://schemas.microsoft.com/office/word/2015/wordml/symex" xmlns:wpg="http://schemas.microsoft.com/office/word/2010/wordprocessingGroup" xmlns:wpi="http://schemas.microsoft.com/office/word/2010/wordprocessingInk" xmlns:wne="http://schemas.microsoft.com/office/word/2006/wordml" xmlns:wps="http://schemas.microsoft.com/office/word/2010/wordprocessingShape" mc:Ignorable="w14 w15 w16se w16cid w16 w16cex w16sdtdh wp14">
+<w:ftr xmlns:wpc="http://schemas.microsoft.com/office/word/2010/wordprocessingCanvas" xmlns:cx="http://schemas.microsoft.com/office/drawing/2014/chartex" xmlns:cx1="http://schemas.microsoft.com/office/drawing/2015/9/8/chartex" xmlns:cx2="http://schemas.microsoft.com/office/drawing/2015/10/21/chartex" xmlns:cx3="http://schemas.microsoft.com/office/drawing/2016/5/9/chartex" xmlns:cx4="http://schemas.microsoft.com/office/drawing/2016/5/10/chartex" xmlns:cx5="http://schemas.microsoft.com/office/drawing/2016/5/11/chartex" xmlns:cx6="http://schemas.microsoft.com/office/drawing/2016/5/12/chartex" xmlns:cx7="http://schemas.microsoft.com/office/drawing/2016/5/13/chartex" xmlns:cx8="http://schemas.microsoft.com/office/drawing/2016/5/14/chartex" xmlns:mc="http://schemas.openxmlformats.org/markup-compatibility/2006" xmlns:aink="http://schemas.microsoft.com/office/drawing/2016/ink" xmlns:am3d="http://schemas.microsoft.com/office/drawing/2017/model3d" xmlns:o="urn:schemas-microsoft-com:office:office" xmlns:oel="http://schemas.microsoft.com/office/2019/extlst" xmlns:r="http://schemas.openxmlformats.org/officeDocument/2006/relationships" xmlns:m="http://schemas.openxmlformats.org/officeDocument/2006/math" xmlns:v="urn:schemas-microsoft-com:vml" xmlns:wp14="http://schemas.microsoft.com/office/word/2010/wordprocessingDrawing" xmlns:wp="http://schemas.openxmlformats.org/drawingml/2006/wordprocessingDrawing" xmlns:w10="urn:schemas-microsoft-com:office:word" xmlns:w="http://schemas.openxmlformats.org/wordprocessingml/2006/main" xmlns:w14="http://schemas.microsoft.com/office/word/2010/wordml" xmlns:w15="http://schemas.microsoft.com/office/word/2012/wordml" xmlns:w16cex="http://schemas.microsoft.com/office/word/2018/wordml/cex" xmlns:w16cid="http://schemas.microsoft.com/office/word/2016/wordml/cid" xmlns:w16="http://schemas.microsoft.com/office/word/2018/wordml" xmlns:w16du="http://schemas.microsoft.com/office/word/2023/wordml/word16du" xmlns:w16sdtdh="http://schemas.microsoft.com/office/word/2020/wordml/sdtdatahash" xmlns:w16se="http://schemas.microsoft.com/office/word/2015/wordml/symex" xmlns:wpg="http://schemas.microsoft.com/office/word/2010/wordprocessingGroup" xmlns:wpi="http://schemas.microsoft.com/office/word/2010/wordprocessingInk" xmlns:wne="http://schemas.microsoft.com/office/word/2006/wordml" xmlns:wps="http://schemas.microsoft.com/office/word/2010/wordprocessingShape" mc:Ignorable="w14 w15 w16se w16cid w16 w16cex w16sdtdh wp14">
   <w:p>
     <w:pPr>
       <w:pStyle w:val="Fuzeile"/>
@@ -10281,8 +10949,8 @@
         <w:szCs w:val="18"/>
       </w:rPr>
     </w:pPr>
-    <w:bookmarkStart w:id="11" w:name="_Hlk58245454"/>
-    <w:bookmarkStart w:id="12" w:name="_Hlk58245455"/>
+    <w:bookmarkStart w:id="76" w:name="_Hlk58245454"/>
+    <w:bookmarkStart w:id="77" w:name="_Hlk58245455"/>
     <w:r>
       <w:rPr>
         <w:noProof/>
@@ -10623,8 +11291,8 @@
       <w:tab/>
       <w:t xml:space="preserve">         </w:t>
     </w:r>
-    <w:bookmarkEnd w:id="11"/>
-    <w:bookmarkEnd w:id="12"/>
+    <w:bookmarkEnd w:id="76"/>
+    <w:bookmarkEnd w:id="77"/>
   </w:p>
   <w:p>
     <w:pPr>
@@ -10723,7 +11391,7 @@
 </file>
 
 <file path=word/footer3.xml><?xml version="1.0" encoding="utf-8"?>
-<w:ftr xmlns:wpc="http://schemas.microsoft.com/office/word/2010/wordprocessingCanvas" xmlns:cx="http://schemas.microsoft.com/office/drawing/2014/chartex" xmlns:cx1="http://schemas.microsoft.com/office/drawing/2015/9/8/chartex" xmlns:cx2="http://schemas.microsoft.com/office/drawing/2015/10/21/chartex" xmlns:cx3="http://schemas.microsoft.com/office/drawing/2016/5/9/chartex" xmlns:cx4="http://schemas.microsoft.com/office/drawing/2016/5/10/chartex" xmlns:cx5="http://schemas.microsoft.com/office/drawing/2016/5/11/chartex" xmlns:cx6="http://schemas.microsoft.com/office/drawing/2016/5/12/chartex" xmlns:cx7="http://schemas.microsoft.com/office/drawing/2016/5/13/chartex" xmlns:cx8="http://schemas.microsoft.com/office/drawing/2016/5/14/chartex" xmlns:mc="http://schemas.openxmlformats.org/markup-compatibility/2006" xmlns:aink="http://schemas.microsoft.com/office/drawing/2016/ink" xmlns:am3d="http://schemas.microsoft.com/office/drawing/2017/model3d" xmlns:o="urn:schemas-microsoft-com:office:office" xmlns:oel="http://schemas.microsoft.com/office/2019/extlst" xmlns:r="http://schemas.openxmlformats.org/officeDocument/2006/relationships" xmlns:m="http://schemas.openxmlformats.org/officeDocument/2006/math" xmlns:v="urn:schemas-microsoft-com:vml" xmlns:wp14="http://schemas.microsoft.com/office/word/2010/wordprocessingDrawing" xmlns:wp="http://schemas.openxmlformats.org/drawingml/2006/wordprocessingDrawing" xmlns:w10="urn:schemas-microsoft-com:office:word" xmlns:w="http://schemas.openxmlformats.org/wordprocessingml/2006/main" xmlns:w14="http://schemas.microsoft.com/office/word/2010/wordml" xmlns:w15="http://schemas.microsoft.com/office/word/2012/wordml" xmlns:w16cex="http://schemas.microsoft.com/office/word/2018/wordml/cex" xmlns:w16cid="http://schemas.microsoft.com/office/word/2016/wordml/cid" xmlns:w16="http://schemas.microsoft.com/office/word/2018/wordml" xmlns:w16sdtdh="http://schemas.microsoft.com/office/word/2020/wordml/sdtdatahash" xmlns:w16se="http://schemas.microsoft.com/office/word/2015/wordml/symex" xmlns:wpg="http://schemas.microsoft.com/office/word/2010/wordprocessingGroup" xmlns:wpi="http://schemas.microsoft.com/office/word/2010/wordprocessingInk" xmlns:wne="http://schemas.microsoft.com/office/word/2006/wordml" xmlns:wps="http://schemas.microsoft.com/office/word/2010/wordprocessingShape" mc:Ignorable="w14 w15 w16se w16cid w16 w16cex w16sdtdh wp14">
+<w:ftr xmlns:wpc="http://schemas.microsoft.com/office/word/2010/wordprocessingCanvas" xmlns:cx="http://schemas.microsoft.com/office/drawing/2014/chartex" xmlns:cx1="http://schemas.microsoft.com/office/drawing/2015/9/8/chartex" xmlns:cx2="http://schemas.microsoft.com/office/drawing/2015/10/21/chartex" xmlns:cx3="http://schemas.microsoft.com/office/drawing/2016/5/9/chartex" xmlns:cx4="http://schemas.microsoft.com/office/drawing/2016/5/10/chartex" xmlns:cx5="http://schemas.microsoft.com/office/drawing/2016/5/11/chartex" xmlns:cx6="http://schemas.microsoft.com/office/drawing/2016/5/12/chartex" xmlns:cx7="http://schemas.microsoft.com/office/drawing/2016/5/13/chartex" xmlns:cx8="http://schemas.microsoft.com/office/drawing/2016/5/14/chartex" xmlns:mc="http://schemas.openxmlformats.org/markup-compatibility/2006" xmlns:aink="http://schemas.microsoft.com/office/drawing/2016/ink" xmlns:am3d="http://schemas.microsoft.com/office/drawing/2017/model3d" xmlns:o="urn:schemas-microsoft-com:office:office" xmlns:oel="http://schemas.microsoft.com/office/2019/extlst" xmlns:r="http://schemas.openxmlformats.org/officeDocument/2006/relationships" xmlns:m="http://schemas.openxmlformats.org/officeDocument/2006/math" xmlns:v="urn:schemas-microsoft-com:vml" xmlns:wp14="http://schemas.microsoft.com/office/word/2010/wordprocessingDrawing" xmlns:wp="http://schemas.openxmlformats.org/drawingml/2006/wordprocessingDrawing" xmlns:w10="urn:schemas-microsoft-com:office:word" xmlns:w="http://schemas.openxmlformats.org/wordprocessingml/2006/main" xmlns:w14="http://schemas.microsoft.com/office/word/2010/wordml" xmlns:w15="http://schemas.microsoft.com/office/word/2012/wordml" xmlns:w16cex="http://schemas.microsoft.com/office/word/2018/wordml/cex" xmlns:w16cid="http://schemas.microsoft.com/office/word/2016/wordml/cid" xmlns:w16="http://schemas.microsoft.com/office/word/2018/wordml" xmlns:w16du="http://schemas.microsoft.com/office/word/2023/wordml/word16du" xmlns:w16sdtdh="http://schemas.microsoft.com/office/word/2020/wordml/sdtdatahash" xmlns:w16se="http://schemas.microsoft.com/office/word/2015/wordml/symex" xmlns:wpg="http://schemas.microsoft.com/office/word/2010/wordprocessingGroup" xmlns:wpi="http://schemas.microsoft.com/office/word/2010/wordprocessingInk" xmlns:wne="http://schemas.microsoft.com/office/word/2006/wordml" xmlns:wps="http://schemas.microsoft.com/office/word/2010/wordprocessingShape" mc:Ignorable="w14 w15 w16se w16cid w16 w16cex w16sdtdh wp14">
   <w:p>
     <w:pPr>
       <w:pStyle w:val="Kopfzeile"/>
@@ -10860,7 +11528,7 @@
         <w:noProof/>
         <w:sz w:val="18"/>
       </w:rPr>
-      <w:t>14.01.23</w:t>
+      <w:t>06.06.23</w:t>
     </w:r>
     <w:r>
       <w:rPr>
@@ -10955,7 +11623,7 @@
 </file>
 
 <file path=word/footer4.xml><?xml version="1.0" encoding="utf-8"?>
-<w:ftr xmlns:wpc="http://schemas.microsoft.com/office/word/2010/wordprocessingCanvas" xmlns:cx="http://schemas.microsoft.com/office/drawing/2014/chartex" xmlns:cx1="http://schemas.microsoft.com/office/drawing/2015/9/8/chartex" xmlns:cx2="http://schemas.microsoft.com/office/drawing/2015/10/21/chartex" xmlns:cx3="http://schemas.microsoft.com/office/drawing/2016/5/9/chartex" xmlns:cx4="http://schemas.microsoft.com/office/drawing/2016/5/10/chartex" xmlns:cx5="http://schemas.microsoft.com/office/drawing/2016/5/11/chartex" xmlns:cx6="http://schemas.microsoft.com/office/drawing/2016/5/12/chartex" xmlns:cx7="http://schemas.microsoft.com/office/drawing/2016/5/13/chartex" xmlns:cx8="http://schemas.microsoft.com/office/drawing/2016/5/14/chartex" xmlns:mc="http://schemas.openxmlformats.org/markup-compatibility/2006" xmlns:aink="http://schemas.microsoft.com/office/drawing/2016/ink" xmlns:am3d="http://schemas.microsoft.com/office/drawing/2017/model3d" xmlns:o="urn:schemas-microsoft-com:office:office" xmlns:oel="http://schemas.microsoft.com/office/2019/extlst" xmlns:r="http://schemas.openxmlformats.org/officeDocument/2006/relationships" xmlns:m="http://schemas.openxmlformats.org/officeDocument/2006/math" xmlns:v="urn:schemas-microsoft-com:vml" xmlns:wp14="http://schemas.microsoft.com/office/word/2010/wordprocessingDrawing" xmlns:wp="http://schemas.openxmlformats.org/drawingml/2006/wordprocessingDrawing" xmlns:w10="urn:schemas-microsoft-com:office:word" xmlns:w="http://schemas.openxmlformats.org/wordprocessingml/2006/main" xmlns:w14="http://schemas.microsoft.com/office/word/2010/wordml" xmlns:w15="http://schemas.microsoft.com/office/word/2012/wordml" xmlns:w16cex="http://schemas.microsoft.com/office/word/2018/wordml/cex" xmlns:w16cid="http://schemas.microsoft.com/office/word/2016/wordml/cid" xmlns:w16="http://schemas.microsoft.com/office/word/2018/wordml" xmlns:w16sdtdh="http://schemas.microsoft.com/office/word/2020/wordml/sdtdatahash" xmlns:w16se="http://schemas.microsoft.com/office/word/2015/wordml/symex" xmlns:wpg="http://schemas.microsoft.com/office/word/2010/wordprocessingGroup" xmlns:wpi="http://schemas.microsoft.com/office/word/2010/wordprocessingInk" xmlns:wne="http://schemas.microsoft.com/office/word/2006/wordml" xmlns:wps="http://schemas.microsoft.com/office/word/2010/wordprocessingShape" mc:Ignorable="w14 w15 w16se w16cid w16 w16cex w16sdtdh wp14">
+<w:ftr xmlns:wpc="http://schemas.microsoft.com/office/word/2010/wordprocessingCanvas" xmlns:cx="http://schemas.microsoft.com/office/drawing/2014/chartex" xmlns:cx1="http://schemas.microsoft.com/office/drawing/2015/9/8/chartex" xmlns:cx2="http://schemas.microsoft.com/office/drawing/2015/10/21/chartex" xmlns:cx3="http://schemas.microsoft.com/office/drawing/2016/5/9/chartex" xmlns:cx4="http://schemas.microsoft.com/office/drawing/2016/5/10/chartex" xmlns:cx5="http://schemas.microsoft.com/office/drawing/2016/5/11/chartex" xmlns:cx6="http://schemas.microsoft.com/office/drawing/2016/5/12/chartex" xmlns:cx7="http://schemas.microsoft.com/office/drawing/2016/5/13/chartex" xmlns:cx8="http://schemas.microsoft.com/office/drawing/2016/5/14/chartex" xmlns:mc="http://schemas.openxmlformats.org/markup-compatibility/2006" xmlns:aink="http://schemas.microsoft.com/office/drawing/2016/ink" xmlns:am3d="http://schemas.microsoft.com/office/drawing/2017/model3d" xmlns:o="urn:schemas-microsoft-com:office:office" xmlns:oel="http://schemas.microsoft.com/office/2019/extlst" xmlns:r="http://schemas.openxmlformats.org/officeDocument/2006/relationships" xmlns:m="http://schemas.openxmlformats.org/officeDocument/2006/math" xmlns:v="urn:schemas-microsoft-com:vml" xmlns:wp14="http://schemas.microsoft.com/office/word/2010/wordprocessingDrawing" xmlns:wp="http://schemas.openxmlformats.org/drawingml/2006/wordprocessingDrawing" xmlns:w10="urn:schemas-microsoft-com:office:word" xmlns:w="http://schemas.openxmlformats.org/wordprocessingml/2006/main" xmlns:w14="http://schemas.microsoft.com/office/word/2010/wordml" xmlns:w15="http://schemas.microsoft.com/office/word/2012/wordml" xmlns:w16cex="http://schemas.microsoft.com/office/word/2018/wordml/cex" xmlns:w16cid="http://schemas.microsoft.com/office/word/2016/wordml/cid" xmlns:w16="http://schemas.microsoft.com/office/word/2018/wordml" xmlns:w16du="http://schemas.microsoft.com/office/word/2023/wordml/word16du" xmlns:w16sdtdh="http://schemas.microsoft.com/office/word/2020/wordml/sdtdatahash" xmlns:w16se="http://schemas.microsoft.com/office/word/2015/wordml/symex" xmlns:wpg="http://schemas.microsoft.com/office/word/2010/wordprocessingGroup" xmlns:wpi="http://schemas.microsoft.com/office/word/2010/wordprocessingInk" xmlns:wne="http://schemas.microsoft.com/office/word/2006/wordml" xmlns:wps="http://schemas.microsoft.com/office/word/2010/wordprocessingShape" mc:Ignorable="w14 w15 w16se w16cid w16 w16cex w16sdtdh wp14">
   <w:p>
     <w:pPr>
       <w:pStyle w:val="Fuzeile"/>
@@ -10989,7 +11657,7 @@
 </file>
 
 <file path=word/footer5.xml><?xml version="1.0" encoding="utf-8"?>
-<w:ftr xmlns:wpc="http://schemas.microsoft.com/office/word/2010/wordprocessingCanvas" xmlns:cx="http://schemas.microsoft.com/office/drawing/2014/chartex" xmlns:cx1="http://schemas.microsoft.com/office/drawing/2015/9/8/chartex" xmlns:cx2="http://schemas.microsoft.com/office/drawing/2015/10/21/chartex" xmlns:cx3="http://schemas.microsoft.com/office/drawing/2016/5/9/chartex" xmlns:cx4="http://schemas.microsoft.com/office/drawing/2016/5/10/chartex" xmlns:cx5="http://schemas.microsoft.com/office/drawing/2016/5/11/chartex" xmlns:cx6="http://schemas.microsoft.com/office/drawing/2016/5/12/chartex" xmlns:cx7="http://schemas.microsoft.com/office/drawing/2016/5/13/chartex" xmlns:cx8="http://schemas.microsoft.com/office/drawing/2016/5/14/chartex" xmlns:mc="http://schemas.openxmlformats.org/markup-compatibility/2006" xmlns:aink="http://schemas.microsoft.com/office/drawing/2016/ink" xmlns:am3d="http://schemas.microsoft.com/office/drawing/2017/model3d" xmlns:o="urn:schemas-microsoft-com:office:office" xmlns:oel="http://schemas.microsoft.com/office/2019/extlst" xmlns:r="http://schemas.openxmlformats.org/officeDocument/2006/relationships" xmlns:m="http://schemas.openxmlformats.org/officeDocument/2006/math" xmlns:v="urn:schemas-microsoft-com:vml" xmlns:wp14="http://schemas.microsoft.com/office/word/2010/wordprocessingDrawing" xmlns:wp="http://schemas.openxmlformats.org/drawingml/2006/wordprocessingDrawing" xmlns:w10="urn:schemas-microsoft-com:office:word" xmlns:w="http://schemas.openxmlformats.org/wordprocessingml/2006/main" xmlns:w14="http://schemas.microsoft.com/office/word/2010/wordml" xmlns:w15="http://schemas.microsoft.com/office/word/2012/wordml" xmlns:w16cex="http://schemas.microsoft.com/office/word/2018/wordml/cex" xmlns:w16cid="http://schemas.microsoft.com/office/word/2016/wordml/cid" xmlns:w16="http://schemas.microsoft.com/office/word/2018/wordml" xmlns:w16sdtdh="http://schemas.microsoft.com/office/word/2020/wordml/sdtdatahash" xmlns:w16se="http://schemas.microsoft.com/office/word/2015/wordml/symex" xmlns:wpg="http://schemas.microsoft.com/office/word/2010/wordprocessingGroup" xmlns:wpi="http://schemas.microsoft.com/office/word/2010/wordprocessingInk" xmlns:wne="http://schemas.microsoft.com/office/word/2006/wordml" xmlns:wps="http://schemas.microsoft.com/office/word/2010/wordprocessingShape" mc:Ignorable="w14 w15 w16se w16cid w16 w16cex w16sdtdh wp14">
+<w:ftr xmlns:wpc="http://schemas.microsoft.com/office/word/2010/wordprocessingCanvas" xmlns:cx="http://schemas.microsoft.com/office/drawing/2014/chartex" xmlns:cx1="http://schemas.microsoft.com/office/drawing/2015/9/8/chartex" xmlns:cx2="http://schemas.microsoft.com/office/drawing/2015/10/21/chartex" xmlns:cx3="http://schemas.microsoft.com/office/drawing/2016/5/9/chartex" xmlns:cx4="http://schemas.microsoft.com/office/drawing/2016/5/10/chartex" xmlns:cx5="http://schemas.microsoft.com/office/drawing/2016/5/11/chartex" xmlns:cx6="http://schemas.microsoft.com/office/drawing/2016/5/12/chartex" xmlns:cx7="http://schemas.microsoft.com/office/drawing/2016/5/13/chartex" xmlns:cx8="http://schemas.microsoft.com/office/drawing/2016/5/14/chartex" xmlns:mc="http://schemas.openxmlformats.org/markup-compatibility/2006" xmlns:aink="http://schemas.microsoft.com/office/drawing/2016/ink" xmlns:am3d="http://schemas.microsoft.com/office/drawing/2017/model3d" xmlns:o="urn:schemas-microsoft-com:office:office" xmlns:oel="http://schemas.microsoft.com/office/2019/extlst" xmlns:r="http://schemas.openxmlformats.org/officeDocument/2006/relationships" xmlns:m="http://schemas.openxmlformats.org/officeDocument/2006/math" xmlns:v="urn:schemas-microsoft-com:vml" xmlns:wp14="http://schemas.microsoft.com/office/word/2010/wordprocessingDrawing" xmlns:wp="http://schemas.openxmlformats.org/drawingml/2006/wordprocessingDrawing" xmlns:w10="urn:schemas-microsoft-com:office:word" xmlns:w="http://schemas.openxmlformats.org/wordprocessingml/2006/main" xmlns:w14="http://schemas.microsoft.com/office/word/2010/wordml" xmlns:w15="http://schemas.microsoft.com/office/word/2012/wordml" xmlns:w16cex="http://schemas.microsoft.com/office/word/2018/wordml/cex" xmlns:w16cid="http://schemas.microsoft.com/office/word/2016/wordml/cid" xmlns:w16="http://schemas.microsoft.com/office/word/2018/wordml" xmlns:w16du="http://schemas.microsoft.com/office/word/2023/wordml/word16du" xmlns:w16sdtdh="http://schemas.microsoft.com/office/word/2020/wordml/sdtdatahash" xmlns:w16se="http://schemas.microsoft.com/office/word/2015/wordml/symex" xmlns:wpg="http://schemas.microsoft.com/office/word/2010/wordprocessingGroup" xmlns:wpi="http://schemas.microsoft.com/office/word/2010/wordprocessingInk" xmlns:wne="http://schemas.microsoft.com/office/word/2006/wordml" xmlns:wps="http://schemas.microsoft.com/office/word/2010/wordprocessingShape" mc:Ignorable="w14 w15 w16se w16cid w16 w16cex w16sdtdh wp14">
   <w:p>
     <w:pPr>
       <w:pStyle w:val="Kopfzeile"/>
@@ -11146,7 +11814,7 @@
                             </w:pPr>
                             <w:r>
                               <w:rPr>
-                                <w:rFonts w:ascii="Helvetica 55" w:hAnsi="Helvetica 55"/>
+                                <w:rFonts w:ascii="helvetica 55" w:hAnsi="helvetica 55"/>
                                 <w:color w:val="A6A6A6" w:themeColor="background1" w:themeShade="A6"/>
                                 <w:sz w:val="14"/>
                                 <w:szCs w:val="14"/>
@@ -11158,7 +11826,7 @@
                             <w:pPr>
                               <w:spacing w:line="160" w:lineRule="exact"/>
                               <w:rPr>
-                                <w:rFonts w:ascii="Helvetica 55" w:hAnsi="Helvetica 55"/>
+                                <w:rFonts w:ascii="helvetica 55" w:hAnsi="helvetica 55"/>
                                 <w:color w:val="A6A6A6"/>
                                 <w:sz w:val="14"/>
                                 <w:szCs w:val="14"/>
@@ -11355,7 +12023,7 @@
         <w:noProof/>
         <w:sz w:val="18"/>
       </w:rPr>
-      <w:t>14.01.23</w:t>
+      <w:t>06.06.23</w:t>
     </w:r>
     <w:r>
       <w:rPr>
@@ -11450,7 +12118,7 @@
 </file>
 
 <file path=word/footnotes.xml><?xml version="1.0" encoding="utf-8"?>
-<w:footnotes xmlns:wpc="http://schemas.microsoft.com/office/word/2010/wordprocessingCanvas" xmlns:cx="http://schemas.microsoft.com/office/drawing/2014/chartex" xmlns:cx1="http://schemas.microsoft.com/office/drawing/2015/9/8/chartex" xmlns:cx2="http://schemas.microsoft.com/office/drawing/2015/10/21/chartex" xmlns:cx3="http://schemas.microsoft.com/office/drawing/2016/5/9/chartex" xmlns:cx4="http://schemas.microsoft.com/office/drawing/2016/5/10/chartex" xmlns:cx5="http://schemas.microsoft.com/office/drawing/2016/5/11/chartex" xmlns:cx6="http://schemas.microsoft.com/office/drawing/2016/5/12/chartex" xmlns:cx7="http://schemas.microsoft.com/office/drawing/2016/5/13/chartex" xmlns:cx8="http://schemas.microsoft.com/office/drawing/2016/5/14/chartex" xmlns:mc="http://schemas.openxmlformats.org/markup-compatibility/2006" xmlns:aink="http://schemas.microsoft.com/office/drawing/2016/ink" xmlns:am3d="http://schemas.microsoft.com/office/drawing/2017/model3d" xmlns:o="urn:schemas-microsoft-com:office:office" xmlns:oel="http://schemas.microsoft.com/office/2019/extlst" xmlns:r="http://schemas.openxmlformats.org/officeDocument/2006/relationships" xmlns:m="http://schemas.openxmlformats.org/officeDocument/2006/math" xmlns:v="urn:schemas-microsoft-com:vml" xmlns:wp14="http://schemas.microsoft.com/office/word/2010/wordprocessingDrawing" xmlns:wp="http://schemas.openxmlformats.org/drawingml/2006/wordprocessingDrawing" xmlns:w10="urn:schemas-microsoft-com:office:word" xmlns:w="http://schemas.openxmlformats.org/wordprocessingml/2006/main" xmlns:w14="http://schemas.microsoft.com/office/word/2010/wordml" xmlns:w15="http://schemas.microsoft.com/office/word/2012/wordml" xmlns:w16cex="http://schemas.microsoft.com/office/word/2018/wordml/cex" xmlns:w16cid="http://schemas.microsoft.com/office/word/2016/wordml/cid" xmlns:w16="http://schemas.microsoft.com/office/word/2018/wordml" xmlns:w16sdtdh="http://schemas.microsoft.com/office/word/2020/wordml/sdtdatahash" xmlns:w16se="http://schemas.microsoft.com/office/word/2015/wordml/symex" xmlns:wpg="http://schemas.microsoft.com/office/word/2010/wordprocessingGroup" xmlns:wpi="http://schemas.microsoft.com/office/word/2010/wordprocessingInk" xmlns:wne="http://schemas.microsoft.com/office/word/2006/wordml" xmlns:wps="http://schemas.microsoft.com/office/word/2010/wordprocessingShape" mc:Ignorable="w14 w15 w16se w16cid w16 w16cex w16sdtdh wp14">
+<w:footnotes xmlns:wpc="http://schemas.microsoft.com/office/word/2010/wordprocessingCanvas" xmlns:cx="http://schemas.microsoft.com/office/drawing/2014/chartex" xmlns:cx1="http://schemas.microsoft.com/office/drawing/2015/9/8/chartex" xmlns:cx2="http://schemas.microsoft.com/office/drawing/2015/10/21/chartex" xmlns:cx3="http://schemas.microsoft.com/office/drawing/2016/5/9/chartex" xmlns:cx4="http://schemas.microsoft.com/office/drawing/2016/5/10/chartex" xmlns:cx5="http://schemas.microsoft.com/office/drawing/2016/5/11/chartex" xmlns:cx6="http://schemas.microsoft.com/office/drawing/2016/5/12/chartex" xmlns:cx7="http://schemas.microsoft.com/office/drawing/2016/5/13/chartex" xmlns:cx8="http://schemas.microsoft.com/office/drawing/2016/5/14/chartex" xmlns:mc="http://schemas.openxmlformats.org/markup-compatibility/2006" xmlns:aink="http://schemas.microsoft.com/office/drawing/2016/ink" xmlns:am3d="http://schemas.microsoft.com/office/drawing/2017/model3d" xmlns:o="urn:schemas-microsoft-com:office:office" xmlns:oel="http://schemas.microsoft.com/office/2019/extlst" xmlns:r="http://schemas.openxmlformats.org/officeDocument/2006/relationships" xmlns:m="http://schemas.openxmlformats.org/officeDocument/2006/math" xmlns:v="urn:schemas-microsoft-com:vml" xmlns:wp14="http://schemas.microsoft.com/office/word/2010/wordprocessingDrawing" xmlns:wp="http://schemas.openxmlformats.org/drawingml/2006/wordprocessingDrawing" xmlns:w10="urn:schemas-microsoft-com:office:word" xmlns:w="http://schemas.openxmlformats.org/wordprocessingml/2006/main" xmlns:w14="http://schemas.microsoft.com/office/word/2010/wordml" xmlns:w15="http://schemas.microsoft.com/office/word/2012/wordml" xmlns:w16cex="http://schemas.microsoft.com/office/word/2018/wordml/cex" xmlns:w16cid="http://schemas.microsoft.com/office/word/2016/wordml/cid" xmlns:w16="http://schemas.microsoft.com/office/word/2018/wordml" xmlns:w16du="http://schemas.microsoft.com/office/word/2023/wordml/word16du" xmlns:w16sdtdh="http://schemas.microsoft.com/office/word/2020/wordml/sdtdatahash" xmlns:w16se="http://schemas.microsoft.com/office/word/2015/wordml/symex" xmlns:wpg="http://schemas.microsoft.com/office/word/2010/wordprocessingGroup" xmlns:wpi="http://schemas.microsoft.com/office/word/2010/wordprocessingInk" xmlns:wne="http://schemas.microsoft.com/office/word/2006/wordml" xmlns:wps="http://schemas.microsoft.com/office/word/2010/wordprocessingShape" mc:Ignorable="w14 w15 w16se w16cid w16 w16cex w16sdtdh wp14">
   <w:footnote w:type="separator" w:id="-1">
     <w:p>
       <w:r>
@@ -11527,9 +12195,9 @@
 </file>
 
 <file path=word/header1.xml><?xml version="1.0" encoding="utf-8"?>
-<w:hdr xmlns:wpc="http://schemas.microsoft.com/office/word/2010/wordprocessingCanvas" xmlns:cx="http://schemas.microsoft.com/office/drawing/2014/chartex" xmlns:cx1="http://schemas.microsoft.com/office/drawing/2015/9/8/chartex" xmlns:cx2="http://schemas.microsoft.com/office/drawing/2015/10/21/chartex" xmlns:cx3="http://schemas.microsoft.com/office/drawing/2016/5/9/chartex" xmlns:cx4="http://schemas.microsoft.com/office/drawing/2016/5/10/chartex" xmlns:cx5="http://schemas.microsoft.com/office/drawing/2016/5/11/chartex" xmlns:cx6="http://schemas.microsoft.com/office/drawing/2016/5/12/chartex" xmlns:cx7="http://schemas.microsoft.com/office/drawing/2016/5/13/chartex" xmlns:cx8="http://schemas.microsoft.com/office/drawing/2016/5/14/chartex" xmlns:mc="http://schemas.openxmlformats.org/markup-compatibility/2006" xmlns:aink="http://schemas.microsoft.com/office/drawing/2016/ink" xmlns:am3d="http://schemas.microsoft.com/office/drawing/2017/model3d" xmlns:o="urn:schemas-microsoft-com:office:office" xmlns:oel="http://schemas.microsoft.com/office/2019/extlst" xmlns:r="http://schemas.openxmlformats.org/officeDocument/2006/relationships" xmlns:m="http://schemas.openxmlformats.org/officeDocument/2006/math" xmlns:v="urn:schemas-microsoft-com:vml" xmlns:wp14="http://schemas.microsoft.com/office/word/2010/wordprocessingDrawing" xmlns:wp="http://schemas.openxmlformats.org/drawingml/2006/wordprocessingDrawing" xmlns:w10="urn:schemas-microsoft-com:office:word" xmlns:w="http://schemas.openxmlformats.org/wordprocessingml/2006/main" xmlns:w14="http://schemas.microsoft.com/office/word/2010/wordml" xmlns:w15="http://schemas.microsoft.com/office/word/2012/wordml" xmlns:w16cex="http://schemas.microsoft.com/office/word/2018/wordml/cex" xmlns:w16cid="http://schemas.microsoft.com/office/word/2016/wordml/cid" xmlns:w16="http://schemas.microsoft.com/office/word/2018/wordml" xmlns:w16sdtdh="http://schemas.microsoft.com/office/word/2020/wordml/sdtdatahash" xmlns:w16se="http://schemas.microsoft.com/office/word/2015/wordml/symex" xmlns:wpg="http://schemas.microsoft.com/office/word/2010/wordprocessingGroup" xmlns:wpi="http://schemas.microsoft.com/office/word/2010/wordprocessingInk" xmlns:wne="http://schemas.microsoft.com/office/word/2006/wordml" xmlns:wps="http://schemas.microsoft.com/office/word/2010/wordprocessingShape" mc:Ignorable="w14 w15 w16se w16cid w16 w16cex w16sdtdh wp14">
-  <w:bookmarkStart w:id="9" w:name="_Hlk58245611"/>
-  <w:bookmarkStart w:id="10" w:name="_Hlk58245612"/>
+<w:hdr xmlns:wpc="http://schemas.microsoft.com/office/word/2010/wordprocessingCanvas" xmlns:cx="http://schemas.microsoft.com/office/drawing/2014/chartex" xmlns:cx1="http://schemas.microsoft.com/office/drawing/2015/9/8/chartex" xmlns:cx2="http://schemas.microsoft.com/office/drawing/2015/10/21/chartex" xmlns:cx3="http://schemas.microsoft.com/office/drawing/2016/5/9/chartex" xmlns:cx4="http://schemas.microsoft.com/office/drawing/2016/5/10/chartex" xmlns:cx5="http://schemas.microsoft.com/office/drawing/2016/5/11/chartex" xmlns:cx6="http://schemas.microsoft.com/office/drawing/2016/5/12/chartex" xmlns:cx7="http://schemas.microsoft.com/office/drawing/2016/5/13/chartex" xmlns:cx8="http://schemas.microsoft.com/office/drawing/2016/5/14/chartex" xmlns:mc="http://schemas.openxmlformats.org/markup-compatibility/2006" xmlns:aink="http://schemas.microsoft.com/office/drawing/2016/ink" xmlns:am3d="http://schemas.microsoft.com/office/drawing/2017/model3d" xmlns:o="urn:schemas-microsoft-com:office:office" xmlns:oel="http://schemas.microsoft.com/office/2019/extlst" xmlns:r="http://schemas.openxmlformats.org/officeDocument/2006/relationships" xmlns:m="http://schemas.openxmlformats.org/officeDocument/2006/math" xmlns:v="urn:schemas-microsoft-com:vml" xmlns:wp14="http://schemas.microsoft.com/office/word/2010/wordprocessingDrawing" xmlns:wp="http://schemas.openxmlformats.org/drawingml/2006/wordprocessingDrawing" xmlns:w10="urn:schemas-microsoft-com:office:word" xmlns:w="http://schemas.openxmlformats.org/wordprocessingml/2006/main" xmlns:w14="http://schemas.microsoft.com/office/word/2010/wordml" xmlns:w15="http://schemas.microsoft.com/office/word/2012/wordml" xmlns:w16cex="http://schemas.microsoft.com/office/word/2018/wordml/cex" xmlns:w16cid="http://schemas.microsoft.com/office/word/2016/wordml/cid" xmlns:w16="http://schemas.microsoft.com/office/word/2018/wordml" xmlns:w16du="http://schemas.microsoft.com/office/word/2023/wordml/word16du" xmlns:w16sdtdh="http://schemas.microsoft.com/office/word/2020/wordml/sdtdatahash" xmlns:w16se="http://schemas.microsoft.com/office/word/2015/wordml/symex" xmlns:wpg="http://schemas.microsoft.com/office/word/2010/wordprocessingGroup" xmlns:wpi="http://schemas.microsoft.com/office/word/2010/wordprocessingInk" xmlns:wne="http://schemas.microsoft.com/office/word/2006/wordml" xmlns:wps="http://schemas.microsoft.com/office/word/2010/wordprocessingShape" mc:Ignorable="w14 w15 w16se w16cid w16 w16cex w16sdtdh wp14">
+  <w:bookmarkStart w:id="74" w:name="_Hlk58245611"/>
+  <w:bookmarkStart w:id="75" w:name="_Hlk58245612"/>
   <w:p>
     <w:pPr>
       <w:pStyle w:val="Kopfzeile"/>
@@ -11665,8 +12333,8 @@
       </w:rPr>
       <w:tab/>
     </w:r>
-    <w:bookmarkEnd w:id="9"/>
-    <w:bookmarkEnd w:id="10"/>
+    <w:bookmarkEnd w:id="74"/>
+    <w:bookmarkEnd w:id="75"/>
   </w:p>
   <w:p>
     <w:pPr>
@@ -11764,7 +12432,7 @@
 </file>
 
 <file path=word/header2.xml><?xml version="1.0" encoding="utf-8"?>
-<w:hdr xmlns:wpc="http://schemas.microsoft.com/office/word/2010/wordprocessingCanvas" xmlns:cx="http://schemas.microsoft.com/office/drawing/2014/chartex" xmlns:cx1="http://schemas.microsoft.com/office/drawing/2015/9/8/chartex" xmlns:cx2="http://schemas.microsoft.com/office/drawing/2015/10/21/chartex" xmlns:cx3="http://schemas.microsoft.com/office/drawing/2016/5/9/chartex" xmlns:cx4="http://schemas.microsoft.com/office/drawing/2016/5/10/chartex" xmlns:cx5="http://schemas.microsoft.com/office/drawing/2016/5/11/chartex" xmlns:cx6="http://schemas.microsoft.com/office/drawing/2016/5/12/chartex" xmlns:cx7="http://schemas.microsoft.com/office/drawing/2016/5/13/chartex" xmlns:cx8="http://schemas.microsoft.com/office/drawing/2016/5/14/chartex" xmlns:mc="http://schemas.openxmlformats.org/markup-compatibility/2006" xmlns:aink="http://schemas.microsoft.com/office/drawing/2016/ink" xmlns:am3d="http://schemas.microsoft.com/office/drawing/2017/model3d" xmlns:o="urn:schemas-microsoft-com:office:office" xmlns:oel="http://schemas.microsoft.com/office/2019/extlst" xmlns:r="http://schemas.openxmlformats.org/officeDocument/2006/relationships" xmlns:m="http://schemas.openxmlformats.org/officeDocument/2006/math" xmlns:v="urn:schemas-microsoft-com:vml" xmlns:wp14="http://schemas.microsoft.com/office/word/2010/wordprocessingDrawing" xmlns:wp="http://schemas.openxmlformats.org/drawingml/2006/wordprocessingDrawing" xmlns:w10="urn:schemas-microsoft-com:office:word" xmlns:w="http://schemas.openxmlformats.org/wordprocessingml/2006/main" xmlns:w14="http://schemas.microsoft.com/office/word/2010/wordml" xmlns:w15="http://schemas.microsoft.com/office/word/2012/wordml" xmlns:w16cex="http://schemas.microsoft.com/office/word/2018/wordml/cex" xmlns:w16cid="http://schemas.microsoft.com/office/word/2016/wordml/cid" xmlns:w16="http://schemas.microsoft.com/office/word/2018/wordml" xmlns:w16sdtdh="http://schemas.microsoft.com/office/word/2020/wordml/sdtdatahash" xmlns:w16se="http://schemas.microsoft.com/office/word/2015/wordml/symex" xmlns:wpg="http://schemas.microsoft.com/office/word/2010/wordprocessingGroup" xmlns:wpi="http://schemas.microsoft.com/office/word/2010/wordprocessingInk" xmlns:wne="http://schemas.microsoft.com/office/word/2006/wordml" xmlns:wps="http://schemas.microsoft.com/office/word/2010/wordprocessingShape" mc:Ignorable="w14 w15 w16se w16cid w16 w16cex w16sdtdh wp14">
+<w:hdr xmlns:wpc="http://schemas.microsoft.com/office/word/2010/wordprocessingCanvas" xmlns:cx="http://schemas.microsoft.com/office/drawing/2014/chartex" xmlns:cx1="http://schemas.microsoft.com/office/drawing/2015/9/8/chartex" xmlns:cx2="http://schemas.microsoft.com/office/drawing/2015/10/21/chartex" xmlns:cx3="http://schemas.microsoft.com/office/drawing/2016/5/9/chartex" xmlns:cx4="http://schemas.microsoft.com/office/drawing/2016/5/10/chartex" xmlns:cx5="http://schemas.microsoft.com/office/drawing/2016/5/11/chartex" xmlns:cx6="http://schemas.microsoft.com/office/drawing/2016/5/12/chartex" xmlns:cx7="http://schemas.microsoft.com/office/drawing/2016/5/13/chartex" xmlns:cx8="http://schemas.microsoft.com/office/drawing/2016/5/14/chartex" xmlns:mc="http://schemas.openxmlformats.org/markup-compatibility/2006" xmlns:aink="http://schemas.microsoft.com/office/drawing/2016/ink" xmlns:am3d="http://schemas.microsoft.com/office/drawing/2017/model3d" xmlns:o="urn:schemas-microsoft-com:office:office" xmlns:oel="http://schemas.microsoft.com/office/2019/extlst" xmlns:r="http://schemas.openxmlformats.org/officeDocument/2006/relationships" xmlns:m="http://schemas.openxmlformats.org/officeDocument/2006/math" xmlns:v="urn:schemas-microsoft-com:vml" xmlns:wp14="http://schemas.microsoft.com/office/word/2010/wordprocessingDrawing" xmlns:wp="http://schemas.openxmlformats.org/drawingml/2006/wordprocessingDrawing" xmlns:w10="urn:schemas-microsoft-com:office:word" xmlns:w="http://schemas.openxmlformats.org/wordprocessingml/2006/main" xmlns:w14="http://schemas.microsoft.com/office/word/2010/wordml" xmlns:w15="http://schemas.microsoft.com/office/word/2012/wordml" xmlns:w16cex="http://schemas.microsoft.com/office/word/2018/wordml/cex" xmlns:w16cid="http://schemas.microsoft.com/office/word/2016/wordml/cid" xmlns:w16="http://schemas.microsoft.com/office/word/2018/wordml" xmlns:w16du="http://schemas.microsoft.com/office/word/2023/wordml/word16du" xmlns:w16sdtdh="http://schemas.microsoft.com/office/word/2020/wordml/sdtdatahash" xmlns:w16se="http://schemas.microsoft.com/office/word/2015/wordml/symex" xmlns:wpg="http://schemas.microsoft.com/office/word/2010/wordprocessingGroup" xmlns:wpi="http://schemas.microsoft.com/office/word/2010/wordprocessingInk" xmlns:wne="http://schemas.microsoft.com/office/word/2006/wordml" xmlns:wps="http://schemas.microsoft.com/office/word/2010/wordprocessingShape" mc:Ignorable="w14 w15 w16se w16cid w16 w16cex w16sdtdh wp14">
   <w:p>
     <w:pPr>
       <w:pStyle w:val="Kopfzeile"/>
@@ -11840,7 +12508,7 @@
                             </w:pPr>
                             <w:r>
                               <w:rPr>
-                                <w:rFonts w:ascii="Helvetica 55" w:hAnsi="Helvetica 55"/>
+                                <w:rFonts w:ascii="helvetica 55" w:hAnsi="helvetica 55"/>
                                 <w:color w:val="A6A6A6" w:themeColor="background1" w:themeShade="A6"/>
                                 <w:sz w:val="14"/>
                                 <w:szCs w:val="14"/>
@@ -11852,7 +12520,7 @@
                             <w:pPr>
                               <w:spacing w:line="160" w:lineRule="exact"/>
                               <w:rPr>
-                                <w:rFonts w:ascii="Helvetica 55" w:hAnsi="Helvetica 55"/>
+                                <w:rFonts w:ascii="helvetica 55" w:hAnsi="helvetica 55"/>
                                 <w:color w:val="A6A6A6"/>
                                 <w:sz w:val="14"/>
                                 <w:szCs w:val="14"/>
@@ -11994,7 +12662,7 @@
 </file>
 
 <file path=word/header3.xml><?xml version="1.0" encoding="utf-8"?>
-<w:hdr xmlns:wpc="http://schemas.microsoft.com/office/word/2010/wordprocessingCanvas" xmlns:cx="http://schemas.microsoft.com/office/drawing/2014/chartex" xmlns:cx1="http://schemas.microsoft.com/office/drawing/2015/9/8/chartex" xmlns:cx2="http://schemas.microsoft.com/office/drawing/2015/10/21/chartex" xmlns:cx3="http://schemas.microsoft.com/office/drawing/2016/5/9/chartex" xmlns:cx4="http://schemas.microsoft.com/office/drawing/2016/5/10/chartex" xmlns:cx5="http://schemas.microsoft.com/office/drawing/2016/5/11/chartex" xmlns:cx6="http://schemas.microsoft.com/office/drawing/2016/5/12/chartex" xmlns:cx7="http://schemas.microsoft.com/office/drawing/2016/5/13/chartex" xmlns:cx8="http://schemas.microsoft.com/office/drawing/2016/5/14/chartex" xmlns:mc="http://schemas.openxmlformats.org/markup-compatibility/2006" xmlns:aink="http://schemas.microsoft.com/office/drawing/2016/ink" xmlns:am3d="http://schemas.microsoft.com/office/drawing/2017/model3d" xmlns:o="urn:schemas-microsoft-com:office:office" xmlns:oel="http://schemas.microsoft.com/office/2019/extlst" xmlns:r="http://schemas.openxmlformats.org/officeDocument/2006/relationships" xmlns:m="http://schemas.openxmlformats.org/officeDocument/2006/math" xmlns:v="urn:schemas-microsoft-com:vml" xmlns:wp14="http://schemas.microsoft.com/office/word/2010/wordprocessingDrawing" xmlns:wp="http://schemas.openxmlformats.org/drawingml/2006/wordprocessingDrawing" xmlns:w10="urn:schemas-microsoft-com:office:word" xmlns:w="http://schemas.openxmlformats.org/wordprocessingml/2006/main" xmlns:w14="http://schemas.microsoft.com/office/word/2010/wordml" xmlns:w15="http://schemas.microsoft.com/office/word/2012/wordml" xmlns:w16cex="http://schemas.microsoft.com/office/word/2018/wordml/cex" xmlns:w16cid="http://schemas.microsoft.com/office/word/2016/wordml/cid" xmlns:w16="http://schemas.microsoft.com/office/word/2018/wordml" xmlns:w16sdtdh="http://schemas.microsoft.com/office/word/2020/wordml/sdtdatahash" xmlns:w16se="http://schemas.microsoft.com/office/word/2015/wordml/symex" xmlns:wpg="http://schemas.microsoft.com/office/word/2010/wordprocessingGroup" xmlns:wpi="http://schemas.microsoft.com/office/word/2010/wordprocessingInk" xmlns:wne="http://schemas.microsoft.com/office/word/2006/wordml" xmlns:wps="http://schemas.microsoft.com/office/word/2010/wordprocessingShape" mc:Ignorable="w14 w15 w16se w16cid w16 w16cex w16sdtdh wp14">
+<w:hdr xmlns:wpc="http://schemas.microsoft.com/office/word/2010/wordprocessingCanvas" xmlns:cx="http://schemas.microsoft.com/office/drawing/2014/chartex" xmlns:cx1="http://schemas.microsoft.com/office/drawing/2015/9/8/chartex" xmlns:cx2="http://schemas.microsoft.com/office/drawing/2015/10/21/chartex" xmlns:cx3="http://schemas.microsoft.com/office/drawing/2016/5/9/chartex" xmlns:cx4="http://schemas.microsoft.com/office/drawing/2016/5/10/chartex" xmlns:cx5="http://schemas.microsoft.com/office/drawing/2016/5/11/chartex" xmlns:cx6="http://schemas.microsoft.com/office/drawing/2016/5/12/chartex" xmlns:cx7="http://schemas.microsoft.com/office/drawing/2016/5/13/chartex" xmlns:cx8="http://schemas.microsoft.com/office/drawing/2016/5/14/chartex" xmlns:mc="http://schemas.openxmlformats.org/markup-compatibility/2006" xmlns:aink="http://schemas.microsoft.com/office/drawing/2016/ink" xmlns:am3d="http://schemas.microsoft.com/office/drawing/2017/model3d" xmlns:o="urn:schemas-microsoft-com:office:office" xmlns:oel="http://schemas.microsoft.com/office/2019/extlst" xmlns:r="http://schemas.openxmlformats.org/officeDocument/2006/relationships" xmlns:m="http://schemas.openxmlformats.org/officeDocument/2006/math" xmlns:v="urn:schemas-microsoft-com:vml" xmlns:wp14="http://schemas.microsoft.com/office/word/2010/wordprocessingDrawing" xmlns:wp="http://schemas.openxmlformats.org/drawingml/2006/wordprocessingDrawing" xmlns:w10="urn:schemas-microsoft-com:office:word" xmlns:w="http://schemas.openxmlformats.org/wordprocessingml/2006/main" xmlns:w14="http://schemas.microsoft.com/office/word/2010/wordml" xmlns:w15="http://schemas.microsoft.com/office/word/2012/wordml" xmlns:w16cex="http://schemas.microsoft.com/office/word/2018/wordml/cex" xmlns:w16cid="http://schemas.microsoft.com/office/word/2016/wordml/cid" xmlns:w16="http://schemas.microsoft.com/office/word/2018/wordml" xmlns:w16du="http://schemas.microsoft.com/office/word/2023/wordml/word16du" xmlns:w16sdtdh="http://schemas.microsoft.com/office/word/2020/wordml/sdtdatahash" xmlns:w16se="http://schemas.microsoft.com/office/word/2015/wordml/symex" xmlns:wpg="http://schemas.microsoft.com/office/word/2010/wordprocessingGroup" xmlns:wpi="http://schemas.microsoft.com/office/word/2010/wordprocessingInk" xmlns:wne="http://schemas.microsoft.com/office/word/2006/wordml" xmlns:wps="http://schemas.microsoft.com/office/word/2010/wordprocessingShape" mc:Ignorable="w14 w15 w16se w16cid w16 w16cex w16sdtdh wp14">
   <w:p>
     <w:pPr>
       <w:pStyle w:val="Kopfzeile"/>
@@ -12004,7 +12672,7 @@
 </file>
 
 <file path=word/header4.xml><?xml version="1.0" encoding="utf-8"?>
-<w:hdr xmlns:wpc="http://schemas.microsoft.com/office/word/2010/wordprocessingCanvas" xmlns:cx="http://schemas.microsoft.com/office/drawing/2014/chartex" xmlns:cx1="http://schemas.microsoft.com/office/drawing/2015/9/8/chartex" xmlns:cx2="http://schemas.microsoft.com/office/drawing/2015/10/21/chartex" xmlns:cx3="http://schemas.microsoft.com/office/drawing/2016/5/9/chartex" xmlns:cx4="http://schemas.microsoft.com/office/drawing/2016/5/10/chartex" xmlns:cx5="http://schemas.microsoft.com/office/drawing/2016/5/11/chartex" xmlns:cx6="http://schemas.microsoft.com/office/drawing/2016/5/12/chartex" xmlns:cx7="http://schemas.microsoft.com/office/drawing/2016/5/13/chartex" xmlns:cx8="http://schemas.microsoft.com/office/drawing/2016/5/14/chartex" xmlns:mc="http://schemas.openxmlformats.org/markup-compatibility/2006" xmlns:aink="http://schemas.microsoft.com/office/drawing/2016/ink" xmlns:am3d="http://schemas.microsoft.com/office/drawing/2017/model3d" xmlns:o="urn:schemas-microsoft-com:office:office" xmlns:oel="http://schemas.microsoft.com/office/2019/extlst" xmlns:r="http://schemas.openxmlformats.org/officeDocument/2006/relationships" xmlns:m="http://schemas.openxmlformats.org/officeDocument/2006/math" xmlns:v="urn:schemas-microsoft-com:vml" xmlns:wp14="http://schemas.microsoft.com/office/word/2010/wordprocessingDrawing" xmlns:wp="http://schemas.openxmlformats.org/drawingml/2006/wordprocessingDrawing" xmlns:w10="urn:schemas-microsoft-com:office:word" xmlns:w="http://schemas.openxmlformats.org/wordprocessingml/2006/main" xmlns:w14="http://schemas.microsoft.com/office/word/2010/wordml" xmlns:w15="http://schemas.microsoft.com/office/word/2012/wordml" xmlns:w16cex="http://schemas.microsoft.com/office/word/2018/wordml/cex" xmlns:w16cid="http://schemas.microsoft.com/office/word/2016/wordml/cid" xmlns:w16="http://schemas.microsoft.com/office/word/2018/wordml" xmlns:w16sdtdh="http://schemas.microsoft.com/office/word/2020/wordml/sdtdatahash" xmlns:w16se="http://schemas.microsoft.com/office/word/2015/wordml/symex" xmlns:wpg="http://schemas.microsoft.com/office/word/2010/wordprocessingGroup" xmlns:wpi="http://schemas.microsoft.com/office/word/2010/wordprocessingInk" xmlns:wne="http://schemas.microsoft.com/office/word/2006/wordml" xmlns:wps="http://schemas.microsoft.com/office/word/2010/wordprocessingShape" mc:Ignorable="w14 w15 w16se w16cid w16 w16cex w16sdtdh wp14">
+<w:hdr xmlns:wpc="http://schemas.microsoft.com/office/word/2010/wordprocessingCanvas" xmlns:cx="http://schemas.microsoft.com/office/drawing/2014/chartex" xmlns:cx1="http://schemas.microsoft.com/office/drawing/2015/9/8/chartex" xmlns:cx2="http://schemas.microsoft.com/office/drawing/2015/10/21/chartex" xmlns:cx3="http://schemas.microsoft.com/office/drawing/2016/5/9/chartex" xmlns:cx4="http://schemas.microsoft.com/office/drawing/2016/5/10/chartex" xmlns:cx5="http://schemas.microsoft.com/office/drawing/2016/5/11/chartex" xmlns:cx6="http://schemas.microsoft.com/office/drawing/2016/5/12/chartex" xmlns:cx7="http://schemas.microsoft.com/office/drawing/2016/5/13/chartex" xmlns:cx8="http://schemas.microsoft.com/office/drawing/2016/5/14/chartex" xmlns:mc="http://schemas.openxmlformats.org/markup-compatibility/2006" xmlns:aink="http://schemas.microsoft.com/office/drawing/2016/ink" xmlns:am3d="http://schemas.microsoft.com/office/drawing/2017/model3d" xmlns:o="urn:schemas-microsoft-com:office:office" xmlns:oel="http://schemas.microsoft.com/office/2019/extlst" xmlns:r="http://schemas.openxmlformats.org/officeDocument/2006/relationships" xmlns:m="http://schemas.openxmlformats.org/officeDocument/2006/math" xmlns:v="urn:schemas-microsoft-com:vml" xmlns:wp14="http://schemas.microsoft.com/office/word/2010/wordprocessingDrawing" xmlns:wp="http://schemas.openxmlformats.org/drawingml/2006/wordprocessingDrawing" xmlns:w10="urn:schemas-microsoft-com:office:word" xmlns:w="http://schemas.openxmlformats.org/wordprocessingml/2006/main" xmlns:w14="http://schemas.microsoft.com/office/word/2010/wordml" xmlns:w15="http://schemas.microsoft.com/office/word/2012/wordml" xmlns:w16cex="http://schemas.microsoft.com/office/word/2018/wordml/cex" xmlns:w16cid="http://schemas.microsoft.com/office/word/2016/wordml/cid" xmlns:w16="http://schemas.microsoft.com/office/word/2018/wordml" xmlns:w16du="http://schemas.microsoft.com/office/word/2023/wordml/word16du" xmlns:w16sdtdh="http://schemas.microsoft.com/office/word/2020/wordml/sdtdatahash" xmlns:w16se="http://schemas.microsoft.com/office/word/2015/wordml/symex" xmlns:wpg="http://schemas.microsoft.com/office/word/2010/wordprocessingGroup" xmlns:wpi="http://schemas.microsoft.com/office/word/2010/wordprocessingInk" xmlns:wne="http://schemas.microsoft.com/office/word/2006/wordml" xmlns:wps="http://schemas.microsoft.com/office/word/2010/wordprocessingShape" mc:Ignorable="w14 w15 w16se w16cid w16 w16cex w16sdtdh wp14">
   <w:p>
     <w:pPr>
       <w:pStyle w:val="Kopfzeile"/>
@@ -12014,7 +12682,7 @@
 </file>
 
 <file path=word/numbering.xml><?xml version="1.0" encoding="utf-8"?>
-<w:numbering xmlns:wpc="http://schemas.microsoft.com/office/word/2010/wordprocessingCanvas" xmlns:cx="http://schemas.microsoft.com/office/drawing/2014/chartex" xmlns:cx1="http://schemas.microsoft.com/office/drawing/2015/9/8/chartex" xmlns:cx2="http://schemas.microsoft.com/office/drawing/2015/10/21/chartex" xmlns:cx3="http://schemas.microsoft.com/office/drawing/2016/5/9/chartex" xmlns:cx4="http://schemas.microsoft.com/office/drawing/2016/5/10/chartex" xmlns:cx5="http://schemas.microsoft.com/office/drawing/2016/5/11/chartex" xmlns:cx6="http://schemas.microsoft.com/office/drawing/2016/5/12/chartex" xmlns:cx7="http://schemas.microsoft.com/office/drawing/2016/5/13/chartex" xmlns:cx8="http://schemas.microsoft.com/office/drawing/2016/5/14/chartex" xmlns:mc="http://schemas.openxmlformats.org/markup-compatibility/2006" xmlns:aink="http://schemas.microsoft.com/office/drawing/2016/ink" xmlns:am3d="http://schemas.microsoft.com/office/drawing/2017/model3d" xmlns:o="urn:schemas-microsoft-com:office:office" xmlns:oel="http://schemas.microsoft.com/office/2019/extlst" xmlns:r="http://schemas.openxmlformats.org/officeDocument/2006/relationships" xmlns:m="http://schemas.openxmlformats.org/officeDocument/2006/math" xmlns:v="urn:schemas-microsoft-com:vml" xmlns:wp14="http://schemas.microsoft.com/office/word/2010/wordprocessingDrawing" xmlns:wp="http://schemas.openxmlformats.org/drawingml/2006/wordprocessingDrawing" xmlns:w10="urn:schemas-microsoft-com:office:word" xmlns:w="http://schemas.openxmlformats.org/wordprocessingml/2006/main" xmlns:w14="http://schemas.microsoft.com/office/word/2010/wordml" xmlns:w15="http://schemas.microsoft.com/office/word/2012/wordml" xmlns:w16cex="http://schemas.microsoft.com/office/word/2018/wordml/cex" xmlns:w16cid="http://schemas.microsoft.com/office/word/2016/wordml/cid" xmlns:w16="http://schemas.microsoft.com/office/word/2018/wordml" xmlns:w16sdtdh="http://schemas.microsoft.com/office/word/2020/wordml/sdtdatahash" xmlns:w16se="http://schemas.microsoft.com/office/word/2015/wordml/symex" xmlns:wpg="http://schemas.microsoft.com/office/word/2010/wordprocessingGroup" xmlns:wpi="http://schemas.microsoft.com/office/word/2010/wordprocessingInk" xmlns:wne="http://schemas.microsoft.com/office/word/2006/wordml" xmlns:wps="http://schemas.microsoft.com/office/word/2010/wordprocessingShape" mc:Ignorable="w14 w15 w16se w16cid w16 w16cex w16sdtdh wp14">
+<w:numbering xmlns:wpc="http://schemas.microsoft.com/office/word/2010/wordprocessingCanvas" xmlns:cx="http://schemas.microsoft.com/office/drawing/2014/chartex" xmlns:cx1="http://schemas.microsoft.com/office/drawing/2015/9/8/chartex" xmlns:cx2="http://schemas.microsoft.com/office/drawing/2015/10/21/chartex" xmlns:cx3="http://schemas.microsoft.com/office/drawing/2016/5/9/chartex" xmlns:cx4="http://schemas.microsoft.com/office/drawing/2016/5/10/chartex" xmlns:cx5="http://schemas.microsoft.com/office/drawing/2016/5/11/chartex" xmlns:cx6="http://schemas.microsoft.com/office/drawing/2016/5/12/chartex" xmlns:cx7="http://schemas.microsoft.com/office/drawing/2016/5/13/chartex" xmlns:cx8="http://schemas.microsoft.com/office/drawing/2016/5/14/chartex" xmlns:mc="http://schemas.openxmlformats.org/markup-compatibility/2006" xmlns:aink="http://schemas.microsoft.com/office/drawing/2016/ink" xmlns:am3d="http://schemas.microsoft.com/office/drawing/2017/model3d" xmlns:o="urn:schemas-microsoft-com:office:office" xmlns:oel="http://schemas.microsoft.com/office/2019/extlst" xmlns:r="http://schemas.openxmlformats.org/officeDocument/2006/relationships" xmlns:m="http://schemas.openxmlformats.org/officeDocument/2006/math" xmlns:v="urn:schemas-microsoft-com:vml" xmlns:wp14="http://schemas.microsoft.com/office/word/2010/wordprocessingDrawing" xmlns:wp="http://schemas.openxmlformats.org/drawingml/2006/wordprocessingDrawing" xmlns:w10="urn:schemas-microsoft-com:office:word" xmlns:w="http://schemas.openxmlformats.org/wordprocessingml/2006/main" xmlns:w14="http://schemas.microsoft.com/office/word/2010/wordml" xmlns:w15="http://schemas.microsoft.com/office/word/2012/wordml" xmlns:w16cex="http://schemas.microsoft.com/office/word/2018/wordml/cex" xmlns:w16cid="http://schemas.microsoft.com/office/word/2016/wordml/cid" xmlns:w16="http://schemas.microsoft.com/office/word/2018/wordml" xmlns:w16du="http://schemas.microsoft.com/office/word/2023/wordml/word16du" xmlns:w16sdtdh="http://schemas.microsoft.com/office/word/2020/wordml/sdtdatahash" xmlns:w16se="http://schemas.microsoft.com/office/word/2015/wordml/symex" xmlns:wpg="http://schemas.microsoft.com/office/word/2010/wordprocessingGroup" xmlns:wpi="http://schemas.microsoft.com/office/word/2010/wordprocessingInk" xmlns:wne="http://schemas.microsoft.com/office/word/2006/wordml" xmlns:wps="http://schemas.microsoft.com/office/word/2010/wordprocessingShape" mc:Ignorable="w14 w15 w16se w16cid w16 w16cex w16sdtdh wp14">
   <w:abstractNum w:abstractNumId="0" w15:restartNumberingAfterBreak="0">
     <w:nsid w:val="002A04D2"/>
     <w:multiLevelType w:val="hybridMultilevel"/>
@@ -15972,7 +16640,7 @@
         <w:ind w:left="720" w:hanging="360"/>
       </w:pPr>
       <w:rPr>
-        <w:rFonts w:ascii="Helvetica 45" w:eastAsia="Arial" w:hAnsi="Helvetica 45" w:cs="Arial" w:hint="default"/>
+        <w:rFonts w:ascii="helvetica 45" w:eastAsia="Arial" w:hAnsi="helvetica 45" w:cs="Arial" w:hint="default"/>
       </w:rPr>
     </w:lvl>
     <w:lvl w:ilvl="1" w:tplc="B3289F24">
@@ -16954,6 +17622,14 @@
     <w:abstractNumId w:val="43"/>
   </w:num>
 </w:numbering>
+</file>
+
+<file path=word/people.xml><?xml version="1.0" encoding="utf-8"?>
+<w15:people xmlns:wpc="http://schemas.microsoft.com/office/word/2010/wordprocessingCanvas" xmlns:cx="http://schemas.microsoft.com/office/drawing/2014/chartex" xmlns:cx1="http://schemas.microsoft.com/office/drawing/2015/9/8/chartex" xmlns:cx2="http://schemas.microsoft.com/office/drawing/2015/10/21/chartex" xmlns:cx3="http://schemas.microsoft.com/office/drawing/2016/5/9/chartex" xmlns:cx4="http://schemas.microsoft.com/office/drawing/2016/5/10/chartex" xmlns:cx5="http://schemas.microsoft.com/office/drawing/2016/5/11/chartex" xmlns:cx6="http://schemas.microsoft.com/office/drawing/2016/5/12/chartex" xmlns:cx7="http://schemas.microsoft.com/office/drawing/2016/5/13/chartex" xmlns:cx8="http://schemas.microsoft.com/office/drawing/2016/5/14/chartex" xmlns:mc="http://schemas.openxmlformats.org/markup-compatibility/2006" xmlns:aink="http://schemas.microsoft.com/office/drawing/2016/ink" xmlns:am3d="http://schemas.microsoft.com/office/drawing/2017/model3d" xmlns:o="urn:schemas-microsoft-com:office:office" xmlns:oel="http://schemas.microsoft.com/office/2019/extlst" xmlns:r="http://schemas.openxmlformats.org/officeDocument/2006/relationships" xmlns:m="http://schemas.openxmlformats.org/officeDocument/2006/math" xmlns:v="urn:schemas-microsoft-com:vml" xmlns:wp14="http://schemas.microsoft.com/office/word/2010/wordprocessingDrawing" xmlns:wp="http://schemas.openxmlformats.org/drawingml/2006/wordprocessingDrawing" xmlns:w10="urn:schemas-microsoft-com:office:word" xmlns:w="http://schemas.openxmlformats.org/wordprocessingml/2006/main" xmlns:w14="http://schemas.microsoft.com/office/word/2010/wordml" xmlns:w15="http://schemas.microsoft.com/office/word/2012/wordml" xmlns:w16cex="http://schemas.microsoft.com/office/word/2018/wordml/cex" xmlns:w16cid="http://schemas.microsoft.com/office/word/2016/wordml/cid" xmlns:w16="http://schemas.microsoft.com/office/word/2018/wordml" xmlns:w16du="http://schemas.microsoft.com/office/word/2023/wordml/word16du" xmlns:w16sdtdh="http://schemas.microsoft.com/office/word/2020/wordml/sdtdatahash" xmlns:w16se="http://schemas.microsoft.com/office/word/2015/wordml/symex" xmlns:wpg="http://schemas.microsoft.com/office/word/2010/wordprocessingGroup" xmlns:wpi="http://schemas.microsoft.com/office/word/2010/wordprocessingInk" xmlns:wne="http://schemas.microsoft.com/office/word/2006/wordml" xmlns:wps="http://schemas.microsoft.com/office/word/2010/wordprocessingShape" mc:Ignorable="w14 w15 w16se w16cid w16 w16cex w16sdtdh wp14">
+  <w15:person w15:author="Ira Diethelm">
+    <w15:presenceInfo w15:providerId="Windows Live" w15:userId="aa756e1db070d33c"/>
+  </w15:person>
+</w15:people>
 </file>
 
 <file path=word/styles.xml><?xml version="1.0" encoding="utf-8"?>
@@ -29628,7 +30304,7 @@
     <w:link w:val="Listenabsatz"/>
     <w:uiPriority w:val="34"/>
     <w:rPr>
-      <w:rFonts w:ascii="Helvetica 45" w:eastAsia="Arial" w:hAnsi="Helvetica 45"/>
+      <w:rFonts w:ascii="helvetica 45" w:eastAsia="Arial" w:hAnsi="helvetica 45"/>
       <w:bCs/>
       <w:sz w:val="21"/>
       <w:lang w:eastAsia="de-DE"/>
@@ -29639,7 +30315,7 @@
     <w:basedOn w:val="ListenabsatzZchn"/>
     <w:link w:val="Listenabsatz-1-facherZeilenabstand"/>
     <w:rPr>
-      <w:rFonts w:ascii="Helvetica 45" w:eastAsia="Arial" w:hAnsi="Helvetica 45"/>
+      <w:rFonts w:ascii="helvetica 45" w:eastAsia="Arial" w:hAnsi="helvetica 45"/>
       <w:bCs/>
       <w:sz w:val="21"/>
       <w:lang w:eastAsia="de-DE"/>
@@ -29655,7 +30331,7 @@
     <w:link w:val="WF-InhaltsverzeichnisZchn"/>
     <w:qFormat/>
     <w:rPr>
-      <w:rFonts w:ascii="Helvetica 65" w:hAnsi="Helvetica 65"/>
+      <w:rFonts w:ascii="helvetica 65" w:hAnsi="helvetica 65"/>
       <w:color w:val="000000" w:themeColor="text1"/>
       <w:sz w:val="28"/>
       <w:szCs w:val="36"/>
@@ -29666,7 +30342,7 @@
     <w:basedOn w:val="berschrift1Zchn"/>
     <w:link w:val="WF-Inhaltsverzeichnis"/>
     <w:rPr>
-      <w:rFonts w:ascii="Helvetica 65" w:eastAsia="Arial" w:hAnsi="Helvetica 65" w:cs="Arial"/>
+      <w:rFonts w:ascii="helvetica 65" w:eastAsia="Arial" w:hAnsi="helvetica 65" w:cs="Arial"/>
       <w:b/>
       <w:bCs/>
       <w:color w:val="000000" w:themeColor="text1"/>
@@ -29692,7 +30368,7 @@
     <w:basedOn w:val="ListenabsatzZchn"/>
     <w:link w:val="WF-Listenabsatz-1-facherZeilenabstand"/>
     <w:rPr>
-      <w:rFonts w:ascii="Helvetica 45" w:eastAsia="Arial" w:hAnsi="Helvetica 45"/>
+      <w:rFonts w:ascii="helvetica 45" w:eastAsia="Arial" w:hAnsi="helvetica 45"/>
       <w:bCs/>
       <w:sz w:val="21"/>
       <w:lang w:eastAsia="de-DE"/>
@@ -29966,9 +30642,7 @@
 </file>
 
 <file path=customXml/item1.xml><?xml version="1.0" encoding="utf-8"?>
-<w:settings xmlns:w="http://schemas.openxmlformats.org/wordprocessingml/2006/main">
-  <w:SpecialFormsHighlight w:val="c9c8ff"/>
-</w:settings>
+<b:Sources xmlns:b="http://schemas.openxmlformats.org/officeDocument/2006/bibliography" xmlns="http://schemas.openxmlformats.org/officeDocument/2006/bibliography" SelectedStyle="\APASixthEditionOfficeOnline.xsl" StyleName="APA" Version="6"/>
 </file>
 
 <file path=customXml/item2.xml><?xml version="1.0" encoding="utf-8"?>
@@ -29978,13 +30652,15 @@
 </file>
 
 <file path=customXml/item3.xml><?xml version="1.0" encoding="utf-8"?>
-<b:Sources xmlns:b="http://schemas.openxmlformats.org/officeDocument/2006/bibliography" xmlns="http://schemas.openxmlformats.org/officeDocument/2006/bibliography" SelectedStyle="\APASixthEditionOfficeOnline.xsl" StyleName="APA" Version="6"/>
+<w:settings xmlns:w="http://schemas.openxmlformats.org/wordprocessingml/2006/main">
+  <w:SpecialFormsHighlight w:val="c9c8ff"/>
+</w:settings>
 </file>
 
 <file path=customXml/itemProps1.xml><?xml version="1.0" encoding="utf-8"?>
-<ds:datastoreItem xmlns:ds="http://schemas.openxmlformats.org/officeDocument/2006/customXml" ds:itemID="{5D0AEA6B-E499-4EEF-98A3-AFBB261C493E}">
+<ds:datastoreItem xmlns:ds="http://schemas.openxmlformats.org/officeDocument/2006/customXml" ds:itemID="{10CF6EC4-056A-4775-9E7A-ACD3BB6B310E}">
   <ds:schemaRefs>
-    <ds:schemaRef ds:uri="http://schemas.openxmlformats.org/wordprocessingml/2006/main"/>
+    <ds:schemaRef ds:uri="http://schemas.openxmlformats.org/officeDocument/2006/bibliography"/>
   </ds:schemaRefs>
 </ds:datastoreItem>
 </file>
@@ -29998,9 +30674,9 @@
 </file>
 
 <file path=customXml/itemProps3.xml><?xml version="1.0" encoding="utf-8"?>
-<ds:datastoreItem xmlns:ds="http://schemas.openxmlformats.org/officeDocument/2006/customXml" ds:itemID="{10CF6EC4-056A-4775-9E7A-ACD3BB6B310E}">
+<ds:datastoreItem xmlns:ds="http://schemas.openxmlformats.org/officeDocument/2006/customXml" ds:itemID="{5D0AEA6B-E499-4EEF-98A3-AFBB261C493E}">
   <ds:schemaRefs>
-    <ds:schemaRef ds:uri="http://schemas.openxmlformats.org/officeDocument/2006/bibliography"/>
+    <ds:schemaRef ds:uri="http://schemas.openxmlformats.org/wordprocessingml/2006/main"/>
   </ds:schemaRefs>
 </ds:datastoreItem>
 </file>
</xml_diff>

<commit_message>
todo Abgleich mit Aufgaben u Tabellen für Ende eingefügt.
</commit_message>
<xml_diff>
--- a/7_KI-Basismodule/KI-B1/KI-B1.0_Modulbeschreibung.docx
+++ b/7_KI-Basismodule/KI-B1/KI-B1.0_Modulbeschreibung.docx
@@ -135,7 +135,7 @@
                               <w:pPr>
                                 <w:pStyle w:val="Kopfzeile"/>
                                 <w:rPr>
-                                  <w:rFonts w:ascii="helvetica 55" w:hAnsi="helvetica 55"/>
+                                  <w:rFonts w:ascii="Helvetica 55" w:hAnsi="Helvetica 55"/>
                                   <w:b/>
                                   <w:sz w:val="88"/>
                                   <w:szCs w:val="88"/>
@@ -143,7 +143,7 @@
                               </w:pPr>
                               <w:r>
                                 <w:rPr>
-                                  <w:rFonts w:ascii="helvetica 55" w:hAnsi="helvetica 55"/>
+                                  <w:rFonts w:ascii="Helvetica 55" w:hAnsi="Helvetica 55"/>
                                   <w:b/>
                                   <w:sz w:val="88"/>
                                   <w:szCs w:val="88"/>
@@ -2255,32 +2255,11 @@
             <w:r>
               <w:t xml:space="preserve">lernen, Phänomene aus ihrer Lebenswelt im Zusammenhang mit </w:t>
             </w:r>
-            <w:del w:id="1" w:author="Ira Diethelm" w:date="2023-06-06T09:16:00Z">
-              <w:r>
-                <w:delText xml:space="preserve">Künstlichen </w:delText>
-              </w:r>
-            </w:del>
-            <w:ins w:id="2" w:author="Ira Diethelm" w:date="2023-06-06T09:16:00Z">
-              <w:r>
-                <w:t>Künstliche</w:t>
-              </w:r>
-              <w:r>
-                <w:t>r</w:t>
-              </w:r>
-              <w:r>
-                <w:t xml:space="preserve"> </w:t>
-              </w:r>
-            </w:ins>
-            <w:r>
-              <w:t>Intelligenz</w:t>
-            </w:r>
-            <w:del w:id="3" w:author="Ira Diethelm" w:date="2023-06-06T09:16:00Z">
-              <w:r>
-                <w:delText>en</w:delText>
-              </w:r>
-            </w:del>
-            <w:r>
-              <w:t xml:space="preserve"> zu identifizieren</w:t>
+            <w:r>
+              <w:t xml:space="preserve">Künstlicher </w:t>
+            </w:r>
+            <w:r>
+              <w:t>Intelligenz zu identifizieren</w:t>
             </w:r>
           </w:p>
           <w:p>
@@ -2294,50 +2273,32 @@
               <w:cnfStyle w:val="000000000000" w:firstRow="0" w:lastRow="0" w:firstColumn="0" w:lastColumn="0" w:oddVBand="0" w:evenVBand="0" w:oddHBand="0" w:evenHBand="0" w:firstRowFirstColumn="0" w:firstRowLastColumn="0" w:lastRowFirstColumn="0" w:lastRowLastColumn="0"/>
             </w:pPr>
             <w:r>
-              <w:t>lernen Künstliche Intelligenz</w:t>
-            </w:r>
-            <w:del w:id="4" w:author="Ira Diethelm" w:date="2023-06-06T09:16:00Z">
-              <w:r>
-                <w:delText>en</w:delText>
-              </w:r>
-            </w:del>
-            <w:r>
-              <w:t xml:space="preserve"> als </w:t>
-            </w:r>
-            <w:ins w:id="5" w:author="Ira Diethelm" w:date="2023-06-06T09:18:00Z">
-              <w:r>
-                <w:t xml:space="preserve">Ergebnis </w:t>
-              </w:r>
-            </w:ins>
+              <w:t xml:space="preserve">lernen </w:t>
+            </w:r>
+            <w:r>
+              <w:t>k</w:t>
+            </w:r>
+            <w:r>
+              <w:t xml:space="preserve">ünstliche Intelligenz als </w:t>
+            </w:r>
+            <w:r>
+              <w:t xml:space="preserve">Ergebnis </w:t>
+            </w:r>
             <w:r>
               <w:t>automatisierte</w:t>
             </w:r>
-            <w:ins w:id="6" w:author="Ira Diethelm" w:date="2023-06-06T09:18:00Z">
-              <w:r>
-                <w:t>r</w:t>
-              </w:r>
-            </w:ins>
+            <w:r>
+              <w:t>r</w:t>
+            </w:r>
             <w:r>
               <w:t xml:space="preserve"> Prozesse</w:t>
             </w:r>
-            <w:ins w:id="7" w:author="Ira Diethelm" w:date="2023-06-06T09:18:00Z">
-              <w:r>
-                <w:t xml:space="preserve"> kennen</w:t>
-              </w:r>
-            </w:ins>
-            <w:r>
-              <w:t xml:space="preserve">, die von Informatiksystemen ausgeführt </w:t>
-            </w:r>
-            <w:proofErr w:type="gramStart"/>
-            <w:r>
-              <w:t>werden</w:t>
-            </w:r>
-            <w:proofErr w:type="gramEnd"/>
-            <w:del w:id="8" w:author="Ira Diethelm" w:date="2023-06-06T09:18:00Z">
-              <w:r>
-                <w:delText>, kennen</w:delText>
-              </w:r>
-            </w:del>
+            <w:r>
+              <w:t xml:space="preserve"> kennen</w:t>
+            </w:r>
+            <w:r>
+              <w:t>, die von Informatiksystemen ausgeführt werden</w:t>
+            </w:r>
           </w:p>
           <w:p>
             <w:pPr>
@@ -2352,11 +2313,9 @@
             <w:r>
               <w:t>unterscheiden starke von schwachen KI</w:t>
             </w:r>
-            <w:ins w:id="9" w:author="Ira Diethelm" w:date="2023-06-06T09:47:00Z">
-              <w:r>
-                <w:t>-Systemen</w:t>
-              </w:r>
-            </w:ins>
+            <w:r>
+              <w:t>-Systemen</w:t>
+            </w:r>
           </w:p>
           <w:p>
             <w:pPr>
@@ -2368,52 +2327,20 @@
               <w:spacing w:before="0" w:after="0" w:line="240" w:lineRule="auto"/>
               <w:cnfStyle w:val="000000000000" w:firstRow="0" w:lastRow="0" w:firstColumn="0" w:lastColumn="0" w:oddVBand="0" w:evenVBand="0" w:oddHBand="0" w:evenHBand="0" w:firstRowFirstColumn="0" w:firstRowLastColumn="0" w:lastRowFirstColumn="0" w:lastRowLastColumn="0"/>
             </w:pPr>
-            <w:del w:id="10" w:author="Ira Diethelm" w:date="2023-06-06T09:54:00Z">
-              <w:r>
-                <w:delText>begreifen</w:delText>
-              </w:r>
-            </w:del>
-            <w:ins w:id="11" w:author="Ira Diethelm" w:date="2023-06-06T09:54:00Z">
-              <w:r>
-                <w:t>erläutern</w:t>
-              </w:r>
-            </w:ins>
+            <w:r>
+              <w:t>erläutern</w:t>
+            </w:r>
             <w:r>
               <w:t xml:space="preserve">, dass </w:t>
             </w:r>
-            <w:ins w:id="12" w:author="Ira Diethelm" w:date="2023-06-06T09:18:00Z">
-              <w:r>
-                <w:t>S</w:t>
-              </w:r>
-            </w:ins>
-            <w:ins w:id="13" w:author="Ira Diethelm" w:date="2023-06-06T09:19:00Z">
-              <w:r>
-                <w:t xml:space="preserve">ysteme mit </w:t>
-              </w:r>
-            </w:ins>
-            <w:del w:id="14" w:author="Ira Diethelm" w:date="2023-06-06T09:47:00Z">
-              <w:r>
-                <w:delText xml:space="preserve">Künstliche </w:delText>
-              </w:r>
-            </w:del>
-            <w:ins w:id="15" w:author="Ira Diethelm" w:date="2023-06-06T09:47:00Z">
-              <w:r>
-                <w:t>k</w:t>
-              </w:r>
-              <w:r>
-                <w:t xml:space="preserve">ünstlicher </w:t>
-              </w:r>
-            </w:ins>
-            <w:r>
-              <w:t>Intelligenz</w:t>
-            </w:r>
-            <w:del w:id="16" w:author="Ira Diethelm" w:date="2023-06-06T09:18:00Z">
-              <w:r>
-                <w:delText>en</w:delText>
-              </w:r>
-            </w:del>
-            <w:r>
-              <w:t xml:space="preserve"> zur Entscheidungsfindung auf Daten über ihre Umwelt zurückgreifen, die über Sensoren wahrgenommen </w:t>
+            <w:r>
+              <w:t xml:space="preserve">Systeme mit </w:t>
+            </w:r>
+            <w:r>
+              <w:t xml:space="preserve">künstlicher </w:t>
+            </w:r>
+            <w:r>
+              <w:t xml:space="preserve">Intelligenz zur Entscheidungsfindung auf Daten über ihre Umwelt zurückgreifen, die über Sensoren wahrgenommen </w:t>
             </w:r>
             <w:proofErr w:type="gramStart"/>
             <w:r>
@@ -2461,19 +2388,9 @@
             <w:r>
               <w:t xml:space="preserve">Kenntnisse des Grundprinzips der </w:t>
             </w:r>
-            <w:del w:id="17" w:author="Ira Diethelm" w:date="2023-06-06T09:16:00Z">
-              <w:r>
-                <w:delText xml:space="preserve">Digitalisierbarkeit </w:delText>
-              </w:r>
-            </w:del>
-            <w:ins w:id="18" w:author="Ira Diethelm" w:date="2023-06-06T09:16:00Z">
-              <w:r>
-                <w:t>Digitalisierung</w:t>
-              </w:r>
-              <w:r>
-                <w:t xml:space="preserve"> </w:t>
-              </w:r>
-            </w:ins>
+            <w:r>
+              <w:t xml:space="preserve">Digitalisierung </w:t>
+            </w:r>
             <w:r>
               <w:t>(Basismodul B1 IT2School)</w:t>
             </w:r>
@@ -2557,7 +2474,13 @@
               <w:cnfStyle w:val="000000000000" w:firstRow="0" w:lastRow="0" w:firstColumn="0" w:lastColumn="0" w:oddVBand="0" w:evenVBand="0" w:oddHBand="0" w:evenHBand="0" w:firstRowFirstColumn="0" w:firstRowLastColumn="0" w:lastRowFirstColumn="0" w:lastRowLastColumn="0"/>
             </w:pPr>
             <w:r>
-              <w:t>Kenntnisse über Einsatzbereiche Künstlicher Intelligenz im eigenen Unternehmen</w:t>
+              <w:t xml:space="preserve">Kenntnisse über Einsatzbereiche </w:t>
+            </w:r>
+            <w:r>
+              <w:t>künstliche</w:t>
+            </w:r>
+            <w:r>
+              <w:t>r Intelligenz im eigenen Unternehmen</w:t>
             </w:r>
           </w:p>
         </w:tc>
@@ -2611,7 +2534,7 @@
       <w:pPr>
         <w:pStyle w:val="berschrift1"/>
       </w:pPr>
-      <w:bookmarkStart w:id="19" w:name="_Toc88152144"/>
+      <w:bookmarkStart w:id="1" w:name="_Toc88152144"/>
       <w:r>
         <w:rPr>
           <w:rFonts w:asciiTheme="minorHAnsi" w:eastAsiaTheme="minorEastAsia" w:hAnsiTheme="minorHAnsi" w:cstheme="minorBidi"/>
@@ -2619,7 +2542,7 @@
         <w:lastRenderedPageBreak/>
         <w:t>Warum gibt es das Modul?</w:t>
       </w:r>
-      <w:bookmarkEnd w:id="19"/>
+      <w:bookmarkEnd w:id="1"/>
     </w:p>
     <w:p>
       <w:r>
@@ -2628,120 +2551,60 @@
         </w:rPr>
         <w:t xml:space="preserve">Ob bei Suchanfragen im Internet, dem Schießen von spaßigen Selfies für Mitschülerinnen und Mitschüler oder bei der Interaktion mit Sprachassistenten: Künstliche Intelligenz (KI) ist allgegenwärtig und auch aus der Lebenswelt von Schülerinnen und Schülern nicht mehr wegzudenken. Oftmals </w:t>
       </w:r>
-      <w:del w:id="20" w:author="Ira Diethelm" w:date="2023-06-06T09:48:00Z">
-        <w:r>
-          <w:rPr>
-            <w:rFonts w:asciiTheme="minorHAnsi" w:eastAsiaTheme="minorEastAsia" w:hAnsiTheme="minorHAnsi" w:cstheme="minorBidi"/>
-          </w:rPr>
-          <w:delText xml:space="preserve">arbeitet </w:delText>
-        </w:r>
-      </w:del>
-      <w:ins w:id="21" w:author="Ira Diethelm" w:date="2023-06-06T09:48:00Z">
-        <w:r>
-          <w:rPr>
-            <w:rFonts w:asciiTheme="minorHAnsi" w:eastAsiaTheme="minorEastAsia" w:hAnsiTheme="minorHAnsi" w:cstheme="minorBidi"/>
-          </w:rPr>
-          <w:t>arbeite</w:t>
-        </w:r>
-        <w:r>
-          <w:rPr>
-            <w:rFonts w:asciiTheme="minorHAnsi" w:eastAsiaTheme="minorEastAsia" w:hAnsiTheme="minorHAnsi" w:cstheme="minorBidi"/>
-          </w:rPr>
-          <w:t>n</w:t>
-        </w:r>
-        <w:r>
-          <w:rPr>
-            <w:rFonts w:asciiTheme="minorHAnsi" w:eastAsiaTheme="minorEastAsia" w:hAnsiTheme="minorHAnsi" w:cstheme="minorBidi"/>
-          </w:rPr>
-          <w:t xml:space="preserve"> </w:t>
-        </w:r>
-      </w:ins>
+      <w:r>
+        <w:rPr>
+          <w:rFonts w:asciiTheme="minorHAnsi" w:eastAsiaTheme="minorEastAsia" w:hAnsiTheme="minorHAnsi" w:cstheme="minorBidi"/>
+        </w:rPr>
+        <w:t xml:space="preserve">arbeiten </w:t>
+      </w:r>
       <w:r>
         <w:rPr>
           <w:rFonts w:asciiTheme="minorHAnsi" w:eastAsiaTheme="minorEastAsia" w:hAnsiTheme="minorHAnsi" w:cstheme="minorBidi"/>
         </w:rPr>
         <w:t>KI</w:t>
       </w:r>
-      <w:ins w:id="22" w:author="Ira Diethelm" w:date="2023-06-06T09:48:00Z">
-        <w:r>
-          <w:rPr>
-            <w:rFonts w:asciiTheme="minorHAnsi" w:eastAsiaTheme="minorEastAsia" w:hAnsiTheme="minorHAnsi" w:cstheme="minorBidi"/>
-          </w:rPr>
-          <w:t>-Systeme</w:t>
-        </w:r>
-      </w:ins>
+      <w:r>
+        <w:rPr>
+          <w:rFonts w:asciiTheme="minorHAnsi" w:eastAsiaTheme="minorEastAsia" w:hAnsiTheme="minorHAnsi" w:cstheme="minorBidi"/>
+        </w:rPr>
+        <w:t>-Systeme</w:t>
+      </w:r>
       <w:r>
         <w:rPr>
           <w:rFonts w:asciiTheme="minorHAnsi" w:eastAsiaTheme="minorEastAsia" w:hAnsiTheme="minorHAnsi" w:cstheme="minorBidi"/>
         </w:rPr>
         <w:t xml:space="preserve"> jedoch im Verborgenen oder hinter der Oberfläche </w:t>
       </w:r>
-      <w:del w:id="23" w:author="Ira Diethelm" w:date="2023-06-06T09:48:00Z">
-        <w:r>
-          <w:rPr>
-            <w:rFonts w:asciiTheme="minorHAnsi" w:eastAsiaTheme="minorEastAsia" w:hAnsiTheme="minorHAnsi" w:cstheme="minorBidi"/>
-          </w:rPr>
-          <w:delText>der Informatiksysteme, die häufig</w:delText>
-        </w:r>
-      </w:del>
-      <w:ins w:id="24" w:author="Ira Diethelm" w:date="2023-06-06T09:48:00Z">
-        <w:r>
-          <w:rPr>
-            <w:rFonts w:asciiTheme="minorHAnsi" w:eastAsiaTheme="minorEastAsia" w:hAnsiTheme="minorHAnsi" w:cstheme="minorBidi"/>
-          </w:rPr>
-          <w:t>von Systemen, die</w:t>
-        </w:r>
-      </w:ins>
+      <w:r>
+        <w:rPr>
+          <w:rFonts w:asciiTheme="minorHAnsi" w:eastAsiaTheme="minorEastAsia" w:hAnsiTheme="minorHAnsi" w:cstheme="minorBidi"/>
+        </w:rPr>
+        <w:t>von Systemen, die</w:t>
+      </w:r>
       <w:r>
         <w:rPr>
           <w:rFonts w:asciiTheme="minorHAnsi" w:eastAsiaTheme="minorEastAsia" w:hAnsiTheme="minorHAnsi" w:cstheme="minorBidi"/>
         </w:rPr>
         <w:t xml:space="preserve"> </w:t>
       </w:r>
-      <w:del w:id="25" w:author="Ira Diethelm" w:date="2023-06-06T09:48:00Z">
-        <w:r>
-          <w:rPr>
-            <w:rFonts w:asciiTheme="minorHAnsi" w:eastAsiaTheme="minorEastAsia" w:hAnsiTheme="minorHAnsi" w:cstheme="minorBidi"/>
-          </w:rPr>
-          <w:delText>im A</w:delText>
-        </w:r>
-      </w:del>
-      <w:ins w:id="26" w:author="Ira Diethelm" w:date="2023-06-06T09:48:00Z">
-        <w:r>
-          <w:rPr>
-            <w:rFonts w:asciiTheme="minorHAnsi" w:eastAsiaTheme="minorEastAsia" w:hAnsiTheme="minorHAnsi" w:cstheme="minorBidi"/>
-          </w:rPr>
-          <w:t>a</w:t>
-        </w:r>
-      </w:ins>
       <w:r>
         <w:rPr>
           <w:rFonts w:asciiTheme="minorHAnsi" w:eastAsiaTheme="minorEastAsia" w:hAnsiTheme="minorHAnsi" w:cstheme="minorBidi"/>
         </w:rPr>
-        <w:t>lltäglich</w:t>
+        <w:t>a</w:t>
       </w:r>
-      <w:del w:id="27" w:author="Ira Diethelm" w:date="2023-06-06T09:48:00Z">
-        <w:r>
-          <w:rPr>
-            <w:rFonts w:asciiTheme="minorHAnsi" w:eastAsiaTheme="minorEastAsia" w:hAnsiTheme="minorHAnsi" w:cstheme="minorBidi"/>
-          </w:rPr>
-          <w:delText>en</w:delText>
-        </w:r>
-      </w:del>
       <w:r>
         <w:rPr>
           <w:rFonts w:asciiTheme="minorHAnsi" w:eastAsiaTheme="minorEastAsia" w:hAnsiTheme="minorHAnsi" w:cstheme="minorBidi"/>
         </w:rPr>
-        <w:t xml:space="preserve"> selbstverständlich genutzt werden. Ein mündiger Umgang erfordert jedoch ein grundlegendes Verständnis darüber, wo KI auftreten kann und welche Eigenschaften KI</w:t>
+        <w:t>lltäglich selbstverständlich genutzt werden. Ein mündiger Umgang erfordert jedoch ein grundlegendes Verständnis darüber, wo KI auftreten kann und welche Eigenschaften KI</w:t>
       </w:r>
-      <w:ins w:id="28" w:author="Ira Diethelm" w:date="2023-06-06T09:49:00Z">
-        <w:r>
-          <w:rPr>
-            <w:rFonts w:asciiTheme="minorHAnsi" w:eastAsiaTheme="minorEastAsia" w:hAnsiTheme="minorHAnsi" w:cstheme="minorBidi"/>
-          </w:rPr>
-          <w:t>-Systeme</w:t>
-        </w:r>
-      </w:ins>
+      <w:r>
+        <w:rPr>
+          <w:rFonts w:asciiTheme="minorHAnsi" w:eastAsiaTheme="minorEastAsia" w:hAnsiTheme="minorHAnsi" w:cstheme="minorBidi"/>
+        </w:rPr>
+        <w:t>-Systeme</w:t>
+      </w:r>
       <w:r>
         <w:rPr>
           <w:rFonts w:asciiTheme="minorHAnsi" w:eastAsiaTheme="minorEastAsia" w:hAnsiTheme="minorHAnsi" w:cstheme="minorBidi"/>
@@ -2756,14 +2619,12 @@
         </w:rPr>
         <w:t>In diesem Modul werden die Schülerinnen und Schüler dazu befähigt, KI als solche wahrzunehmen und zu erkennen, sowie typische Eigenschaften von KI</w:t>
       </w:r>
-      <w:ins w:id="29" w:author="Ira Diethelm" w:date="2023-06-06T09:49:00Z">
-        <w:r>
-          <w:rPr>
-            <w:rFonts w:asciiTheme="minorHAnsi" w:eastAsiaTheme="minorEastAsia" w:hAnsiTheme="minorHAnsi" w:cstheme="minorBidi"/>
-          </w:rPr>
-          <w:t>-Systemen</w:t>
-        </w:r>
-      </w:ins>
+      <w:r>
+        <w:rPr>
+          <w:rFonts w:asciiTheme="minorHAnsi" w:eastAsiaTheme="minorEastAsia" w:hAnsiTheme="minorHAnsi" w:cstheme="minorBidi"/>
+        </w:rPr>
+        <w:t>-Systemen</w:t>
+      </w:r>
       <w:r>
         <w:rPr>
           <w:rFonts w:asciiTheme="minorHAnsi" w:eastAsiaTheme="minorEastAsia" w:hAnsiTheme="minorHAnsi" w:cstheme="minorBidi"/>
@@ -2783,14 +2644,14 @@
       <w:pPr>
         <w:pStyle w:val="berschrift1"/>
       </w:pPr>
-      <w:bookmarkStart w:id="30" w:name="_Toc88152145"/>
+      <w:bookmarkStart w:id="2" w:name="_Toc88152145"/>
       <w:r>
         <w:rPr>
           <w:rFonts w:asciiTheme="minorHAnsi" w:eastAsiaTheme="minorEastAsia" w:hAnsiTheme="minorHAnsi" w:cstheme="minorBidi"/>
         </w:rPr>
         <w:t>Ziele des Moduls</w:t>
       </w:r>
-      <w:bookmarkEnd w:id="30"/>
+      <w:bookmarkEnd w:id="2"/>
       <w:r>
         <w:rPr>
           <w:rFonts w:asciiTheme="minorHAnsi" w:eastAsiaTheme="minorEastAsia" w:hAnsiTheme="minorHAnsi" w:cstheme="minorBidi"/>
@@ -2805,28 +2666,12 @@
         </w:rPr>
         <w:t xml:space="preserve">In der fachdidaktischen Diskussion sind zuletzt zahlreiche Beiträge zu Lernzielen und Kompetenzen, die Schülerinnen und Schüler im Zusammenhang mit </w:t>
       </w:r>
-      <w:del w:id="31" w:author="Ira Diethelm" w:date="2023-06-06T09:49:00Z">
-        <w:r>
-          <w:rPr>
-            <w:rFonts w:asciiTheme="minorHAnsi" w:eastAsiaTheme="minorEastAsia" w:hAnsiTheme="minorHAnsi" w:cstheme="minorBidi"/>
-          </w:rPr>
-          <w:delText xml:space="preserve">Künstlicher </w:delText>
-        </w:r>
-      </w:del>
-      <w:ins w:id="32" w:author="Ira Diethelm" w:date="2023-06-06T09:49:00Z">
-        <w:r>
-          <w:rPr>
-            <w:rFonts w:asciiTheme="minorHAnsi" w:eastAsiaTheme="minorEastAsia" w:hAnsiTheme="minorHAnsi" w:cstheme="minorBidi"/>
-          </w:rPr>
-          <w:t>k</w:t>
-        </w:r>
-        <w:r>
-          <w:rPr>
-            <w:rFonts w:asciiTheme="minorHAnsi" w:eastAsiaTheme="minorEastAsia" w:hAnsiTheme="minorHAnsi" w:cstheme="minorBidi"/>
-          </w:rPr>
-          <w:t xml:space="preserve">ünstlicher </w:t>
-        </w:r>
-      </w:ins>
+      <w:r>
+        <w:rPr>
+          <w:rFonts w:asciiTheme="minorHAnsi" w:eastAsiaTheme="minorEastAsia" w:hAnsiTheme="minorHAnsi" w:cstheme="minorBidi"/>
+        </w:rPr>
+        <w:t xml:space="preserve">künstlicher </w:t>
+      </w:r>
       <w:r>
         <w:rPr>
           <w:rFonts w:asciiTheme="minorHAnsi" w:eastAsiaTheme="minorEastAsia" w:hAnsiTheme="minorHAnsi" w:cstheme="minorBidi"/>
@@ -2861,28 +2706,12 @@
         </w:rPr>
         <w:t xml:space="preserve">“ </w:t>
       </w:r>
-      <w:del w:id="33" w:author="Ira Diethelm" w:date="2023-06-06T09:49:00Z">
-        <w:r>
-          <w:rPr>
-            <w:rFonts w:asciiTheme="minorHAnsi" w:eastAsiaTheme="minorEastAsia" w:hAnsiTheme="minorHAnsi" w:cstheme="minorBidi"/>
-          </w:rPr>
-          <w:delText xml:space="preserve">Künstlicher </w:delText>
-        </w:r>
-      </w:del>
-      <w:ins w:id="34" w:author="Ira Diethelm" w:date="2023-06-06T09:49:00Z">
-        <w:r>
-          <w:rPr>
-            <w:rFonts w:asciiTheme="minorHAnsi" w:eastAsiaTheme="minorEastAsia" w:hAnsiTheme="minorHAnsi" w:cstheme="minorBidi"/>
-          </w:rPr>
-          <w:t>k</w:t>
-        </w:r>
-        <w:r>
-          <w:rPr>
-            <w:rFonts w:asciiTheme="minorHAnsi" w:eastAsiaTheme="minorEastAsia" w:hAnsiTheme="minorHAnsi" w:cstheme="minorBidi"/>
-          </w:rPr>
-          <w:t xml:space="preserve">ünstlicher </w:t>
-        </w:r>
-      </w:ins>
+      <w:r>
+        <w:rPr>
+          <w:rFonts w:asciiTheme="minorHAnsi" w:eastAsiaTheme="minorEastAsia" w:hAnsiTheme="minorHAnsi" w:cstheme="minorBidi"/>
+        </w:rPr>
+        <w:t xml:space="preserve">künstlicher </w:t>
+      </w:r>
       <w:r>
         <w:rPr>
           <w:rFonts w:asciiTheme="minorHAnsi" w:eastAsiaTheme="minorEastAsia" w:hAnsiTheme="minorHAnsi" w:cstheme="minorBidi"/>
@@ -3035,43 +2864,25 @@
         <w:rPr>
           <w:rFonts w:asciiTheme="minorHAnsi" w:eastAsiaTheme="minorEastAsia" w:hAnsiTheme="minorHAnsi" w:cstheme="minorBidi"/>
         </w:rPr>
-        <w:t>Phänomene aus ihrer Lebenswelt im Zusammenhang mit Künstliche</w:t>
+        <w:t xml:space="preserve">Phänomene aus ihrer Lebenswelt im Zusammenhang mit </w:t>
       </w:r>
-      <w:del w:id="35" w:author="Ira Diethelm" w:date="2023-06-06T09:33:00Z">
-        <w:r>
-          <w:rPr>
-            <w:rFonts w:asciiTheme="minorHAnsi" w:eastAsiaTheme="minorEastAsia" w:hAnsiTheme="minorHAnsi" w:cstheme="minorBidi"/>
-          </w:rPr>
-          <w:delText>n</w:delText>
-        </w:r>
-      </w:del>
-      <w:ins w:id="36" w:author="Ira Diethelm" w:date="2023-06-06T09:33:00Z">
-        <w:r>
-          <w:rPr>
-            <w:rFonts w:asciiTheme="minorHAnsi" w:eastAsiaTheme="minorEastAsia" w:hAnsiTheme="minorHAnsi" w:cstheme="minorBidi"/>
-          </w:rPr>
-          <w:t>r</w:t>
-        </w:r>
-      </w:ins>
       <w:r>
         <w:rPr>
           <w:rFonts w:asciiTheme="minorHAnsi" w:eastAsiaTheme="minorEastAsia" w:hAnsiTheme="minorHAnsi" w:cstheme="minorBidi"/>
         </w:rPr>
-        <w:t xml:space="preserve"> Intelligenz</w:t>
+        <w:t>künstliche</w:t>
       </w:r>
-      <w:del w:id="37" w:author="Ira Diethelm" w:date="2023-06-06T09:33:00Z">
-        <w:r>
-          <w:rPr>
-            <w:rFonts w:asciiTheme="minorHAnsi" w:eastAsiaTheme="minorEastAsia" w:hAnsiTheme="minorHAnsi" w:cstheme="minorBidi"/>
-          </w:rPr>
-          <w:delText>en</w:delText>
-        </w:r>
-      </w:del>
       <w:r>
         <w:rPr>
           <w:rFonts w:asciiTheme="minorHAnsi" w:eastAsiaTheme="minorEastAsia" w:hAnsiTheme="minorHAnsi" w:cstheme="minorBidi"/>
         </w:rPr>
-        <w:t xml:space="preserve"> zu identifizieren,</w:t>
+        <w:t>r</w:t>
+      </w:r>
+      <w:r>
+        <w:rPr>
+          <w:rFonts w:asciiTheme="minorHAnsi" w:eastAsiaTheme="minorEastAsia" w:hAnsiTheme="minorHAnsi" w:cstheme="minorBidi"/>
+        </w:rPr>
+        <w:t xml:space="preserve"> Intelligenz zu identifizieren,</w:t>
       </w:r>
     </w:p>
     <w:p>
@@ -3103,49 +2914,19 @@
         <w:rPr>
           <w:rFonts w:asciiTheme="minorHAnsi" w:eastAsiaTheme="minorEastAsia" w:hAnsiTheme="minorHAnsi" w:cstheme="minorBidi"/>
         </w:rPr>
-        <w:t>Künstliche Intelligenz</w:t>
+        <w:t>Künstliche Intelligenz als automatisierte Prozesse</w:t>
       </w:r>
-      <w:del w:id="38" w:author="Ira Diethelm" w:date="2023-06-06T09:33:00Z">
-        <w:r>
-          <w:rPr>
-            <w:rFonts w:asciiTheme="minorHAnsi" w:eastAsiaTheme="minorEastAsia" w:hAnsiTheme="minorHAnsi" w:cstheme="minorBidi"/>
-          </w:rPr>
-          <w:delText>en</w:delText>
-        </w:r>
-      </w:del>
       <w:r>
         <w:rPr>
           <w:rFonts w:asciiTheme="minorHAnsi" w:eastAsiaTheme="minorEastAsia" w:hAnsiTheme="minorHAnsi" w:cstheme="minorBidi"/>
         </w:rPr>
-        <w:t xml:space="preserve"> als automatisierte Prozesse</w:t>
+        <w:t xml:space="preserve"> zu beschreiben</w:t>
       </w:r>
-      <w:ins w:id="39" w:author="Ira Diethelm" w:date="2023-06-06T09:34:00Z">
-        <w:r>
-          <w:rPr>
-            <w:rFonts w:asciiTheme="minorHAnsi" w:eastAsiaTheme="minorEastAsia" w:hAnsiTheme="minorHAnsi" w:cstheme="minorBidi"/>
-          </w:rPr>
-          <w:t xml:space="preserve"> zu beschreiben</w:t>
-        </w:r>
-      </w:ins>
       <w:r>
         <w:rPr>
           <w:rFonts w:asciiTheme="minorHAnsi" w:eastAsiaTheme="minorEastAsia" w:hAnsiTheme="minorHAnsi" w:cstheme="minorBidi"/>
         </w:rPr>
-        <w:t xml:space="preserve">, die von Informatiksystemen ausgeführt werden, </w:t>
-      </w:r>
-      <w:del w:id="40" w:author="Ira Diethelm" w:date="2023-06-06T09:34:00Z">
-        <w:r>
-          <w:rPr>
-            <w:rFonts w:asciiTheme="minorHAnsi" w:eastAsiaTheme="minorEastAsia" w:hAnsiTheme="minorHAnsi" w:cstheme="minorBidi"/>
-          </w:rPr>
-          <w:delText xml:space="preserve">kennen </w:delText>
-        </w:r>
-      </w:del>
-      <w:r>
-        <w:rPr>
-          <w:rFonts w:asciiTheme="minorHAnsi" w:eastAsiaTheme="minorEastAsia" w:hAnsiTheme="minorHAnsi" w:cstheme="minorBidi"/>
-        </w:rPr>
-        <w:t>und,</w:t>
+        <w:t>, die von Informatiksystemen ausgeführt werden, und,</w:t>
       </w:r>
     </w:p>
     <w:p>
@@ -3163,69 +2944,43 @@
         </w:rPr>
         <w:t xml:space="preserve">dass </w:t>
       </w:r>
-      <w:ins w:id="41" w:author="Ira Diethelm" w:date="2023-06-06T09:34:00Z">
-        <w:r>
-          <w:rPr>
-            <w:rFonts w:asciiTheme="minorHAnsi" w:eastAsiaTheme="minorEastAsia" w:hAnsiTheme="minorHAnsi" w:cstheme="minorBidi"/>
-          </w:rPr>
-          <w:t>Systeme mit k</w:t>
-        </w:r>
-      </w:ins>
-      <w:del w:id="42" w:author="Ira Diethelm" w:date="2023-06-06T09:34:00Z">
-        <w:r>
-          <w:rPr>
-            <w:rFonts w:asciiTheme="minorHAnsi" w:eastAsiaTheme="minorEastAsia" w:hAnsiTheme="minorHAnsi" w:cstheme="minorBidi"/>
-          </w:rPr>
-          <w:delText>K</w:delText>
-        </w:r>
-      </w:del>
+      <w:r>
+        <w:rPr>
+          <w:rFonts w:asciiTheme="minorHAnsi" w:eastAsiaTheme="minorEastAsia" w:hAnsiTheme="minorHAnsi" w:cstheme="minorBidi"/>
+        </w:rPr>
+        <w:t>Systeme mit k</w:t>
+      </w:r>
       <w:r>
         <w:rPr>
           <w:rFonts w:asciiTheme="minorHAnsi" w:eastAsiaTheme="minorEastAsia" w:hAnsiTheme="minorHAnsi" w:cstheme="minorBidi"/>
         </w:rPr>
         <w:t>ünstliche</w:t>
       </w:r>
-      <w:ins w:id="43" w:author="Ira Diethelm" w:date="2023-06-06T09:34:00Z">
-        <w:r>
-          <w:rPr>
-            <w:rFonts w:asciiTheme="minorHAnsi" w:eastAsiaTheme="minorEastAsia" w:hAnsiTheme="minorHAnsi" w:cstheme="minorBidi"/>
-          </w:rPr>
-          <w:t>r</w:t>
-        </w:r>
-      </w:ins>
       <w:r>
         <w:rPr>
           <w:rFonts w:asciiTheme="minorHAnsi" w:eastAsiaTheme="minorEastAsia" w:hAnsiTheme="minorHAnsi" w:cstheme="minorBidi"/>
         </w:rPr>
-        <w:t xml:space="preserve"> Intelligenz</w:t>
+        <w:t>r</w:t>
       </w:r>
-      <w:del w:id="44" w:author="Ira Diethelm" w:date="2023-06-06T09:34:00Z">
-        <w:r>
-          <w:rPr>
-            <w:rFonts w:asciiTheme="minorHAnsi" w:eastAsiaTheme="minorEastAsia" w:hAnsiTheme="minorHAnsi" w:cstheme="minorBidi"/>
-          </w:rPr>
-          <w:delText>en</w:delText>
-        </w:r>
-      </w:del>
       <w:r>
         <w:rPr>
           <w:rFonts w:asciiTheme="minorHAnsi" w:eastAsiaTheme="minorEastAsia" w:hAnsiTheme="minorHAnsi" w:cstheme="minorBidi"/>
         </w:rPr>
-        <w:t xml:space="preserve"> zur Entscheidungsfindung auf Daten zurückgreifen, die über Sensoren wahrgenommen werden und die Realität unvollständig repräsentieren.</w:t>
+        <w:t xml:space="preserve"> Intelligenz zur Entscheidungsfindung auf Daten zurückgreifen, die über Sensoren wahrgenommen werden und die Realität unvollständig repräsentieren.</w:t>
       </w:r>
     </w:p>
     <w:p>
       <w:pPr>
         <w:pStyle w:val="berschrift1"/>
       </w:pPr>
-      <w:bookmarkStart w:id="45" w:name="_Toc88152146"/>
+      <w:bookmarkStart w:id="3" w:name="_Toc88152146"/>
       <w:r>
         <w:rPr>
           <w:rFonts w:asciiTheme="minorHAnsi" w:eastAsiaTheme="minorEastAsia" w:hAnsiTheme="minorHAnsi" w:cstheme="minorBidi"/>
         </w:rPr>
         <w:t>Die Rolle der Unternehmensvertreterin/des Unternehmensvertreters</w:t>
       </w:r>
-      <w:bookmarkEnd w:id="45"/>
+      <w:bookmarkEnd w:id="3"/>
     </w:p>
     <w:p>
       <w:pPr>
@@ -3256,22 +3011,12 @@
         </w:rPr>
         <w:t xml:space="preserve">Sie oder er kann als Special-Guest eingeladen werden, um über die Bedeutung von </w:t>
       </w:r>
-      <w:ins w:id="46" w:author="Ira Diethelm" w:date="2023-06-06T09:55:00Z">
-        <w:r>
-          <w:rPr>
-            <w:rFonts w:asciiTheme="minorHAnsi" w:eastAsiaTheme="minorEastAsia" w:hAnsiTheme="minorHAnsi" w:cstheme="minorBidi"/>
-          </w:rPr>
-          <w:t>k</w:t>
-        </w:r>
-      </w:ins>
-      <w:del w:id="47" w:author="Ira Diethelm" w:date="2023-06-06T09:55:00Z">
-        <w:r>
-          <w:rPr>
-            <w:rFonts w:asciiTheme="minorHAnsi" w:eastAsiaTheme="minorEastAsia" w:hAnsiTheme="minorHAnsi" w:cstheme="minorBidi"/>
-          </w:rPr>
-          <w:delText>K</w:delText>
-        </w:r>
-      </w:del>
+      <w:r>
+        <w:rPr>
+          <w:rFonts w:asciiTheme="minorHAnsi" w:eastAsiaTheme="minorEastAsia" w:hAnsiTheme="minorHAnsi" w:cstheme="minorBidi"/>
+        </w:rPr>
+        <w:t>k</w:t>
+      </w:r>
       <w:r>
         <w:rPr>
           <w:rFonts w:asciiTheme="minorHAnsi" w:eastAsiaTheme="minorEastAsia" w:hAnsiTheme="minorHAnsi" w:cstheme="minorBidi"/>
@@ -3293,22 +3038,12 @@
         </w:rPr>
         <w:t xml:space="preserve">Sie oder er kann den Schülerinnen und Schülern eine Exkursion in das eigene Unternehmen ermöglichen und zeigen, wo </w:t>
       </w:r>
-      <w:ins w:id="48" w:author="Ira Diethelm" w:date="2023-06-06T09:55:00Z">
-        <w:r>
-          <w:rPr>
-            <w:rFonts w:asciiTheme="minorHAnsi" w:eastAsiaTheme="minorEastAsia" w:hAnsiTheme="minorHAnsi" w:cstheme="minorBidi"/>
-          </w:rPr>
-          <w:t>k</w:t>
-        </w:r>
-      </w:ins>
-      <w:del w:id="49" w:author="Ira Diethelm" w:date="2023-06-06T09:55:00Z">
-        <w:r>
-          <w:rPr>
-            <w:rFonts w:asciiTheme="minorHAnsi" w:eastAsiaTheme="minorEastAsia" w:hAnsiTheme="minorHAnsi" w:cstheme="minorBidi"/>
-          </w:rPr>
-          <w:delText>K</w:delText>
-        </w:r>
-      </w:del>
+      <w:r>
+        <w:rPr>
+          <w:rFonts w:asciiTheme="minorHAnsi" w:eastAsiaTheme="minorEastAsia" w:hAnsiTheme="minorHAnsi" w:cstheme="minorBidi"/>
+        </w:rPr>
+        <w:t>k</w:t>
+      </w:r>
       <w:r>
         <w:rPr>
           <w:rFonts w:asciiTheme="minorHAnsi" w:eastAsiaTheme="minorEastAsia" w:hAnsiTheme="minorHAnsi" w:cstheme="minorBidi"/>
@@ -3330,14 +3065,12 @@
         </w:rPr>
         <w:t>Ergänzend kann eine Charakterisierung dieser KI</w:t>
       </w:r>
-      <w:ins w:id="50" w:author="Ira Diethelm" w:date="2023-06-06T09:35:00Z">
-        <w:r>
-          <w:rPr>
-            <w:rFonts w:asciiTheme="minorHAnsi" w:eastAsiaTheme="minorEastAsia" w:hAnsiTheme="minorHAnsi" w:cstheme="minorBidi"/>
-          </w:rPr>
-          <w:t>-Systeme</w:t>
-        </w:r>
-      </w:ins>
+      <w:r>
+        <w:rPr>
+          <w:rFonts w:asciiTheme="minorHAnsi" w:eastAsiaTheme="minorEastAsia" w:hAnsiTheme="minorHAnsi" w:cstheme="minorBidi"/>
+        </w:rPr>
+        <w:t>-Systeme</w:t>
+      </w:r>
       <w:r>
         <w:rPr>
           <w:rFonts w:asciiTheme="minorHAnsi" w:eastAsiaTheme="minorEastAsia" w:hAnsiTheme="minorHAnsi" w:cstheme="minorBidi"/>
@@ -3360,7 +3093,7 @@
       <w:pPr>
         <w:pStyle w:val="berschrift1"/>
       </w:pPr>
-      <w:bookmarkStart w:id="51" w:name="_Toc88152147"/>
+      <w:bookmarkStart w:id="4" w:name="_Toc88152147"/>
       <w:r>
         <w:rPr>
           <w:rFonts w:asciiTheme="minorHAnsi" w:eastAsiaTheme="minorEastAsia" w:hAnsiTheme="minorHAnsi" w:cstheme="minorBidi"/>
@@ -3368,7 +3101,7 @@
         <w:lastRenderedPageBreak/>
         <w:t>Inhalte des Moduls</w:t>
       </w:r>
-      <w:bookmarkEnd w:id="51"/>
+      <w:bookmarkEnd w:id="4"/>
     </w:p>
     <w:p>
       <w:r>
@@ -3391,28 +3124,12 @@
         </w:rPr>
         <w:t xml:space="preserve"> weil – der Begriff „</w:t>
       </w:r>
-      <w:del w:id="52" w:author="Ira Diethelm" w:date="2023-06-06T09:46:00Z">
-        <w:r>
-          <w:rPr>
-            <w:rFonts w:asciiTheme="minorHAnsi" w:eastAsiaTheme="minorEastAsia" w:hAnsiTheme="minorHAnsi" w:cstheme="minorBidi"/>
-          </w:rPr>
-          <w:delText xml:space="preserve">Künstliche </w:delText>
-        </w:r>
-      </w:del>
-      <w:ins w:id="53" w:author="Ira Diethelm" w:date="2023-06-06T09:46:00Z">
-        <w:r>
-          <w:rPr>
-            <w:rFonts w:asciiTheme="minorHAnsi" w:eastAsiaTheme="minorEastAsia" w:hAnsiTheme="minorHAnsi" w:cstheme="minorBidi"/>
-          </w:rPr>
-          <w:t>k</w:t>
-        </w:r>
-        <w:r>
-          <w:rPr>
-            <w:rFonts w:asciiTheme="minorHAnsi" w:eastAsiaTheme="minorEastAsia" w:hAnsiTheme="minorHAnsi" w:cstheme="minorBidi"/>
-          </w:rPr>
-          <w:t xml:space="preserve">ünstliche </w:t>
-        </w:r>
-      </w:ins>
+      <w:r>
+        <w:rPr>
+          <w:rFonts w:asciiTheme="minorHAnsi" w:eastAsiaTheme="minorEastAsia" w:hAnsiTheme="minorHAnsi" w:cstheme="minorBidi"/>
+        </w:rPr>
+        <w:t xml:space="preserve">künstliche </w:t>
+      </w:r>
       <w:r>
         <w:rPr>
           <w:rFonts w:asciiTheme="minorHAnsi" w:eastAsiaTheme="minorEastAsia" w:hAnsiTheme="minorHAnsi" w:cstheme="minorBidi"/>
@@ -3457,44 +3174,24 @@
         </w:rPr>
         <w:t>) bereits seit mehreren Jahrzehnten stetig an Popularität gewinnt, existiert keine allgemein akzeptierte Definition dessen, was ein</w:t>
       </w:r>
-      <w:ins w:id="54" w:author="Ira Diethelm" w:date="2023-06-06T09:37:00Z">
-        <w:r>
-          <w:rPr>
-            <w:rFonts w:asciiTheme="minorHAnsi" w:eastAsiaTheme="minorEastAsia" w:hAnsiTheme="minorHAnsi" w:cstheme="minorBidi"/>
-          </w:rPr>
-          <w:t xml:space="preserve"> System mit</w:t>
-        </w:r>
-      </w:ins>
-      <w:del w:id="55" w:author="Ira Diethelm" w:date="2023-06-06T09:37:00Z">
-        <w:r>
-          <w:rPr>
-            <w:rFonts w:asciiTheme="minorHAnsi" w:eastAsiaTheme="minorEastAsia" w:hAnsiTheme="minorHAnsi" w:cstheme="minorBidi"/>
-          </w:rPr>
-          <w:delText>e</w:delText>
-        </w:r>
-      </w:del>
+      <w:r>
+        <w:rPr>
+          <w:rFonts w:asciiTheme="minorHAnsi" w:eastAsiaTheme="minorEastAsia" w:hAnsiTheme="minorHAnsi" w:cstheme="minorBidi"/>
+        </w:rPr>
+        <w:t xml:space="preserve"> System mit</w:t>
+      </w:r>
       <w:r>
         <w:rPr>
           <w:rFonts w:asciiTheme="minorHAnsi" w:eastAsiaTheme="minorEastAsia" w:hAnsiTheme="minorHAnsi" w:cstheme="minorBidi"/>
         </w:rPr>
         <w:t xml:space="preserve"> KI auszeichnet oder was </w:t>
       </w:r>
-      <w:ins w:id="56" w:author="Ira Diethelm" w:date="2023-06-06T09:37:00Z">
-        <w:r>
-          <w:rPr>
-            <w:rFonts w:asciiTheme="minorHAnsi" w:eastAsiaTheme="minorEastAsia" w:hAnsiTheme="minorHAnsi" w:cstheme="minorBidi"/>
-          </w:rPr>
-          <w:t xml:space="preserve">es </w:t>
-        </w:r>
-      </w:ins>
-      <w:del w:id="57" w:author="Ira Diethelm" w:date="2023-06-06T09:37:00Z">
-        <w:r>
-          <w:rPr>
-            <w:rFonts w:asciiTheme="minorHAnsi" w:eastAsiaTheme="minorEastAsia" w:hAnsiTheme="minorHAnsi" w:cstheme="minorBidi"/>
-          </w:rPr>
-          <w:delText xml:space="preserve">eine KI </w:delText>
-        </w:r>
-      </w:del>
+      <w:r>
+        <w:rPr>
+          <w:rFonts w:asciiTheme="minorHAnsi" w:eastAsiaTheme="minorEastAsia" w:hAnsiTheme="minorHAnsi" w:cstheme="minorBidi"/>
+        </w:rPr>
+        <w:t xml:space="preserve">es </w:t>
+      </w:r>
       <w:r>
         <w:rPr>
           <w:rFonts w:asciiTheme="minorHAnsi" w:eastAsiaTheme="minorEastAsia" w:hAnsiTheme="minorHAnsi" w:cstheme="minorBidi"/>
@@ -3556,94 +3253,24 @@
         </w:rPr>
         <w:t xml:space="preserve"> erfordern.</w:t>
       </w:r>
-      <w:ins w:id="58" w:author="Ira Diethelm" w:date="2023-06-06T09:38:00Z">
-        <w:r>
-          <w:rPr>
-            <w:rFonts w:asciiTheme="minorHAnsi" w:eastAsiaTheme="minorEastAsia" w:hAnsiTheme="minorHAnsi" w:cstheme="minorBidi"/>
-          </w:rPr>
-          <w:t xml:space="preserve"> </w:t>
-        </w:r>
-      </w:ins>
-      <w:ins w:id="59" w:author="Ira Diethelm" w:date="2023-06-06T09:40:00Z">
-        <w:r>
-          <w:rPr>
-            <w:rFonts w:asciiTheme="minorHAnsi" w:eastAsiaTheme="minorEastAsia" w:hAnsiTheme="minorHAnsi" w:cstheme="minorBidi"/>
-          </w:rPr>
-          <w:t>Spricht man von „</w:t>
-        </w:r>
-      </w:ins>
-      <w:ins w:id="60" w:author="Ira Diethelm" w:date="2023-06-06T09:38:00Z">
-        <w:r>
-          <w:rPr>
-            <w:rFonts w:asciiTheme="minorHAnsi" w:eastAsiaTheme="minorEastAsia" w:hAnsiTheme="minorHAnsi" w:cstheme="minorBidi"/>
-          </w:rPr>
-          <w:t>einer KI</w:t>
-        </w:r>
-      </w:ins>
-      <w:ins w:id="61" w:author="Ira Diethelm" w:date="2023-06-06T09:40:00Z">
-        <w:r>
-          <w:rPr>
-            <w:rFonts w:asciiTheme="minorHAnsi" w:eastAsiaTheme="minorEastAsia" w:hAnsiTheme="minorHAnsi" w:cstheme="minorBidi"/>
-          </w:rPr>
-          <w:t>“</w:t>
-        </w:r>
-      </w:ins>
-      <w:ins w:id="62" w:author="Ira Diethelm" w:date="2023-06-06T09:38:00Z">
-        <w:r>
-          <w:rPr>
-            <w:rFonts w:asciiTheme="minorHAnsi" w:eastAsiaTheme="minorEastAsia" w:hAnsiTheme="minorHAnsi" w:cstheme="minorBidi"/>
-          </w:rPr>
-          <w:t xml:space="preserve"> wird </w:t>
-        </w:r>
-      </w:ins>
-      <w:ins w:id="63" w:author="Ira Diethelm" w:date="2023-06-06T09:40:00Z">
-        <w:r>
-          <w:rPr>
-            <w:rFonts w:asciiTheme="minorHAnsi" w:eastAsiaTheme="minorEastAsia" w:hAnsiTheme="minorHAnsi" w:cstheme="minorBidi"/>
-          </w:rPr>
-          <w:t>darunter meist</w:t>
-        </w:r>
-      </w:ins>
-      <w:ins w:id="64" w:author="Ira Diethelm" w:date="2023-06-06T09:38:00Z">
-        <w:r>
-          <w:rPr>
-            <w:rFonts w:asciiTheme="minorHAnsi" w:eastAsiaTheme="minorEastAsia" w:hAnsiTheme="minorHAnsi" w:cstheme="minorBidi"/>
-          </w:rPr>
-          <w:t xml:space="preserve"> ein System mit künstlicher Intelligenz </w:t>
-        </w:r>
-      </w:ins>
-      <w:ins w:id="65" w:author="Ira Diethelm" w:date="2023-06-06T09:40:00Z">
-        <w:r>
-          <w:rPr>
-            <w:rFonts w:asciiTheme="minorHAnsi" w:eastAsiaTheme="minorEastAsia" w:hAnsiTheme="minorHAnsi" w:cstheme="minorBidi"/>
-          </w:rPr>
-          <w:t>verstanden.</w:t>
-        </w:r>
-      </w:ins>
-      <w:ins w:id="66" w:author="Ira Diethelm" w:date="2023-06-06T09:39:00Z">
-        <w:r>
-          <w:rPr>
-            <w:rFonts w:asciiTheme="minorHAnsi" w:eastAsiaTheme="minorEastAsia" w:hAnsiTheme="minorHAnsi" w:cstheme="minorBidi"/>
-          </w:rPr>
-          <w:t xml:space="preserve"> Die Mehrzahl ist eher un</w:t>
-        </w:r>
-      </w:ins>
-      <w:ins w:id="67" w:author="Ira Diethelm" w:date="2023-06-06T09:40:00Z">
-        <w:r>
-          <w:rPr>
-            <w:rFonts w:asciiTheme="minorHAnsi" w:eastAsiaTheme="minorEastAsia" w:hAnsiTheme="minorHAnsi" w:cstheme="minorBidi"/>
-          </w:rPr>
-          <w:t>gebräuchlich</w:t>
-        </w:r>
-      </w:ins>
-      <w:ins w:id="68" w:author="Ira Diethelm" w:date="2023-06-06T09:39:00Z">
-        <w:r>
-          <w:rPr>
-            <w:rFonts w:asciiTheme="minorHAnsi" w:eastAsiaTheme="minorEastAsia" w:hAnsiTheme="minorHAnsi" w:cstheme="minorBidi"/>
-          </w:rPr>
-          <w:t>.</w:t>
-        </w:r>
-      </w:ins>
+      <w:r>
+        <w:rPr>
+          <w:rFonts w:asciiTheme="minorHAnsi" w:eastAsiaTheme="minorEastAsia" w:hAnsiTheme="minorHAnsi" w:cstheme="minorBidi"/>
+        </w:rPr>
+        <w:t xml:space="preserve"> Spricht man von „einer KI“ wird darunter meist ein </w:t>
+      </w:r>
+      <w:r>
+        <w:rPr>
+          <w:rFonts w:asciiTheme="minorHAnsi" w:eastAsiaTheme="minorEastAsia" w:hAnsiTheme="minorHAnsi" w:cstheme="minorBidi"/>
+        </w:rPr>
+        <w:t>Informatiks</w:t>
+      </w:r>
+      <w:r>
+        <w:rPr>
+          <w:rFonts w:asciiTheme="minorHAnsi" w:eastAsiaTheme="minorEastAsia" w:hAnsiTheme="minorHAnsi" w:cstheme="minorBidi"/>
+        </w:rPr>
+        <w:t>ystem mit künstlicher Intelligenz verstanden. Die Mehrzahl ist eher ungebräuchlich.</w:t>
+      </w:r>
     </w:p>
     <w:p>
       <w:r>
@@ -4151,15 +3778,13 @@
         <w:br/>
         <w:t>als KI</w:t>
       </w:r>
-      <w:ins w:id="69" w:author="Ira Diethelm" w:date="2023-06-06T09:39:00Z">
-        <w:r>
-          <w:rPr>
-            <w:rFonts w:asciiTheme="minorHAnsi" w:eastAsiaTheme="minorEastAsia" w:hAnsiTheme="minorHAnsi" w:cstheme="minorBidi"/>
-            <w:szCs w:val="21"/>
-          </w:rPr>
-          <w:t>-Systeme</w:t>
-        </w:r>
-      </w:ins>
+      <w:r>
+        <w:rPr>
+          <w:rFonts w:asciiTheme="minorHAnsi" w:eastAsiaTheme="minorEastAsia" w:hAnsiTheme="minorHAnsi" w:cstheme="minorBidi"/>
+          <w:szCs w:val="21"/>
+        </w:rPr>
+        <w:t>-Systeme</w:t>
+      </w:r>
       <w:r>
         <w:rPr>
           <w:rFonts w:asciiTheme="minorHAnsi" w:eastAsiaTheme="minorEastAsia" w:hAnsiTheme="minorHAnsi" w:cstheme="minorBidi"/>
@@ -4611,17 +4236,17 @@
       <w:pPr>
         <w:pStyle w:val="berschrift1"/>
       </w:pPr>
-      <w:bookmarkStart w:id="70" w:name="_Toc88152148"/>
+      <w:bookmarkStart w:id="5" w:name="_Toc88152148"/>
       <w:r>
         <w:rPr>
           <w:rFonts w:asciiTheme="minorHAnsi" w:eastAsiaTheme="minorEastAsia" w:hAnsiTheme="minorHAnsi" w:cstheme="minorBidi"/>
         </w:rPr>
         <w:t>Unterrichtliche Umsetzung</w:t>
       </w:r>
-      <w:bookmarkEnd w:id="70"/>
+      <w:bookmarkEnd w:id="5"/>
     </w:p>
     <w:p>
-      <w:bookmarkStart w:id="71" w:name="_Toc433280363"/>
+      <w:bookmarkStart w:id="6" w:name="_Toc433280363"/>
       <w:r>
         <w:rPr>
           <w:rFonts w:asciiTheme="minorHAnsi" w:eastAsiaTheme="minorEastAsia" w:hAnsiTheme="minorHAnsi" w:cstheme="minorBidi"/>
@@ -4778,8 +4403,8 @@
         <w:ind w:left="8" w:hanging="8"/>
         <w:jc w:val="both"/>
       </w:pPr>
-      <w:bookmarkStart w:id="72" w:name="_Toc88152149"/>
-      <w:bookmarkEnd w:id="71"/>
+      <w:bookmarkStart w:id="7" w:name="_Toc88152149"/>
+      <w:bookmarkEnd w:id="6"/>
       <w:r>
         <w:rPr>
           <w:rFonts w:asciiTheme="minorHAnsi" w:eastAsiaTheme="minorEastAsia" w:hAnsiTheme="minorHAnsi" w:cstheme="minorBidi"/>
@@ -4787,7 +4412,7 @@
         <w:lastRenderedPageBreak/>
         <w:t>Variante 1 (ca. 3 bis 4 Unterrichtsstunden á 45 Min.): mit Technik</w:t>
       </w:r>
-      <w:bookmarkEnd w:id="72"/>
+      <w:bookmarkEnd w:id="7"/>
     </w:p>
     <w:p>
       <w:r>
@@ -5055,7 +4680,7 @@
         <w:ind w:left="8" w:hanging="8"/>
         <w:jc w:val="both"/>
       </w:pPr>
-      <w:bookmarkStart w:id="73" w:name="_Toc88152150"/>
+      <w:bookmarkStart w:id="8" w:name="_Toc88152150"/>
       <w:r>
         <w:rPr>
           <w:rFonts w:asciiTheme="minorHAnsi" w:eastAsiaTheme="minorEastAsia" w:hAnsiTheme="minorHAnsi" w:cstheme="minorBidi"/>
@@ -5063,7 +4688,7 @@
         <w:lastRenderedPageBreak/>
         <w:t>Variante 2 (ca. 3 bis 4 Unterrichtsstunden á 45 Min.): ohne Technik</w:t>
       </w:r>
-      <w:bookmarkEnd w:id="73"/>
+      <w:bookmarkEnd w:id="8"/>
     </w:p>
     <w:p>
       <w:pPr>
@@ -5341,7 +4966,7 @@
       <w:pPr>
         <w:pStyle w:val="berschrift2"/>
       </w:pPr>
-      <w:bookmarkStart w:id="78" w:name="_Toc88152151"/>
+      <w:bookmarkStart w:id="13" w:name="_Toc88152151"/>
       <w:r>
         <w:rPr>
           <w:rFonts w:asciiTheme="minorHAnsi" w:eastAsiaTheme="minorEastAsia" w:hAnsiTheme="minorHAnsi" w:cstheme="minorBidi"/>
@@ -5349,7 +4974,7 @@
         <w:lastRenderedPageBreak/>
         <w:t>Stundenverlaufsskizzen</w:t>
       </w:r>
-      <w:bookmarkEnd w:id="78"/>
+      <w:bookmarkEnd w:id="13"/>
     </w:p>
     <w:p>
       <w:pPr>
@@ -5387,14 +5012,14 @@
         <w:spacing w:before="200" w:after="0"/>
         <w:jc w:val="both"/>
       </w:pPr>
-      <w:bookmarkStart w:id="79" w:name="_Toc88152152"/>
+      <w:bookmarkStart w:id="14" w:name="_Toc88152152"/>
       <w:r>
         <w:rPr>
           <w:rFonts w:asciiTheme="minorHAnsi" w:eastAsiaTheme="minorEastAsia" w:hAnsiTheme="minorHAnsi" w:cstheme="minorBidi"/>
         </w:rPr>
         <w:t>Variante 1: mit Technik</w:t>
       </w:r>
-      <w:bookmarkEnd w:id="79"/>
+      <w:bookmarkEnd w:id="14"/>
     </w:p>
     <w:tbl>
       <w:tblPr>
@@ -5419,6 +5044,7 @@
             <w:tcW w:w="1134" w:type="dxa"/>
           </w:tcPr>
           <w:p>
+            <w:commentRangeStart w:id="15"/>
             <w:r>
               <w:t>Zeit</w:t>
             </w:r>
@@ -5735,7 +5361,21 @@
                 <w:sz w:val="20"/>
                 <w:szCs w:val="20"/>
               </w:rPr>
-              <w:t xml:space="preserve"> zur Frage „Was hat … mit Künstlicher Intelligenz zu tun?“ vorbereitet (bspw. an der Tafel / dem White Board / o.ä.). Die SuS nennen im Unterrichtsgespräch Aspekte zu KI, die die L kontinuierlich in der </w:t>
+              <w:t xml:space="preserve"> zur Frage „Was hat … mit </w:t>
+            </w:r>
+            <w:r>
+              <w:rPr>
+                <w:sz w:val="20"/>
+                <w:szCs w:val="20"/>
+              </w:rPr>
+              <w:t>k</w:t>
+            </w:r>
+            <w:r>
+              <w:rPr>
+                <w:sz w:val="20"/>
+                <w:szCs w:val="20"/>
+              </w:rPr>
+              <w:t xml:space="preserve">ünstlicher Intelligenz zu tun?“ vorbereitet (bspw. an der Tafel / dem White Board / o.ä.). Die SuS nennen im Unterrichtsgespräch Aspekte zu KI, die die L kontinuierlich in der </w:t>
             </w:r>
             <w:proofErr w:type="gramStart"/>
             <w:r>
@@ -6230,6 +5870,7 @@
                 <w:szCs w:val="20"/>
               </w:rPr>
             </w:pPr>
+            <w:commentRangeStart w:id="16"/>
             <w:r>
               <w:rPr>
                 <w:color w:val="000000" w:themeColor="text1"/>
@@ -6253,6 +5894,13 @@
                 <w:szCs w:val="20"/>
               </w:rPr>
               <w:t>Optional das Zusatzmaterial KI-B1.2.1 bzw. KI-B1.2.2</w:t>
+            </w:r>
+            <w:commentRangeEnd w:id="16"/>
+            <w:r>
+              <w:rPr>
+                <w:rStyle w:val="Kommentarzeichen"/>
+              </w:rPr>
+              <w:commentReference w:id="16"/>
             </w:r>
           </w:p>
         </w:tc>
@@ -6349,7 +5997,25 @@
                 <w:sz w:val="20"/>
                 <w:szCs w:val="20"/>
               </w:rPr>
-              <w:t>von Arbeitsmaterial KI-B1.4(</w:t>
+              <w:t>von Arbeitsmaterial KI-B1.4</w:t>
+            </w:r>
+            <w:ins w:id="17" w:author="Ira Diethelm" w:date="2023-06-12T08:55:00Z">
+              <w:r>
+                <w:rPr>
+                  <w:color w:val="000000" w:themeColor="text1"/>
+                  <w:sz w:val="20"/>
+                  <w:szCs w:val="20"/>
+                </w:rPr>
+                <w:t xml:space="preserve"> </w:t>
+              </w:r>
+            </w:ins>
+            <w:r>
+              <w:rPr>
+                <w:color w:val="000000" w:themeColor="text1"/>
+                <w:sz w:val="20"/>
+                <w:szCs w:val="20"/>
+              </w:rPr>
+              <w:t>(</w:t>
             </w:r>
             <w:r>
               <w:rPr>
@@ -6532,6 +6198,13 @@
               </w:rPr>
               <w:t>. im Glossar und in KI-B1.2 Sek. I).</w:t>
             </w:r>
+            <w:commentRangeEnd w:id="15"/>
+            <w:r>
+              <w:rPr>
+                <w:rStyle w:val="Kommentarzeichen"/>
+              </w:rPr>
+              <w:commentReference w:id="15"/>
+            </w:r>
           </w:p>
         </w:tc>
         <w:tc>
@@ -6551,10 +6224,10 @@
       </w:tr>
     </w:tbl>
     <w:p>
-      <w:bookmarkStart w:id="80" w:name="_Toc170047126"/>
-      <w:bookmarkStart w:id="81" w:name="_Toc433103686"/>
-      <w:bookmarkEnd w:id="80"/>
-      <w:bookmarkEnd w:id="81"/>
+      <w:bookmarkStart w:id="18" w:name="_Toc170047126"/>
+      <w:bookmarkStart w:id="19" w:name="_Toc433103686"/>
+      <w:bookmarkEnd w:id="18"/>
+      <w:bookmarkEnd w:id="19"/>
     </w:p>
     <w:p>
       <w:pPr>
@@ -6573,7 +6246,7 @@
         <w:spacing w:before="200" w:after="0"/>
         <w:jc w:val="both"/>
       </w:pPr>
-      <w:bookmarkStart w:id="82" w:name="_Toc88152153"/>
+      <w:bookmarkStart w:id="20" w:name="_Toc88152153"/>
       <w:r>
         <w:rPr>
           <w:rFonts w:asciiTheme="minorHAnsi" w:eastAsiaTheme="minorEastAsia" w:hAnsiTheme="minorHAnsi" w:cstheme="minorBidi"/>
@@ -6581,7 +6254,7 @@
         <w:lastRenderedPageBreak/>
         <w:t>Variante 2: ohne Technik</w:t>
       </w:r>
-      <w:bookmarkEnd w:id="82"/>
+      <w:bookmarkEnd w:id="20"/>
     </w:p>
     <w:tbl>
       <w:tblPr>
@@ -7655,10 +7328,10 @@
     <w:p>
       <w:pPr>
         <w:sectPr>
-          <w:headerReference w:type="default" r:id="rId28"/>
-          <w:footerReference w:type="default" r:id="rId29"/>
-          <w:headerReference w:type="first" r:id="rId30"/>
-          <w:footerReference w:type="first" r:id="rId31"/>
+          <w:headerReference w:type="default" r:id="rId32"/>
+          <w:footerReference w:type="default" r:id="rId33"/>
+          <w:headerReference w:type="first" r:id="rId34"/>
+          <w:footerReference w:type="first" r:id="rId35"/>
           <w:pgSz w:w="16838" w:h="11906" w:orient="landscape"/>
           <w:pgMar w:top="1531" w:right="1134" w:bottom="1134" w:left="1134" w:header="709" w:footer="346" w:gutter="0"/>
           <w:cols w:space="708"/>
@@ -7670,7 +7343,7 @@
       <w:pPr>
         <w:pStyle w:val="berschrift1"/>
       </w:pPr>
-      <w:bookmarkStart w:id="83" w:name="_Toc88152154"/>
+      <w:bookmarkStart w:id="21" w:name="_Toc88152154"/>
       <w:r>
         <w:rPr>
           <w:rFonts w:asciiTheme="minorHAnsi" w:eastAsiaTheme="minorEastAsia" w:hAnsiTheme="minorHAnsi" w:cstheme="minorBidi"/>
@@ -7678,7 +7351,7 @@
         <w:lastRenderedPageBreak/>
         <w:t>Einbettung in verschiedene Fächer und Themen</w:t>
       </w:r>
-      <w:bookmarkEnd w:id="83"/>
+      <w:bookmarkEnd w:id="21"/>
     </w:p>
     <w:p>
       <w:pPr>
@@ -8231,7 +7904,7 @@
       <w:pPr>
         <w:pStyle w:val="berschrift1"/>
       </w:pPr>
-      <w:bookmarkStart w:id="84" w:name="_Toc88152155"/>
+      <w:bookmarkStart w:id="22" w:name="_Toc88152155"/>
       <w:r>
         <w:rPr>
           <w:rFonts w:asciiTheme="minorHAnsi" w:eastAsiaTheme="minorEastAsia" w:hAnsiTheme="minorHAnsi" w:cstheme="minorHAnsi"/>
@@ -8239,7 +7912,7 @@
         <w:lastRenderedPageBreak/>
         <w:t>Anschlussthemen</w:t>
       </w:r>
-      <w:bookmarkEnd w:id="84"/>
+      <w:bookmarkEnd w:id="22"/>
     </w:p>
     <w:p>
       <w:pPr>
@@ -8330,7 +8003,7 @@
                               </pic:cNvPicPr>
                             </pic:nvPicPr>
                             <pic:blipFill>
-                              <a:blip r:embed="rId32"/>
+                              <a:blip r:embed="rId36"/>
                               <a:stretch/>
                             </pic:blipFill>
                             <pic:spPr bwMode="auto">
@@ -8368,7 +8041,7 @@
                     </v:shapetype>
                     <v:shape id="_x0000_i26" o:spid="_x0000_s26" type="#_x0000_t75" style="mso-wrap-distance-left:0.0pt;mso-wrap-distance-top:0.0pt;mso-wrap-distance-right:0.0pt;mso-wrap-distance-bottom:0.0pt;width:115.5pt;height:84.0pt;" stroked="false">
                       <v:path textboxrect="0,0,0,0"/>
-                      <v:imagedata r:id="rId36" o:title=""/>
+                      <v:imagedata r:id="rId37" o:title=""/>
                     </v:shape>
                   </w:pict>
                 </mc:Fallback>
@@ -8427,7 +8100,7 @@
                               </pic:cNvPicPr>
                             </pic:nvPicPr>
                             <pic:blipFill>
-                              <a:blip r:embed="rId37"/>
+                              <a:blip r:embed="rId38"/>
                               <a:stretch/>
                             </pic:blipFill>
                             <pic:spPr bwMode="auto">
@@ -8465,7 +8138,7 @@
                     </v:shapetype>
                     <v:shape id="_x0000_i27" o:spid="_x0000_s27" type="#_x0000_t75" style="mso-wrap-distance-left:0.0pt;mso-wrap-distance-top:0.0pt;mso-wrap-distance-right:0.0pt;mso-wrap-distance-bottom:0.0pt;width:115.5pt;height:84.0pt;" stroked="false">
                       <v:path textboxrect="0,0,0,0"/>
-                      <v:imagedata r:id="rId38" o:title=""/>
+                      <v:imagedata r:id="rId39" o:title=""/>
                     </v:shape>
                   </w:pict>
                 </mc:Fallback>
@@ -8524,7 +8197,7 @@
                               </pic:cNvPicPr>
                             </pic:nvPicPr>
                             <pic:blipFill>
-                              <a:blip r:embed="rId39"/>
+                              <a:blip r:embed="rId40"/>
                               <a:stretch/>
                             </pic:blipFill>
                             <pic:spPr bwMode="auto">
@@ -8562,7 +8235,7 @@
                     </v:shapetype>
                     <v:shape id="_x0000_i28" o:spid="_x0000_s28" type="#_x0000_t75" style="mso-wrap-distance-left:0.0pt;mso-wrap-distance-top:0.0pt;mso-wrap-distance-right:0.0pt;mso-wrap-distance-bottom:0.0pt;width:116.2pt;height:84.0pt;" stroked="false">
                       <v:path textboxrect="0,0,0,0"/>
-                      <v:imagedata r:id="rId40" o:title=""/>
+                      <v:imagedata r:id="rId41" o:title=""/>
                     </v:shape>
                   </w:pict>
                 </mc:Fallback>
@@ -8649,7 +8322,7 @@
                               </pic:cNvPicPr>
                             </pic:nvPicPr>
                             <pic:blipFill>
-                              <a:blip r:embed="rId41"/>
+                              <a:blip r:embed="rId42"/>
                               <a:stretch/>
                             </pic:blipFill>
                             <pic:spPr bwMode="auto">
@@ -8687,7 +8360,7 @@
                     </v:shapetype>
                     <v:shape id="_x0000_i29" o:spid="_x0000_s29" type="#_x0000_t75" style="mso-wrap-distance-left:0.0pt;mso-wrap-distance-top:0.0pt;mso-wrap-distance-right:0.0pt;mso-wrap-distance-bottom:0.0pt;width:125.1pt;height:88.3pt;" stroked="false">
                       <v:path textboxrect="0,0,0,0"/>
-                      <v:imagedata r:id="rId42" o:title=""/>
+                      <v:imagedata r:id="rId43" o:title=""/>
                     </v:shape>
                   </w:pict>
                 </mc:Fallback>
@@ -8746,7 +8419,7 @@
                               </pic:cNvPicPr>
                             </pic:nvPicPr>
                             <pic:blipFill>
-                              <a:blip r:embed="rId32"/>
+                              <a:blip r:embed="rId36"/>
                               <a:stretch/>
                             </pic:blipFill>
                             <pic:spPr bwMode="auto">
@@ -8784,7 +8457,7 @@
                     </v:shapetype>
                     <v:shape id="_x0000_i30" o:spid="_x0000_s30" type="#_x0000_t75" style="mso-wrap-distance-left:0.0pt;mso-wrap-distance-top:0.0pt;mso-wrap-distance-right:0.0pt;mso-wrap-distance-bottom:0.0pt;width:115.5pt;height:84.0pt;" stroked="false">
                       <v:path textboxrect="0,0,0,0"/>
-                      <v:imagedata r:id="rId36" o:title=""/>
+                      <v:imagedata r:id="rId37" o:title=""/>
                     </v:shape>
                   </w:pict>
                 </mc:Fallback>
@@ -8843,7 +8516,7 @@
                               </pic:cNvPicPr>
                             </pic:nvPicPr>
                             <pic:blipFill>
-                              <a:blip r:embed="rId39"/>
+                              <a:blip r:embed="rId40"/>
                               <a:stretch/>
                             </pic:blipFill>
                             <pic:spPr bwMode="auto">
@@ -8881,7 +8554,7 @@
                     </v:shapetype>
                     <v:shape id="_x0000_i31" o:spid="_x0000_s31" type="#_x0000_t75" style="mso-wrap-distance-left:0.0pt;mso-wrap-distance-top:0.0pt;mso-wrap-distance-right:0.0pt;mso-wrap-distance-bottom:0.0pt;width:116.2pt;height:84.0pt;" stroked="false">
                       <v:path textboxrect="0,0,0,0"/>
-                      <v:imagedata r:id="rId40" o:title=""/>
+                      <v:imagedata r:id="rId41" o:title=""/>
                     </v:shape>
                   </w:pict>
                 </mc:Fallback>
@@ -8896,14 +8569,14 @@
       <w:pPr>
         <w:pStyle w:val="berschrift1"/>
       </w:pPr>
-      <w:bookmarkStart w:id="85" w:name="_Toc88152156"/>
+      <w:bookmarkStart w:id="23" w:name="_Toc88152156"/>
       <w:r>
         <w:rPr>
           <w:rFonts w:asciiTheme="minorHAnsi" w:eastAsiaTheme="minorEastAsia" w:hAnsiTheme="minorHAnsi" w:cstheme="minorHAnsi"/>
         </w:rPr>
         <w:t>Literatur und Links</w:t>
       </w:r>
-      <w:bookmarkEnd w:id="85"/>
+      <w:bookmarkEnd w:id="23"/>
     </w:p>
     <w:p>
       <w:pPr>
@@ -9092,7 +8765,7 @@
       <w:pPr>
         <w:pStyle w:val="berschrift1"/>
       </w:pPr>
-      <w:bookmarkStart w:id="86" w:name="_Toc88152157"/>
+      <w:bookmarkStart w:id="24" w:name="_Toc88152157"/>
       <w:r>
         <w:rPr>
           <w:rFonts w:asciiTheme="minorHAnsi" w:eastAsiaTheme="minorEastAsia" w:hAnsiTheme="minorHAnsi" w:cstheme="minorHAnsi"/>
@@ -9100,7 +8773,7 @@
         <w:lastRenderedPageBreak/>
         <w:t>Arbeitsmaterialien</w:t>
       </w:r>
-      <w:bookmarkEnd w:id="86"/>
+      <w:bookmarkEnd w:id="24"/>
     </w:p>
     <w:tbl>
       <w:tblPr>
@@ -9934,7 +9607,7 @@
       <w:pPr>
         <w:spacing w:after="0" w:line="240" w:lineRule="auto"/>
       </w:pPr>
-      <w:bookmarkStart w:id="87" w:name="_Toc435548213"/>
+      <w:bookmarkStart w:id="25" w:name="_Toc435548213"/>
       <w:r>
         <w:rPr>
           <w:rFonts w:asciiTheme="minorHAnsi" w:eastAsiaTheme="minorEastAsia" w:hAnsiTheme="minorHAnsi" w:cstheme="minorHAnsi"/>
@@ -9989,7 +9662,7 @@
       <w:pPr>
         <w:spacing w:line="259" w:lineRule="auto"/>
         <w:rPr>
-          <w:rFonts w:ascii="helvetica 65" w:hAnsi="helvetica 65"/>
+          <w:rFonts w:ascii="Helvetica 65" w:hAnsi="Helvetica 65"/>
           <w:bCs w:val="0"/>
           <w:color w:val="000000"/>
           <w:sz w:val="28"/>
@@ -10009,7 +9682,7 @@
       <w:pPr>
         <w:pStyle w:val="berschrift1"/>
       </w:pPr>
-      <w:bookmarkStart w:id="88" w:name="_Toc88152158"/>
+      <w:bookmarkStart w:id="26" w:name="_Toc88152158"/>
       <w:r>
         <w:rPr>
           <w:rFonts w:asciiTheme="minorHAnsi" w:eastAsiaTheme="minorEastAsia" w:hAnsiTheme="minorHAnsi" w:cstheme="minorHAnsi"/>
@@ -10017,8 +9690,8 @@
         <w:lastRenderedPageBreak/>
         <w:t>Glossar</w:t>
       </w:r>
-      <w:bookmarkEnd w:id="87"/>
-      <w:bookmarkEnd w:id="88"/>
+      <w:bookmarkEnd w:id="25"/>
+      <w:bookmarkEnd w:id="26"/>
     </w:p>
     <w:tbl>
       <w:tblPr>
@@ -10344,17 +10017,17 @@
       <w:pPr>
         <w:pStyle w:val="berschrift1"/>
       </w:pPr>
-      <w:bookmarkStart w:id="89" w:name="_Toc24112811"/>
-      <w:bookmarkStart w:id="90" w:name="_Toc88152159"/>
+      <w:bookmarkStart w:id="27" w:name="_Toc24112811"/>
+      <w:bookmarkStart w:id="28" w:name="_Toc88152159"/>
       <w:r>
         <w:lastRenderedPageBreak/>
         <w:t>F</w:t>
       </w:r>
-      <w:bookmarkEnd w:id="89"/>
+      <w:bookmarkEnd w:id="27"/>
       <w:r>
         <w:t>ragen, Feedback, Anregungen</w:t>
       </w:r>
-      <w:bookmarkEnd w:id="90"/>
+      <w:bookmarkEnd w:id="28"/>
     </w:p>
     <w:p>
       <w:pPr>
@@ -10403,7 +10076,7 @@
       <w:r>
         <w:t xml:space="preserve"> aus: </w:t>
       </w:r>
-      <w:hyperlink r:id="rId43" w:history="1">
+      <w:hyperlink r:id="rId44" w:history="1">
         <w:r>
           <w:rPr>
             <w:rStyle w:val="Hyperlink"/>
@@ -10454,7 +10127,7 @@
                     <pic:cNvPicPr/>
                   </pic:nvPicPr>
                   <pic:blipFill>
-                    <a:blip r:embed="rId44">
+                    <a:blip r:embed="rId45">
                       <a:extLst>
                         <a:ext uri="{28A0092B-C50C-407E-A947-70E740481C1C}">
                           <a14:useLocalDpi xmlns:a14="http://schemas.microsoft.com/office/drawing/2010/main"/>
@@ -10488,7 +10161,7 @@
       <w:r>
         <w:t xml:space="preserve">Sie können sich auch gerne unter </w:t>
       </w:r>
-      <w:hyperlink r:id="rId45" w:history="1">
+      <w:hyperlink r:id="rId46" w:history="1">
         <w:r>
           <w:rPr>
             <w:rStyle w:val="Hyperlink"/>
@@ -10507,8 +10180,8 @@
       </w:pPr>
     </w:p>
     <w:sectPr>
-      <w:headerReference w:type="default" r:id="rId46"/>
-      <w:footerReference w:type="default" r:id="rId47"/>
+      <w:headerReference w:type="default" r:id="rId47"/>
+      <w:footerReference w:type="default" r:id="rId48"/>
       <w:pgSz w:w="11906" w:h="16838"/>
       <w:pgMar w:top="1134" w:right="1531" w:bottom="1276" w:left="1531" w:header="709" w:footer="323" w:gutter="0"/>
       <w:cols w:space="708"/>
@@ -10516,6 +10189,64 @@
     </w:sectPr>
   </w:body>
 </w:document>
+</file>
+
+<file path=word/comments.xml><?xml version="1.0" encoding="utf-8"?>
+<w:comments xmlns:wpc="http://schemas.microsoft.com/office/word/2010/wordprocessingCanvas" xmlns:cx="http://schemas.microsoft.com/office/drawing/2014/chartex" xmlns:cx1="http://schemas.microsoft.com/office/drawing/2015/9/8/chartex" xmlns:cx2="http://schemas.microsoft.com/office/drawing/2015/10/21/chartex" xmlns:cx3="http://schemas.microsoft.com/office/drawing/2016/5/9/chartex" xmlns:cx4="http://schemas.microsoft.com/office/drawing/2016/5/10/chartex" xmlns:cx5="http://schemas.microsoft.com/office/drawing/2016/5/11/chartex" xmlns:cx6="http://schemas.microsoft.com/office/drawing/2016/5/12/chartex" xmlns:cx7="http://schemas.microsoft.com/office/drawing/2016/5/13/chartex" xmlns:cx8="http://schemas.microsoft.com/office/drawing/2016/5/14/chartex" xmlns:mc="http://schemas.openxmlformats.org/markup-compatibility/2006" xmlns:aink="http://schemas.microsoft.com/office/drawing/2016/ink" xmlns:am3d="http://schemas.microsoft.com/office/drawing/2017/model3d" xmlns:o="urn:schemas-microsoft-com:office:office" xmlns:oel="http://schemas.microsoft.com/office/2019/extlst" xmlns:r="http://schemas.openxmlformats.org/officeDocument/2006/relationships" xmlns:m="http://schemas.openxmlformats.org/officeDocument/2006/math" xmlns:v="urn:schemas-microsoft-com:vml" xmlns:wp14="http://schemas.microsoft.com/office/word/2010/wordprocessingDrawing" xmlns:wp="http://schemas.openxmlformats.org/drawingml/2006/wordprocessingDrawing" xmlns:w10="urn:schemas-microsoft-com:office:word" xmlns:w="http://schemas.openxmlformats.org/wordprocessingml/2006/main" xmlns:w14="http://schemas.microsoft.com/office/word/2010/wordml" xmlns:w15="http://schemas.microsoft.com/office/word/2012/wordml" xmlns:w16cex="http://schemas.microsoft.com/office/word/2018/wordml/cex" xmlns:w16cid="http://schemas.microsoft.com/office/word/2016/wordml/cid" xmlns:w16="http://schemas.microsoft.com/office/word/2018/wordml" xmlns:w16du="http://schemas.microsoft.com/office/word/2023/wordml/word16du" xmlns:w16sdtdh="http://schemas.microsoft.com/office/word/2020/wordml/sdtdatahash" xmlns:w16se="http://schemas.microsoft.com/office/word/2015/wordml/symex" xmlns:wpg="http://schemas.microsoft.com/office/word/2010/wordprocessingGroup" xmlns:wpi="http://schemas.microsoft.com/office/word/2010/wordprocessingInk" xmlns:wne="http://schemas.microsoft.com/office/word/2006/wordml" xmlns:wps="http://schemas.microsoft.com/office/word/2010/wordprocessingShape" mc:Ignorable="w14 w15 w16se w16cid w16 w16cex w16sdtdh wp14">
+  <w:comment w:id="16" w:author="Ira Diethelm" w:date="2023-06-12T08:54:00Z" w:initials="ID">
+    <w:p>
+      <w:pPr>
+        <w:pStyle w:val="Kommentartext"/>
+      </w:pPr>
+      <w:r>
+        <w:rPr>
+          <w:rStyle w:val="Kommentarzeichen"/>
+        </w:rPr>
+        <w:annotationRef/>
+      </w:r>
+      <w:r>
+        <w:t>Todo checken ob das noch stimmt</w:t>
+      </w:r>
+    </w:p>
+  </w:comment>
+  <w:comment w:id="15" w:author="Ira Diethelm" w:date="2023-06-12T08:55:00Z" w:initials="ID">
+    <w:p>
+      <w:pPr>
+        <w:pStyle w:val="Kommentartext"/>
+      </w:pPr>
+      <w:r>
+        <w:rPr>
+          <w:rStyle w:val="Kommentarzeichen"/>
+        </w:rPr>
+        <w:annotationRef/>
+      </w:r>
+      <w:r>
+        <w:t>Todo ganze Tabelle checken, ob das noch stimmt. Nach Seiten , Aufgaben usw. suchen</w:t>
+      </w:r>
+    </w:p>
+  </w:comment>
+</w:comments>
+</file>
+
+<file path=word/commentsExtended.xml><?xml version="1.0" encoding="utf-8"?>
+<w15:commentsEx xmlns:wpc="http://schemas.microsoft.com/office/word/2010/wordprocessingCanvas" xmlns:cx="http://schemas.microsoft.com/office/drawing/2014/chartex" xmlns:cx1="http://schemas.microsoft.com/office/drawing/2015/9/8/chartex" xmlns:cx2="http://schemas.microsoft.com/office/drawing/2015/10/21/chartex" xmlns:cx3="http://schemas.microsoft.com/office/drawing/2016/5/9/chartex" xmlns:cx4="http://schemas.microsoft.com/office/drawing/2016/5/10/chartex" xmlns:cx5="http://schemas.microsoft.com/office/drawing/2016/5/11/chartex" xmlns:cx6="http://schemas.microsoft.com/office/drawing/2016/5/12/chartex" xmlns:cx7="http://schemas.microsoft.com/office/drawing/2016/5/13/chartex" xmlns:cx8="http://schemas.microsoft.com/office/drawing/2016/5/14/chartex" xmlns:mc="http://schemas.openxmlformats.org/markup-compatibility/2006" xmlns:aink="http://schemas.microsoft.com/office/drawing/2016/ink" xmlns:am3d="http://schemas.microsoft.com/office/drawing/2017/model3d" xmlns:o="urn:schemas-microsoft-com:office:office" xmlns:oel="http://schemas.microsoft.com/office/2019/extlst" xmlns:r="http://schemas.openxmlformats.org/officeDocument/2006/relationships" xmlns:m="http://schemas.openxmlformats.org/officeDocument/2006/math" xmlns:v="urn:schemas-microsoft-com:vml" xmlns:wp14="http://schemas.microsoft.com/office/word/2010/wordprocessingDrawing" xmlns:wp="http://schemas.openxmlformats.org/drawingml/2006/wordprocessingDrawing" xmlns:w10="urn:schemas-microsoft-com:office:word" xmlns:w="http://schemas.openxmlformats.org/wordprocessingml/2006/main" xmlns:w14="http://schemas.microsoft.com/office/word/2010/wordml" xmlns:w15="http://schemas.microsoft.com/office/word/2012/wordml" xmlns:w16cex="http://schemas.microsoft.com/office/word/2018/wordml/cex" xmlns:w16cid="http://schemas.microsoft.com/office/word/2016/wordml/cid" xmlns:w16="http://schemas.microsoft.com/office/word/2018/wordml" xmlns:w16du="http://schemas.microsoft.com/office/word/2023/wordml/word16du" xmlns:w16sdtdh="http://schemas.microsoft.com/office/word/2020/wordml/sdtdatahash" xmlns:w16se="http://schemas.microsoft.com/office/word/2015/wordml/symex" xmlns:wpg="http://schemas.microsoft.com/office/word/2010/wordprocessingGroup" xmlns:wpi="http://schemas.microsoft.com/office/word/2010/wordprocessingInk" xmlns:wne="http://schemas.microsoft.com/office/word/2006/wordml" xmlns:wps="http://schemas.microsoft.com/office/word/2010/wordprocessingShape" mc:Ignorable="w14 w15 w16se w16cid w16 w16cex w16sdtdh wp14">
+  <w15:commentEx w15:paraId="6F83D8A6" w15:done="0"/>
+  <w15:commentEx w15:paraId="0D673031" w15:done="0"/>
+</w15:commentsEx>
+</file>
+
+<file path=word/commentsExtensible.xml><?xml version="1.0" encoding="utf-8"?>
+<w16cex:commentsExtensible xmlns:wpc="http://schemas.microsoft.com/office/word/2010/wordprocessingCanvas" xmlns:cx="http://schemas.microsoft.com/office/drawing/2014/chartex" xmlns:cx1="http://schemas.microsoft.com/office/drawing/2015/9/8/chartex" xmlns:cx2="http://schemas.microsoft.com/office/drawing/2015/10/21/chartex" xmlns:cx3="http://schemas.microsoft.com/office/drawing/2016/5/9/chartex" xmlns:cx4="http://schemas.microsoft.com/office/drawing/2016/5/10/chartex" xmlns:cx5="http://schemas.microsoft.com/office/drawing/2016/5/11/chartex" xmlns:cx6="http://schemas.microsoft.com/office/drawing/2016/5/12/chartex" xmlns:cx7="http://schemas.microsoft.com/office/drawing/2016/5/13/chartex" xmlns:cx8="http://schemas.microsoft.com/office/drawing/2016/5/14/chartex" xmlns:mc="http://schemas.openxmlformats.org/markup-compatibility/2006" xmlns:aink="http://schemas.microsoft.com/office/drawing/2016/ink" xmlns:am3d="http://schemas.microsoft.com/office/drawing/2017/model3d" xmlns:o="urn:schemas-microsoft-com:office:office" xmlns:oel="http://schemas.microsoft.com/office/2019/extlst" xmlns:r="http://schemas.openxmlformats.org/officeDocument/2006/relationships" xmlns:m="http://schemas.openxmlformats.org/officeDocument/2006/math" xmlns:v="urn:schemas-microsoft-com:vml" xmlns:wp14="http://schemas.microsoft.com/office/word/2010/wordprocessingDrawing" xmlns:wp="http://schemas.openxmlformats.org/drawingml/2006/wordprocessingDrawing" xmlns:w10="urn:schemas-microsoft-com:office:word" xmlns:w="http://schemas.openxmlformats.org/wordprocessingml/2006/main" xmlns:w14="http://schemas.microsoft.com/office/word/2010/wordml" xmlns:w15="http://schemas.microsoft.com/office/word/2012/wordml" xmlns:w16cex="http://schemas.microsoft.com/office/word/2018/wordml/cex" xmlns:w16cid="http://schemas.microsoft.com/office/word/2016/wordml/cid" xmlns:w16="http://schemas.microsoft.com/office/word/2018/wordml" xmlns:w16du="http://schemas.microsoft.com/office/word/2023/wordml/word16du" xmlns:w16sdtdh="http://schemas.microsoft.com/office/word/2020/wordml/sdtdatahash" xmlns:w16se="http://schemas.microsoft.com/office/word/2015/wordml/symex" xmlns:wpg="http://schemas.microsoft.com/office/word/2010/wordprocessingGroup" xmlns:wpi="http://schemas.microsoft.com/office/word/2010/wordprocessingInk" xmlns:wne="http://schemas.microsoft.com/office/word/2006/wordml" xmlns:wps="http://schemas.microsoft.com/office/word/2010/wordprocessingShape" mc:Ignorable="w14 w15 w16se w16cid w16 w16cex w16sdtdh wp14">
+  <w16cex:commentExtensible w16cex:durableId="28315BD8" w16cex:dateUtc="2023-06-12T06:54:00Z"/>
+  <w16cex:commentExtensible w16cex:durableId="28315C08" w16cex:dateUtc="2023-06-12T06:55:00Z"/>
+</w16cex:commentsExtensible>
+</file>
+
+<file path=word/commentsIds.xml><?xml version="1.0" encoding="utf-8"?>
+<w16cid:commentsIds xmlns:wpc="http://schemas.microsoft.com/office/word/2010/wordprocessingCanvas" xmlns:cx="http://schemas.microsoft.com/office/drawing/2014/chartex" xmlns:cx1="http://schemas.microsoft.com/office/drawing/2015/9/8/chartex" xmlns:cx2="http://schemas.microsoft.com/office/drawing/2015/10/21/chartex" xmlns:cx3="http://schemas.microsoft.com/office/drawing/2016/5/9/chartex" xmlns:cx4="http://schemas.microsoft.com/office/drawing/2016/5/10/chartex" xmlns:cx5="http://schemas.microsoft.com/office/drawing/2016/5/11/chartex" xmlns:cx6="http://schemas.microsoft.com/office/drawing/2016/5/12/chartex" xmlns:cx7="http://schemas.microsoft.com/office/drawing/2016/5/13/chartex" xmlns:cx8="http://schemas.microsoft.com/office/drawing/2016/5/14/chartex" xmlns:mc="http://schemas.openxmlformats.org/markup-compatibility/2006" xmlns:aink="http://schemas.microsoft.com/office/drawing/2016/ink" xmlns:am3d="http://schemas.microsoft.com/office/drawing/2017/model3d" xmlns:o="urn:schemas-microsoft-com:office:office" xmlns:oel="http://schemas.microsoft.com/office/2019/extlst" xmlns:r="http://schemas.openxmlformats.org/officeDocument/2006/relationships" xmlns:m="http://schemas.openxmlformats.org/officeDocument/2006/math" xmlns:v="urn:schemas-microsoft-com:vml" xmlns:wp14="http://schemas.microsoft.com/office/word/2010/wordprocessingDrawing" xmlns:wp="http://schemas.openxmlformats.org/drawingml/2006/wordprocessingDrawing" xmlns:w10="urn:schemas-microsoft-com:office:word" xmlns:w="http://schemas.openxmlformats.org/wordprocessingml/2006/main" xmlns:w14="http://schemas.microsoft.com/office/word/2010/wordml" xmlns:w15="http://schemas.microsoft.com/office/word/2012/wordml" xmlns:w16cex="http://schemas.microsoft.com/office/word/2018/wordml/cex" xmlns:w16cid="http://schemas.microsoft.com/office/word/2016/wordml/cid" xmlns:w16="http://schemas.microsoft.com/office/word/2018/wordml" xmlns:w16du="http://schemas.microsoft.com/office/word/2023/wordml/word16du" xmlns:w16sdtdh="http://schemas.microsoft.com/office/word/2020/wordml/sdtdatahash" xmlns:w16se="http://schemas.microsoft.com/office/word/2015/wordml/symex" xmlns:wpg="http://schemas.microsoft.com/office/word/2010/wordprocessingGroup" xmlns:wpi="http://schemas.microsoft.com/office/word/2010/wordprocessingInk" xmlns:wne="http://schemas.microsoft.com/office/word/2006/wordml" xmlns:wps="http://schemas.microsoft.com/office/word/2010/wordprocessingShape" mc:Ignorable="w14 w15 w16se w16cid w16 w16cex w16sdtdh wp14">
+  <w16cid:commentId w16cid:paraId="6F83D8A6" w16cid:durableId="28315BD8"/>
+  <w16cid:commentId w16cid:paraId="0D673031" w16cid:durableId="28315C08"/>
+</w16cid:commentsIds>
 </file>
 
 <file path=word/endnotes.xml><?xml version="1.0" encoding="utf-8"?>
@@ -10696,7 +10427,7 @@
                             </w:pPr>
                             <w:r>
                               <w:rPr>
-                                <w:rFonts w:ascii="helvetica 55" w:hAnsi="helvetica 55"/>
+                                <w:rFonts w:ascii="Helvetica 55" w:hAnsi="Helvetica 55"/>
                                 <w:color w:val="A6A6A6" w:themeColor="background1" w:themeShade="A6"/>
                                 <w:sz w:val="14"/>
                                 <w:szCs w:val="14"/>
@@ -10949,8 +10680,8 @@
         <w:szCs w:val="18"/>
       </w:rPr>
     </w:pPr>
-    <w:bookmarkStart w:id="76" w:name="_Hlk58245454"/>
-    <w:bookmarkStart w:id="77" w:name="_Hlk58245455"/>
+    <w:bookmarkStart w:id="11" w:name="_Hlk58245454"/>
+    <w:bookmarkStart w:id="12" w:name="_Hlk58245455"/>
     <w:r>
       <w:rPr>
         <w:noProof/>
@@ -11291,8 +11022,8 @@
       <w:tab/>
       <w:t xml:space="preserve">         </w:t>
     </w:r>
-    <w:bookmarkEnd w:id="76"/>
-    <w:bookmarkEnd w:id="77"/>
+    <w:bookmarkEnd w:id="11"/>
+    <w:bookmarkEnd w:id="12"/>
   </w:p>
   <w:p>
     <w:pPr>
@@ -11528,7 +11259,7 @@
         <w:noProof/>
         <w:sz w:val="18"/>
       </w:rPr>
-      <w:t>06.06.23</w:t>
+      <w:t>12.06.23</w:t>
     </w:r>
     <w:r>
       <w:rPr>
@@ -11814,7 +11545,7 @@
                             </w:pPr>
                             <w:r>
                               <w:rPr>
-                                <w:rFonts w:ascii="helvetica 55" w:hAnsi="helvetica 55"/>
+                                <w:rFonts w:ascii="Helvetica 55" w:hAnsi="Helvetica 55"/>
                                 <w:color w:val="A6A6A6" w:themeColor="background1" w:themeShade="A6"/>
                                 <w:sz w:val="14"/>
                                 <w:szCs w:val="14"/>
@@ -11826,7 +11557,7 @@
                             <w:pPr>
                               <w:spacing w:line="160" w:lineRule="exact"/>
                               <w:rPr>
-                                <w:rFonts w:ascii="helvetica 55" w:hAnsi="helvetica 55"/>
+                                <w:rFonts w:ascii="Helvetica 55" w:hAnsi="Helvetica 55"/>
                                 <w:color w:val="A6A6A6"/>
                                 <w:sz w:val="14"/>
                                 <w:szCs w:val="14"/>
@@ -12023,7 +11754,7 @@
         <w:noProof/>
         <w:sz w:val="18"/>
       </w:rPr>
-      <w:t>06.06.23</w:t>
+      <w:t>12.06.23</w:t>
     </w:r>
     <w:r>
       <w:rPr>
@@ -12196,8 +11927,8 @@
 
 <file path=word/header1.xml><?xml version="1.0" encoding="utf-8"?>
 <w:hdr xmlns:wpc="http://schemas.microsoft.com/office/word/2010/wordprocessingCanvas" xmlns:cx="http://schemas.microsoft.com/office/drawing/2014/chartex" xmlns:cx1="http://schemas.microsoft.com/office/drawing/2015/9/8/chartex" xmlns:cx2="http://schemas.microsoft.com/office/drawing/2015/10/21/chartex" xmlns:cx3="http://schemas.microsoft.com/office/drawing/2016/5/9/chartex" xmlns:cx4="http://schemas.microsoft.com/office/drawing/2016/5/10/chartex" xmlns:cx5="http://schemas.microsoft.com/office/drawing/2016/5/11/chartex" xmlns:cx6="http://schemas.microsoft.com/office/drawing/2016/5/12/chartex" xmlns:cx7="http://schemas.microsoft.com/office/drawing/2016/5/13/chartex" xmlns:cx8="http://schemas.microsoft.com/office/drawing/2016/5/14/chartex" xmlns:mc="http://schemas.openxmlformats.org/markup-compatibility/2006" xmlns:aink="http://schemas.microsoft.com/office/drawing/2016/ink" xmlns:am3d="http://schemas.microsoft.com/office/drawing/2017/model3d" xmlns:o="urn:schemas-microsoft-com:office:office" xmlns:oel="http://schemas.microsoft.com/office/2019/extlst" xmlns:r="http://schemas.openxmlformats.org/officeDocument/2006/relationships" xmlns:m="http://schemas.openxmlformats.org/officeDocument/2006/math" xmlns:v="urn:schemas-microsoft-com:vml" xmlns:wp14="http://schemas.microsoft.com/office/word/2010/wordprocessingDrawing" xmlns:wp="http://schemas.openxmlformats.org/drawingml/2006/wordprocessingDrawing" xmlns:w10="urn:schemas-microsoft-com:office:word" xmlns:w="http://schemas.openxmlformats.org/wordprocessingml/2006/main" xmlns:w14="http://schemas.microsoft.com/office/word/2010/wordml" xmlns:w15="http://schemas.microsoft.com/office/word/2012/wordml" xmlns:w16cex="http://schemas.microsoft.com/office/word/2018/wordml/cex" xmlns:w16cid="http://schemas.microsoft.com/office/word/2016/wordml/cid" xmlns:w16="http://schemas.microsoft.com/office/word/2018/wordml" xmlns:w16du="http://schemas.microsoft.com/office/word/2023/wordml/word16du" xmlns:w16sdtdh="http://schemas.microsoft.com/office/word/2020/wordml/sdtdatahash" xmlns:w16se="http://schemas.microsoft.com/office/word/2015/wordml/symex" xmlns:wpg="http://schemas.microsoft.com/office/word/2010/wordprocessingGroup" xmlns:wpi="http://schemas.microsoft.com/office/word/2010/wordprocessingInk" xmlns:wne="http://schemas.microsoft.com/office/word/2006/wordml" xmlns:wps="http://schemas.microsoft.com/office/word/2010/wordprocessingShape" mc:Ignorable="w14 w15 w16se w16cid w16 w16cex w16sdtdh wp14">
-  <w:bookmarkStart w:id="74" w:name="_Hlk58245611"/>
-  <w:bookmarkStart w:id="75" w:name="_Hlk58245612"/>
+  <w:bookmarkStart w:id="9" w:name="_Hlk58245611"/>
+  <w:bookmarkStart w:id="10" w:name="_Hlk58245612"/>
   <w:p>
     <w:pPr>
       <w:pStyle w:val="Kopfzeile"/>
@@ -12333,8 +12064,8 @@
       </w:rPr>
       <w:tab/>
     </w:r>
-    <w:bookmarkEnd w:id="74"/>
-    <w:bookmarkEnd w:id="75"/>
+    <w:bookmarkEnd w:id="9"/>
+    <w:bookmarkEnd w:id="10"/>
   </w:p>
   <w:p>
     <w:pPr>
@@ -12508,7 +12239,7 @@
                             </w:pPr>
                             <w:r>
                               <w:rPr>
-                                <w:rFonts w:ascii="helvetica 55" w:hAnsi="helvetica 55"/>
+                                <w:rFonts w:ascii="Helvetica 55" w:hAnsi="Helvetica 55"/>
                                 <w:color w:val="A6A6A6" w:themeColor="background1" w:themeShade="A6"/>
                                 <w:sz w:val="14"/>
                                 <w:szCs w:val="14"/>
@@ -12520,7 +12251,7 @@
                             <w:pPr>
                               <w:spacing w:line="160" w:lineRule="exact"/>
                               <w:rPr>
-                                <w:rFonts w:ascii="helvetica 55" w:hAnsi="helvetica 55"/>
+                                <w:rFonts w:ascii="Helvetica 55" w:hAnsi="Helvetica 55"/>
                                 <w:color w:val="A6A6A6"/>
                                 <w:sz w:val="14"/>
                                 <w:szCs w:val="14"/>
@@ -16640,7 +16371,7 @@
         <w:ind w:left="720" w:hanging="360"/>
       </w:pPr>
       <w:rPr>
-        <w:rFonts w:ascii="helvetica 45" w:eastAsia="Arial" w:hAnsi="helvetica 45" w:cs="Arial" w:hint="default"/>
+        <w:rFonts w:ascii="Helvetica 45" w:eastAsia="Arial" w:hAnsi="Helvetica 45" w:cs="Arial" w:hint="default"/>
       </w:rPr>
     </w:lvl>
     <w:lvl w:ilvl="1" w:tplc="B3289F24">
@@ -30304,7 +30035,7 @@
     <w:link w:val="Listenabsatz"/>
     <w:uiPriority w:val="34"/>
     <w:rPr>
-      <w:rFonts w:ascii="helvetica 45" w:eastAsia="Arial" w:hAnsi="helvetica 45"/>
+      <w:rFonts w:ascii="Helvetica 45" w:eastAsia="Arial" w:hAnsi="Helvetica 45"/>
       <w:bCs/>
       <w:sz w:val="21"/>
       <w:lang w:eastAsia="de-DE"/>
@@ -30315,7 +30046,7 @@
     <w:basedOn w:val="ListenabsatzZchn"/>
     <w:link w:val="Listenabsatz-1-facherZeilenabstand"/>
     <w:rPr>
-      <w:rFonts w:ascii="helvetica 45" w:eastAsia="Arial" w:hAnsi="helvetica 45"/>
+      <w:rFonts w:ascii="Helvetica 45" w:eastAsia="Arial" w:hAnsi="Helvetica 45"/>
       <w:bCs/>
       <w:sz w:val="21"/>
       <w:lang w:eastAsia="de-DE"/>
@@ -30331,7 +30062,7 @@
     <w:link w:val="WF-InhaltsverzeichnisZchn"/>
     <w:qFormat/>
     <w:rPr>
-      <w:rFonts w:ascii="helvetica 65" w:hAnsi="helvetica 65"/>
+      <w:rFonts w:ascii="Helvetica 65" w:hAnsi="Helvetica 65"/>
       <w:color w:val="000000" w:themeColor="text1"/>
       <w:sz w:val="28"/>
       <w:szCs w:val="36"/>
@@ -30342,7 +30073,7 @@
     <w:basedOn w:val="berschrift1Zchn"/>
     <w:link w:val="WF-Inhaltsverzeichnis"/>
     <w:rPr>
-      <w:rFonts w:ascii="helvetica 65" w:eastAsia="Arial" w:hAnsi="helvetica 65" w:cs="Arial"/>
+      <w:rFonts w:ascii="Helvetica 65" w:eastAsia="Arial" w:hAnsi="Helvetica 65" w:cs="Arial"/>
       <w:b/>
       <w:bCs/>
       <w:color w:val="000000" w:themeColor="text1"/>
@@ -30368,7 +30099,7 @@
     <w:basedOn w:val="ListenabsatzZchn"/>
     <w:link w:val="WF-Listenabsatz-1-facherZeilenabstand"/>
     <w:rPr>
-      <w:rFonts w:ascii="helvetica 45" w:eastAsia="Arial" w:hAnsi="helvetica 45"/>
+      <w:rFonts w:ascii="Helvetica 45" w:eastAsia="Arial" w:hAnsi="Helvetica 45"/>
       <w:bCs/>
       <w:sz w:val="21"/>
       <w:lang w:eastAsia="de-DE"/>
@@ -30642,7 +30373,9 @@
 </file>
 
 <file path=customXml/item1.xml><?xml version="1.0" encoding="utf-8"?>
-<b:Sources xmlns:b="http://schemas.openxmlformats.org/officeDocument/2006/bibliography" xmlns="http://schemas.openxmlformats.org/officeDocument/2006/bibliography" SelectedStyle="\APASixthEditionOfficeOnline.xsl" StyleName="APA" Version="6"/>
+<w:settings xmlns:w="http://schemas.openxmlformats.org/wordprocessingml/2006/main">
+  <w:SpecialFormsHighlight w:val="c9c8ff"/>
+</w:settings>
 </file>
 
 <file path=customXml/item2.xml><?xml version="1.0" encoding="utf-8"?>
@@ -30652,15 +30385,13 @@
 </file>
 
 <file path=customXml/item3.xml><?xml version="1.0" encoding="utf-8"?>
-<w:settings xmlns:w="http://schemas.openxmlformats.org/wordprocessingml/2006/main">
-  <w:SpecialFormsHighlight w:val="c9c8ff"/>
-</w:settings>
+<b:Sources xmlns:b="http://schemas.openxmlformats.org/officeDocument/2006/bibliography" xmlns="http://schemas.openxmlformats.org/officeDocument/2006/bibliography" SelectedStyle="\APASixthEditionOfficeOnline.xsl" StyleName="APA" Version="6"/>
 </file>
 
 <file path=customXml/itemProps1.xml><?xml version="1.0" encoding="utf-8"?>
-<ds:datastoreItem xmlns:ds="http://schemas.openxmlformats.org/officeDocument/2006/customXml" ds:itemID="{10CF6EC4-056A-4775-9E7A-ACD3BB6B310E}">
+<ds:datastoreItem xmlns:ds="http://schemas.openxmlformats.org/officeDocument/2006/customXml" ds:itemID="{5D0AEA6B-E499-4EEF-98A3-AFBB261C493E}">
   <ds:schemaRefs>
-    <ds:schemaRef ds:uri="http://schemas.openxmlformats.org/officeDocument/2006/bibliography"/>
+    <ds:schemaRef ds:uri="http://schemas.openxmlformats.org/wordprocessingml/2006/main"/>
   </ds:schemaRefs>
 </ds:datastoreItem>
 </file>
@@ -30674,9 +30405,9 @@
 </file>
 
 <file path=customXml/itemProps3.xml><?xml version="1.0" encoding="utf-8"?>
-<ds:datastoreItem xmlns:ds="http://schemas.openxmlformats.org/officeDocument/2006/customXml" ds:itemID="{5D0AEA6B-E499-4EEF-98A3-AFBB261C493E}">
+<ds:datastoreItem xmlns:ds="http://schemas.openxmlformats.org/officeDocument/2006/customXml" ds:itemID="{10CF6EC4-056A-4775-9E7A-ACD3BB6B310E}">
   <ds:schemaRefs>
-    <ds:schemaRef ds:uri="http://schemas.openxmlformats.org/wordprocessingml/2006/main"/>
+    <ds:schemaRef ds:uri="http://schemas.openxmlformats.org/officeDocument/2006/bibliography"/>
   </ds:schemaRefs>
 </ds:datastoreItem>
 </file>
</xml_diff>